<commit_message>
Final export of Paper C (docx, md, Rmd)
</commit_message>
<xml_diff>
--- a/paper2/final/Paper_C_Closing_at_the_limit.docx
+++ b/paper2/final/Paper_C_Closing_at_the_limit.docx
@@ -153,7 +153,7 @@
         <w:t xml:space="preserve"> </w:t>
       </w:r>
       <w:r>
-        <w:t xml:space="preserve">Daily price limits aim to cool markets but can delay price discovery. Evidence on prices after limit closes in emerging markets is thin, and published limit studies do not account for the many price-based signals a researcher could have examined. We study 347 stocks on the Ho Chi Minh Stock Exchange (HOSE) from August 2024 to September 2026 and test 26 hypotheses under false-discovery-rate control: four price-limit event tests and 22 price- and volume-based characteristics. None of the 22 characteristics survives, although the tests have limited power, while all four limit tests do. A ceiling close is followed by a next-day abnormal return of 1.7%, an overnight gap of 2.2% less an intraday reversal of 0.5%, and the gap exceeds that of stocks that rose almost as far without reaching the limit. A buyer at the next open earns nothing from it. The pattern fits delayed price discovery, but news and attention explain it as well, and our data cannot separate the two.</w:t>
+        <w:t xml:space="preserve">Daily price limits aim to cool markets but can delay price discovery. Evidence on prices after limit closes in emerging markets is thin, and published limit studies do not account for the many price-based signals a researcher could have examined. We study 347 stocks on the Ho Chi Minh Stock Exchange (HOSE) from August 2024 to September 2026 and run 26 tests under false-discovery-rate control: four price-limit event tests and 22 price- and volume-based characteristics. None of the 22 characteristics survives, although the tests have limited power, while all four limit tests do. A ceiling close is followed by a next-day abnormal return of 1.7%: an overnight gap of 2.2% less an intraday reversal of 0.5%, and the gap exceeds that of stocks that rose almost as far without reaching the limit. A buyer at the next open earns −0.7% by the fifth close. The pattern fits delayed price discovery, but news and attention can explain it as well, and our data cannot separate the two.</w:t>
       </w:r>
     </w:p>
     <w:p>
@@ -206,7 +206,7 @@
         <w:pStyle w:val="FirstParagraph"/>
       </w:pPr>
       <w:r>
-        <w:t xml:space="preserve">A daily price limit stops a stock from moving beyond a fixed band within one trading day. Brennan (1986) gives a rationale for limits in futures markets, and Subrahmanyam (1994) shows that trading halts can advance trades in time and raise price variability. In equity markets, advocates argue that limits reduce volatility and counter overreaction, while critics argue that they delay price discovery, spill volatility into later days, and interfere with trading (Kim &amp; Rhee, 1997). Kim and Rhee find support for all three criticisms in Tokyo, and Bildik and Gülay (2006) find the same in Istanbul. Chen (1993) shows that serial correlation falls as the Taiwanese limit widens, Berkman and Lee (2002) report more continuations after limit hits in Korea, and Cho et al. (2003) document a magnet effect toward the upper limit in Taiwanese intraday data. Qi (2023) studies the widening of the ChiNext band in China from 10% to 20% and finds delayed price discovery, volatility spillover and trading interference, with no magnet effect. Evidence on Vietnam is sparse. Le (2012) studies a narrowing of the fluctuation limit with GARCH models, and Veeraraghavan et al. (2007, a working paper) study momentum and price limits for 2000 to 2006.</w:t>
+        <w:t xml:space="preserve">A daily price limit stops a stock from moving beyond a fixed band within one trading day. Regulators adopt limits to cool markets after large shocks, and exchanges in Tokyo, Taipei, Seoul, Shenzhen, and Ho Chi Minh City have used them. Economists have long asked whether a limit protects prices or only postpones their adjustment, and recent band changes in China, Taiwan, and Korea have reopened the question. The question is sharpest in markets where a limit close is common and where opening and closing prices come from call auctions. The Ho Chi Minh Stock Exchange (HOSE) has both features: it applies one 7% band to every stock, and about 2.0% of stock-days in our event window meet our definition of an upper-limit close (the ceiling, Section 4) and about 1.4% meet our definition of a lower-limit close (the floor).</w:t>
       </w:r>
     </w:p>
     <w:p>
@@ -214,7 +214,7 @@
         <w:pStyle w:val="BodyText"/>
       </w:pPr>
       <w:r>
-        <w:t xml:space="preserve">To our knowledge, none of these studies separates the next-day return after a limit close into the overnight gap and the trading session that follows, and none places the limit result in a family of tests that controls for the many other price-based signals a researcher could have examined. The gap shows what the opening auction does with demand that the limit blocked. The session shows whether an investor who did not already hold the stock can earn anything from it. The family of tests asks whether a long search could have produced a large effect by luck.</w:t>
+        <w:t xml:space="preserve">The literature has not settled what happens after a limit close in such a market. Studies of band changes document effects on volatility, liquidity, and crash risk (Qi, 2023; Lien et al., 2019; Jia et al., 2024), and account-level work shows that large investors buy on the limit day and sell on the next day (Chen et al., 2019). However, to our knowledge, none of the studies we reviewed splits the next-day return after a limit close into the overnight gap and the trading session that follows, none places the limit result in a family of tests that controls for the many other price-based signals a researcher could have examined, and none examines the 2025 move of HOSE to a new trading platform.</w:t>
       </w:r>
     </w:p>
     <w:p>
@@ -222,7 +222,7 @@
         <w:pStyle w:val="BodyText"/>
       </w:pPr>
       <w:r>
-        <w:t xml:space="preserve">HOSE offers a useful setting for this question. It applies one daily band to every stock, sets opening and closing prices in call auctions, and produces many limit closes: about 2.0% of stock-days in our event window close at the ceiling and about 1.4% at the floor. The frequency gives enough events to estimate the next-day return with tight confidence intervals and to split the sample in several ways.</w:t>
+        <w:t xml:space="preserve">We estimate the abnormal return after ceiling and floor closes on HOSE, measure how much of it arises in the overnight gap, and test whether an outside buyer can capture it. To discipline the search, we place four limit tests in one family of 26 tests with 22 familiar price- and volume-based characteristics and control the false-discovery rate (FDR; Benjamini &amp; Hochberg, 1995; Harvey et al., 2016).</w:t>
       </w:r>
     </w:p>
     <w:p>
@@ -230,7 +230,7 @@
         <w:pStyle w:val="BodyText"/>
       </w:pPr>
       <w:r>
-        <w:t xml:space="preserve">We estimate the abnormal return after closes at the upper limit (ceiling) and the lower limit (floor) on the Ho Chi Minh Stock Exchange (HOSE), measure how much of it arises in the overnight gap, and test whether an outside buyer can capture it. To discipline the search, we place four limit tests in one family of 26 tests with 22 familiar price- and volume-based characteristics and control the false-discovery rate (FDR; Benjamini &amp; Hochberg, 1995; Harvey et al., 2016).</w:t>
+        <w:t xml:space="preserve">We make three contributions. First, we decompose the next-day abnormal return after limit closes into an overnight gap and an intraday return, and show that the ceiling effect is a gap followed by a partial reversal. Second, we compare limit closes with stocks that moved almost as far without reaching the limit, including stocks that also closed at their daily high, and find that the gap is larger at the limit. Third, we show that the limit effect survives a multiplicity-controlled family in which no characteristic survives, and that a buyer at the next open cannot capture it. We also compare each result with the studies reviewed in Section 2 and split the events at the 2025 change of trading platform.</w:t>
       </w:r>
     </w:p>
     <w:p>
@@ -238,33 +238,53 @@
         <w:pStyle w:val="BodyText"/>
       </w:pPr>
       <w:r>
-        <w:t xml:space="preserve">We make three contributions. First, we decompose the next-day abnormal return after limit closes into an overnight gap and an intraday return, and show that the ceiling effect is a gap followed by a partial reversal. Second, we compare limit closes with stocks that moved almost as far without reaching the limit, including stocks that also closed at their daily high, and find that the gap is larger at the limit. Third, we show that the limit effect survives a multiplicity-controlled family in which no characteristic survives, and that a buyer at the next open cannot capture it. Berkman et al. (2012) find the same overnight-gain-then-intraday-reversal signature in U.S. stocks, which have no price limit, so the pattern alone does not identify a limit effect.</w:t>
+        <w:t xml:space="preserve">Section 2 reviews the related literature and states the hypotheses, Section 3 describes the data and the institutional setting, and Section 4 the design. Section 5 reports the results, Section 6 compares them with earlier studies and discusses mechanisms and implications, Section 7 lists limitations, and Section 8 concludes.</w:t>
+      </w:r>
+    </w:p>
+    <w:bookmarkEnd w:id="20"/>
+    <w:bookmarkStart w:id="21" w:name="related-literature-and-hypotheses"/>
+    <w:p>
+      <w:pPr>
+        <w:pStyle w:val="Heading1"/>
+      </w:pPr>
+      <w:r>
+        <w:t xml:space="preserve">2. Related literature and hypotheses</w:t>
       </w:r>
     </w:p>
     <w:p>
       <w:pPr>
-        <w:pStyle w:val="BodyText"/>
-      </w:pPr>
-      <w:r>
-        <w:t xml:space="preserve">Section 2 describes the setting and data, Section 3 the design, and Section 4 the results and rival readings. Section 5 discusses the findings, Section 6 lists limitations, and Section 7 concludes.</w:t>
-      </w:r>
-    </w:p>
-    <w:bookmarkEnd w:id="20"/>
-    <w:bookmarkStart w:id="21" w:name="institutional-setting-and-data"/>
-    <w:p>
-      <w:pPr>
-        <w:pStyle w:val="Heading1"/>
-      </w:pPr>
-      <w:r>
-        <w:t xml:space="preserve">2. Institutional setting and data</w:t>
+        <w:pStyle w:val="FirstParagraph"/>
+      </w:pPr>
+      <w:r>
+        <w:rPr>
+          <w:bCs/>
+          <w:b/>
+        </w:rPr>
+        <w:t xml:space="preserve">Theory.</w:t>
+      </w:r>
+      <w:r>
+        <w:t xml:space="preserve"> </w:t>
+      </w:r>
+      <w:r>
+        <w:t xml:space="preserve">Theory predicts protection or distortion, depending on the source of the shock. Brennan (1986) provides a rationale for price limits in futures markets, and Kodres and O’Brien (1994) show that well-chosen limits can be Pareto superior when fluctuations come from fundamental news, because limits insure traders against part of the implementation risk. Greenwald and Stein (1991) link crashes to imperfections in transactional mechanisms. Against this case, Subrahmanyam (1994) shows that trading halts can advance trades in time and raise price variability, and Chen et al. (2024) show in an equilibrium model that volatility rises as the price approaches a circuit breaker, which produces a magnet effect. The next-day return after a limit close lets us test which prediction fits.</w:t>
       </w:r>
     </w:p>
     <w:p>
       <w:pPr>
-        <w:pStyle w:val="FirstParagraph"/>
-      </w:pPr>
-      <w:r>
-        <w:t xml:space="preserve">HOSE sets a daily price limit of 7% around the reference price, which is the previous close on normal trading days, and allows a wider band on the first trading day of a new listing (HSC, 2025). On 5 May 2025 HOSE moved to the trading platform of the Korea Exchange (KRX). The band stayed unchanged, but at-the-open and at-the-close orders lost their priority over limit orders in the call auctions that set the opening and closing prices (HSC, 2025; Viet Nam News, 2025). The close defines the event and the open defines the gap, so both prices matter here. We treat the 7% band, the tick sizes and the reference-price rule as assumptions and check the band against the data: 1.98% of stock-days fall between +6.5% and +7.1% and 1.30% between −7.1% and −6.5%, against 0.29% between +6.0% and +6.5%, A 7% band implies this pile-up.</w:t>
+        <w:pStyle w:val="BodyText"/>
+      </w:pPr>
+      <w:r>
+        <w:rPr>
+          <w:bCs/>
+          <w:b/>
+        </w:rPr>
+        <w:t xml:space="preserve">Classic evidence on price-limit performance.</w:t>
+      </w:r>
+      <w:r>
+        <w:t xml:space="preserve"> </w:t>
+      </w:r>
+      <w:r>
+        <w:t xml:space="preserve">Kim and Rhee (1997) organize the empirical debate around three criticisms of limits: they spill volatility into later days, delay price discovery, and interfere with trading. They find support for all three in Tokyo. Bildik and Gülay (2006) find the same in Istanbul and show that price locks at the limit give stronger evidence than limit moves alone. Chen (1993) finds that serial correlation falls as the Taiwanese limit widens, which implies a delay, and Berkman and Lee (2002) examine volatility and trading activity around a revision of the limit system in Korea. Huang et al. (2001) report for Taiwan that the overnight overreaction after limit hits is corrected during the following trading day, which is the timing pattern we examine on HOSE. Cho et al. (2003) add a fourth hypothesis, the magnet effect, and find that prices accelerate toward the upper limit in five-minute Taiwanese data. Kim and Limpaphayom (2000) show that small, volatile, high-volume stocks are more likely to hit limits, and Deb et al. (2013) argue that rigid limits in Tokyo can disrupt price discovery and liquidity provision. These studies infer delay from volatility and serial correlation across days; none splits the next-day return into the overnight gap and the session that follows.</w:t>
       </w:r>
     </w:p>
     <w:p>
@@ -272,17 +292,94 @@
         <w:pStyle w:val="BodyText"/>
       </w:pPr>
       <w:r>
-        <w:t xml:space="preserve">The raw data are daily open, high, low, close, and volume for 405 HOSE-listed stocks from 21 August 2024 to 23 September 2026, retrieved with the vnstock library. We take the stock list from a listing file dated 24 September 2026, so stocks delisted earlier are absent. We keep the 347 stocks with at least 95% non-missing closes, which yields 178,773 stock-days. Returns are close-to-close. The market return is the dollar-volume-weighted return of all stocks, with weights from the trailing 60-day average dollar volume, and abnormal returns are stock returns minus the market return over the same interval. The vendor does not document corporate-action adjustment. The data contain no order books, investor types, news or market capitalization.</w:t>
+        <w:rPr>
+          <w:bCs/>
+          <w:b/>
+        </w:rPr>
+        <w:t xml:space="preserve">Recent evidence from band changes and investor-level data.</w:t>
+      </w:r>
+      <w:r>
+        <w:t xml:space="preserve"> </w:t>
+      </w:r>
+      <w:r>
+        <w:t xml:space="preserve">Band changes and investor-level data now show what limits do to markets and traders. The widening of the ChiNext band from 10% to 20% in August 2020 gave several studies a quasi-natural experiment. Qi (2023) confirms delayed price discovery, volatility spillover, and trading interference, with stronger effects at the lower limit and no magnet effect. Zhang et al. (2022) find higher liquidity and lower information asymmetry after the widening, and Jia et al. (2024) find lower crash risk. Lien et al. (2019) find higher spreads and intraday volatility but better execution quality after Taiwan widened its band in 2015, and Kim and Jun (2019) find higher intraday realized variance after Korea widened its band from 15% to 30%. Chen et al. (2019) use account-level Shenzhen data and show that large investors tend to buy on the day a stock hits the 10% upper limit and sell on the next day, and that their net buying on the limit day predicts stronger long-run reversal. Two recent studies look at the cross-section: Lin et al. (2023) find that stocks with large exposure to daily price limits attract attention and earn lower future returns, with the largest effect where retail investors hold many shares, and Zeng et al. (2024) relate the frequency of limit hits to lower future returns. Liang and Hu (2025) show that a forecasting model predicts a share of limit hits, which says nothing about returns after the hit. None of these studies reports the next-day return after a limit close split into its overnight and intraday parts.</w:t>
+      </w:r>
+    </w:p>
+    <w:p>
+      <w:pPr>
+        <w:pStyle w:val="BodyText"/>
+      </w:pPr>
+      <w:r>
+        <w:rPr>
+          <w:bCs/>
+          <w:b/>
+        </w:rPr>
+        <w:t xml:space="preserve">Overnight and intraday returns.</w:t>
+      </w:r>
+      <w:r>
+        <w:t xml:space="preserve"> </w:t>
+      </w:r>
+      <w:r>
+        <w:t xml:space="preserve">Overnight and intraday returns differ, and explanations range from investor attention and sentiment to funding costs and market-maker inventory. Kelly and Clark (2011) document that overnight and intraday returns differ for index funds. Berkman et al. (2012) find positive overnight returns followed by intraday reversals in U.S. stocks, concentrated among stocks with recent retail attention. Aboody et al. (2018) tie overnight persistence to investor sentiment, Lou et al. (2019) show strong overnight and intraday continuation with an offsetting cross-period reversal, and Akbas et al. (2022) show that a persistent pattern of positive overnight and negative daytime returns predicts higher future returns. Bogousslavsky (2021) links them to differences in margin and lending costs, and Lu et al. (2023) trace night-minus-day returns to the market makers who absorb retail order imbalances near the open. Chinese evidence adds institutional detail: Qiao and Dam (2020) show that overnight returns are on average negative and link them to the T+1 rule, under which shares bought on one day cannot be sold until the next. Qiu et al. (2025) find that day-night anomalies concentrate at the open and close, and Jones et al. (2025) find weak stock selection among small retail investors. Studies of overnight returns measure them on all stocks; none conditions on a limit close.</w:t>
+      </w:r>
+    </w:p>
+    <w:p>
+      <w:pPr>
+        <w:pStyle w:val="BodyText"/>
+      </w:pPr>
+      <w:r>
+        <w:rPr>
+          <w:bCs/>
+          <w:b/>
+        </w:rPr>
+        <w:t xml:space="preserve">Multiple testing and weekly regressions.</w:t>
+      </w:r>
+      <w:r>
+        <w:t xml:space="preserve"> </w:t>
+      </w:r>
+      <w:r>
+        <w:t xml:space="preserve">Testing many signals raises the bar for each one. Harvey et al. (2016) argue that a new factor needs a</w:t>
+      </w:r>
+      <w:r>
+        <w:t xml:space="preserve"> </w:t>
+      </w:r>
+      <w:r>
+        <w:rPr>
+          <w:iCs/>
+          <w:i/>
+        </w:rPr>
+        <w:t xml:space="preserve">t</w:t>
+      </w:r>
+      <w:r>
+        <w:t xml:space="preserve">-statistic above 3.0. Harvey and Liu (2020) tie the hurdle to a chosen false-discovery rate, Chordia et al. (2020) find that multiple-testing thresholds for cross-sectional regressions are near 3.4, and Hou et al. (2020) find that, with microcaps mitigated, 65% of 452 anomalies fail the single-test hurdle of 1.96. Petersen (2009) compares standard-error estimators for panel data, which motivates our alternative clusters, and Gutierrez and Kelley (2008) study weekly returns, the frequency of our regressions. For Vietnam, Huang et al. (2023) find a significant size effect and an earnings-to-price effect. We found no peer-reviewed study of post-limit returns on HOSE.</w:t>
+      </w:r>
+    </w:p>
+    <w:p>
+      <w:pPr>
+        <w:pStyle w:val="BodyText"/>
+      </w:pPr>
+      <w:r>
+        <w:rPr>
+          <w:bCs/>
+          <w:b/>
+        </w:rPr>
+        <w:t xml:space="preserve">Gap and hypotheses.</w:t>
+      </w:r>
+      <w:r>
+        <w:t xml:space="preserve"> </w:t>
+      </w:r>
+      <w:r>
+        <w:t xml:space="preserve">The reviewed studies document volatility, liquidity, and long-run effects of limits and the overnight-intraday split for all stocks, but none combines the two in a market with call auctions or controls for multiple testing. None uses the 2025 platform change. Four hypotheses follow. If a limit delays price discovery, a ceiling close predicts a positive next-day abnormal return and a floor close a negative one (H1). If the opening auction absorbs the blocked demand, the effect concentrates in the overnight gap (H2). If only the limit blocks trading, the gap after a limit close exceeds the gap after moves that come close to the limit (H3). An investor who buys at the next open does not earn the gap (H4). The 22 characteristics provide a benchmark for H1: a limit effect that survives the procedure that screens every characteristic is more credible than a single large estimate.</w:t>
       </w:r>
     </w:p>
     <w:bookmarkEnd w:id="21"/>
-    <w:bookmarkStart w:id="22" w:name="design"/>
+    <w:bookmarkStart w:id="22" w:name="data-and-institutional-setting"/>
     <w:p>
       <w:pPr>
         <w:pStyle w:val="Heading1"/>
       </w:pPr>
       <w:r>
-        <w:t xml:space="preserve">3. Design</w:t>
+        <w:t xml:space="preserve">3. Data and institutional setting</w:t>
       </w:r>
     </w:p>
     <w:p>
@@ -290,111 +387,17 @@
         <w:pStyle w:val="FirstParagraph"/>
       </w:pPr>
       <w:r>
-        <w:t xml:space="preserve">A ceiling event is an event day</w:t>
-      </w:r>
-      <w:r>
-        <w:t xml:space="preserve"> </w:t>
-      </w:r>
-      <w:r>
-        <w:rPr>
-          <w:iCs/>
-          <w:i/>
-        </w:rPr>
-        <w:t xml:space="preserve">d</w:t>
-      </w:r>
-      <w:r>
-        <w:t xml:space="preserve"> </w:t>
-      </w:r>
-      <w:r>
-        <w:t xml:space="preserve">with a return of at least +6.5% and a close equal to the day’s high. A floor event is a day with a return of at most −6.5% and a close equal to the day’s low. We measure the market-adjusted return on day</w:t>
-      </w:r>
-      <w:r>
-        <w:t xml:space="preserve"> </w:t>
-      </w:r>
-      <w:r>
-        <w:rPr>
-          <w:iCs/>
-          <w:i/>
-        </w:rPr>
-        <w:t xml:space="preserve">d</w:t>
-      </w:r>
-      <w:r>
-        <w:t xml:space="preserve">+1 and over days</w:t>
-      </w:r>
-      <w:r>
-        <w:t xml:space="preserve"> </w:t>
-      </w:r>
-      <w:r>
-        <w:rPr>
-          <w:iCs/>
-          <w:i/>
-        </w:rPr>
-        <w:t xml:space="preserve">d</w:t>
-      </w:r>
-      <w:r>
-        <w:t xml:space="preserve">+1 to</w:t>
-      </w:r>
-      <w:r>
-        <w:t xml:space="preserve"> </w:t>
-      </w:r>
-      <w:r>
-        <w:rPr>
-          <w:iCs/>
-          <w:i/>
-        </w:rPr>
-        <w:t xml:space="preserve">d</w:t>
-      </w:r>
-      <w:r>
-        <w:t xml:space="preserve">+5. We split the day-</w:t>
-      </w:r>
-      <w:r>
-        <w:rPr>
-          <w:iCs/>
-          <w:i/>
-        </w:rPr>
-        <w:t xml:space="preserve">d</w:t>
-      </w:r>
-      <w:r>
-        <w:t xml:space="preserve">+1 return into the overnight gap (open on</w:t>
-      </w:r>
-      <w:r>
-        <w:t xml:space="preserve"> </w:t>
-      </w:r>
-      <w:r>
-        <w:rPr>
-          <w:iCs/>
-          <w:i/>
-        </w:rPr>
-        <w:t xml:space="preserve">d</w:t>
-      </w:r>
-      <w:r>
-        <w:t xml:space="preserve">+1 over close on</w:t>
-      </w:r>
-      <w:r>
-        <w:t xml:space="preserve"> </w:t>
-      </w:r>
-      <w:r>
-        <w:rPr>
-          <w:iCs/>
-          <w:i/>
-        </w:rPr>
-        <w:t xml:space="preserve">d</w:t>
-      </w:r>
-      <w:r>
-        <w:t xml:space="preserve">) and the intraday return (close over open on</w:t>
-      </w:r>
-      <w:r>
-        <w:t xml:space="preserve"> </w:t>
-      </w:r>
-      <w:r>
-        <w:rPr>
-          <w:iCs/>
-          <w:i/>
-        </w:rPr>
-        <w:t xml:space="preserve">d</w:t>
-      </w:r>
-      <w:r>
-        <w:t xml:space="preserve">+1). Standard errors cluster by event date. We also report clustering by calendar week and by 10-day block, which allows for overlapping five-day windows, and two-way clustering by date and stock.</w:t>
+        <w:rPr>
+          <w:bCs/>
+          <w:b/>
+        </w:rPr>
+        <w:t xml:space="preserve">Data source.</w:t>
+      </w:r>
+      <w:r>
+        <w:t xml:space="preserve"> </w:t>
+      </w:r>
+      <w:r>
+        <w:t xml:space="preserve">We obtained daily open, high, low, close, and volume series for every stock on the HOSE listing with the vnstock Python library (version 4.0.4), which retrieves them from the VCI data source, on 24 September 2026. A listing file from the same source and date (743 rows, all instrument types) defines the universe. The retrieval returned 405 HOSE stock files with daily records through 23 September 2026, and we use the 519 trading days from 21 August 2024. Prices are in thousand dong. The vendor does not document corporate-action adjustment, and the files contain no market capitalization, order book, investor type, or news.</w:t>
       </w:r>
     </w:p>
     <w:p>
@@ -402,7 +405,43 @@
         <w:pStyle w:val="BodyText"/>
       </w:pPr>
       <w:r>
-        <w:t xml:space="preserve">An exact limit hit is a close equal to the reference price times 1.07 (0.93 for floors), rounded to the tick, with ticks of 0.01, 0.05 and 0.10 thousand dong for prices below 10, below 50 and from 50 thousand dong. We call closes that meet the event rule but not the exact rule near hits.</w:t>
+        <w:rPr>
+          <w:bCs/>
+          <w:b/>
+        </w:rPr>
+        <w:t xml:space="preserve">Sample.</w:t>
+      </w:r>
+      <w:r>
+        <w:t xml:space="preserve"> </w:t>
+      </w:r>
+      <w:r>
+        <w:t xml:space="preserve">We keep the 347 stocks with at least 95% non-missing closes, which yields 178,773 stock-days. Returns are close-to-close. The mean daily return is 0.018%, the median is 0.00%, and the standard deviation is 2.10%. Liquidity is skewed: the median stock-day with a price has a dollar volume of 2.6 billion dong and the mean is 51.2 billion dong. The stocks span 18 two-digit sector codes of the Industry Classification Benchmark, and the largest sector holds 15% of them. The listing file excludes stocks delisted before 24 September 2026. The market return is the dollar-volume-weighted return of all stocks, with weights from the trailing 60-day average dollar volume, and abnormal returns are stock returns minus the market return over the same interval. Table 1 uses weights through day</w:t>
+      </w:r>
+      <w:r>
+        <w:t xml:space="preserve"> </w:t>
+      </w:r>
+      <w:r>
+        <w:rPr>
+          <w:iCs/>
+          <w:i/>
+        </w:rPr>
+        <w:t xml:space="preserve">d</w:t>
+      </w:r>
+      <w:r>
+        <w:t xml:space="preserve">+1, and Tables 2 to 4 lag the weights to day</w:t>
+      </w:r>
+      <w:r>
+        <w:t xml:space="preserve"> </w:t>
+      </w:r>
+      <w:r>
+        <w:rPr>
+          <w:iCs/>
+          <w:i/>
+        </w:rPr>
+        <w:t xml:space="preserve">d</w:t>
+      </w:r>
+      <w:r>
+        <w:t xml:space="preserve">.</w:t>
       </w:r>
     </w:p>
     <w:p>
@@ -410,74 +449,139 @@
         <w:pStyle w:val="BodyText"/>
       </w:pPr>
       <w:r>
-        <w:t xml:space="preserve">The family has 26 tests. Twenty-two are weekly Fama and MacBeth (1973) regressions of the next five days’ abnormal return on one rank-normalized characteristic, with Newey and West (1987)</w:t>
-      </w:r>
-      <w:r>
-        <w:t xml:space="preserve"> </w:t>
-      </w:r>
-      <w:r>
-        <w:rPr>
-          <w:iCs/>
-          <w:i/>
-        </w:rPr>
-        <w:t xml:space="preserve">t</w:t>
-      </w:r>
-      <w:r>
-        <w:t xml:space="preserve">-statistics using four lags. The characteristics cover momentum and reversal (5-day, 20-day, 3-month, 6-month, and idiosyncratic momentum), risk (volatility, idiosyncratic volatility, beta, downside deviation, Parkinson (1980) range volatility, the maximum daily return (MAX; Bali et al., 2011), the minimum daily return (MIN), skewness and kurtosis), liquidity and volume (Amihud, 2002, illiquidity, log dollar volume, dollar-volume and volume ratios, and the Corwin and Schultz, 2012, spread) and intraday behavior (mean overnight return, mean intraday return, frequency of moves of 6.5% or more). The sample has 79 weekly cross-sections. The remaining four tests are the ceiling and floor tests at the two horizons.</w:t>
+        <w:rPr>
+          <w:bCs/>
+          <w:b/>
+        </w:rPr>
+        <w:t xml:space="preserve">Institutional setting.</w:t>
+      </w:r>
+      <w:r>
+        <w:t xml:space="preserve"> </w:t>
+      </w:r>
+      <w:r>
+        <w:t xml:space="preserve">HOSE sets a daily price limit of 7% around the reference price, which is the previous close on normal trading days, (Ho Chi Minh City Securities Corporation [HSC], 2025). On 5 May 2025 HOSE moved to the trading platform of the Korea Exchange (KRX). The band stayed unchanged, but at-the-open and at-the-close orders lost their priority over limit orders in the call auctions that set the opening and closing prices (HSC, 2025; Viet Nam News, 2025). The close defines the event and the open defines the gap, so both auction prices matter here. We treat the 7% band, the tick sizes, and the reference-price rule as assumptions and check the band against the data: 1.98% of all stock-days fall between +6.5% and +7.1% and 1.30% between −7.1% and −6.5%, against 0.29% between +6.0% and +6.5%. The pile-up fits a 7% band.</w:t>
+      </w:r>
+    </w:p>
+    <w:bookmarkEnd w:id="22"/>
+    <w:bookmarkStart w:id="23" w:name="design"/>
+    <w:p>
+      <w:pPr>
+        <w:pStyle w:val="Heading1"/>
+      </w:pPr>
+      <w:r>
+        <w:t xml:space="preserve">4. Design</w:t>
       </w:r>
     </w:p>
     <w:p>
       <w:pPr>
-        <w:pStyle w:val="BodyText"/>
-      </w:pPr>
-      <w:r>
-        <w:t xml:space="preserve">We adjust the 26</w:t>
-      </w:r>
-      <w:r>
-        <w:t xml:space="preserve"> </w:t>
-      </w:r>
-      <w:r>
-        <w:rPr>
-          <w:iCs/>
-          <w:i/>
-        </w:rPr>
-        <w:t xml:space="preserve">p</w:t>
-      </w:r>
-      <w:r>
-        <w:t xml:space="preserve">-values by the Benjamini–Hochberg (BH) procedure at a 5% FDR and by Holm (1979), and report the hurdle of |</w:t>
-      </w:r>
-      <w:r>
-        <w:rPr>
-          <w:iCs/>
-          <w:i/>
-        </w:rPr>
-        <w:t xml:space="preserve">t</w:t>
-      </w:r>
-      <w:r>
-        <w:t xml:space="preserve">| = 3 of Harvey et al. (2016). A test survives if its BH-adjusted</w:t>
-      </w:r>
-      <w:r>
-        <w:t xml:space="preserve"> </w:t>
-      </w:r>
-      <w:r>
-        <w:rPr>
-          <w:iCs/>
-          <w:i/>
-        </w:rPr>
-        <w:t xml:space="preserve">p</w:t>
-      </w:r>
-      <w:r>
-        <w:t xml:space="preserve">-value is below 5%, its discovery-half sign agrees with the full sample, and its confirmation-half |</w:t>
-      </w:r>
-      <w:r>
-        <w:rPr>
-          <w:iCs/>
-          <w:i/>
-        </w:rPr>
-        <w:t xml:space="preserve">t</w:t>
-      </w:r>
-      <w:r>
-        <w:t xml:space="preserve">| exceeds 1.96. The first 39 weeks form the discovery half. Lookbacks of up to 115 days overlap the discovery half, so the confirmation half is not a strict hold-out.</w:t>
+        <w:pStyle w:val="FirstParagraph"/>
+      </w:pPr>
+      <w:r>
+        <w:t xml:space="preserve">A ceiling event is an event day</w:t>
+      </w:r>
+      <w:r>
+        <w:t xml:space="preserve"> </w:t>
+      </w:r>
+      <w:r>
+        <w:rPr>
+          <w:iCs/>
+          <w:i/>
+        </w:rPr>
+        <w:t xml:space="preserve">d</w:t>
+      </w:r>
+      <w:r>
+        <w:t xml:space="preserve"> </w:t>
+      </w:r>
+      <w:r>
+        <w:t xml:space="preserve">with a return of at least +6.5% and a close equal to the day’s high. A floor event is a day with a return of at most −6.5% and a close equal to the day’s low. We measure the market-adjusted return on day</w:t>
+      </w:r>
+      <w:r>
+        <w:t xml:space="preserve"> </w:t>
+      </w:r>
+      <w:r>
+        <w:rPr>
+          <w:iCs/>
+          <w:i/>
+        </w:rPr>
+        <w:t xml:space="preserve">d</w:t>
+      </w:r>
+      <w:r>
+        <w:t xml:space="preserve">+1 and over days</w:t>
+      </w:r>
+      <w:r>
+        <w:t xml:space="preserve"> </w:t>
+      </w:r>
+      <w:r>
+        <w:rPr>
+          <w:iCs/>
+          <w:i/>
+        </w:rPr>
+        <w:t xml:space="preserve">d</w:t>
+      </w:r>
+      <w:r>
+        <w:t xml:space="preserve">+1 to</w:t>
+      </w:r>
+      <w:r>
+        <w:t xml:space="preserve"> </w:t>
+      </w:r>
+      <w:r>
+        <w:rPr>
+          <w:iCs/>
+          <w:i/>
+        </w:rPr>
+        <w:t xml:space="preserve">d</w:t>
+      </w:r>
+      <w:r>
+        <w:t xml:space="preserve">+5. We split the day-</w:t>
+      </w:r>
+      <w:r>
+        <w:rPr>
+          <w:iCs/>
+          <w:i/>
+        </w:rPr>
+        <w:t xml:space="preserve">d</w:t>
+      </w:r>
+      <w:r>
+        <w:t xml:space="preserve">+1 return into the overnight gap (open on</w:t>
+      </w:r>
+      <w:r>
+        <w:t xml:space="preserve"> </w:t>
+      </w:r>
+      <w:r>
+        <w:rPr>
+          <w:iCs/>
+          <w:i/>
+        </w:rPr>
+        <w:t xml:space="preserve">d</w:t>
+      </w:r>
+      <w:r>
+        <w:t xml:space="preserve">+1 over close on</w:t>
+      </w:r>
+      <w:r>
+        <w:t xml:space="preserve"> </w:t>
+      </w:r>
+      <w:r>
+        <w:rPr>
+          <w:iCs/>
+          <w:i/>
+        </w:rPr>
+        <w:t xml:space="preserve">d</w:t>
+      </w:r>
+      <w:r>
+        <w:t xml:space="preserve">) and the intraday return (close over open on</w:t>
+      </w:r>
+      <w:r>
+        <w:t xml:space="preserve"> </w:t>
+      </w:r>
+      <w:r>
+        <w:rPr>
+          <w:iCs/>
+          <w:i/>
+        </w:rPr>
+        <w:t xml:space="preserve">d</w:t>
+      </w:r>
+      <w:r>
+        <w:t xml:space="preserve">+1). Standard errors cluster by event date. We also report clustering by calendar week and by 10-day block, which allows for overlapping five-day windows, and two-way clustering by date and stock.</w:t>
       </w:r>
     </w:p>
     <w:p>
@@ -485,7 +589,7 @@
         <w:pStyle w:val="BodyText"/>
       </w:pPr>
       <w:r>
-        <w:t xml:space="preserve">The tests address four hypotheses. First, if a limit delays price discovery, a ceiling close should predict a positive next-day abnormal return and a floor close a negative one. Second, if the opening auction absorbs the blocked demand, the effect should concentrate in the overnight gap. Third, the gap after a limit close should exceed the gap after moves that come close to the limit, because only the limit blocks trading. Fourth, an investor who buys at the next open should not earn the gap. The 22 characteristics give a benchmark for the first hypothesis: a limit effect that survives the same procedure that rejects every characteristic is more credible than a single large estimate.</w:t>
+        <w:t xml:space="preserve">An exact limit hit is a close equal to the reference price times 1.07 (0.93 for floors), rounded to the tick, with ticks of 0.01, 0.05, and 0.10 thousand dong for prices below 10, from 10 to below 50, and from 50 thousand dong upward. We call closes that meet the event rule but not the exact rule near hits.</w:t>
       </w:r>
     </w:p>
     <w:p>
@@ -493,103 +597,74 @@
         <w:pStyle w:val="BodyText"/>
       </w:pPr>
       <w:r>
-        <w:t xml:space="preserve">We fixed the family, estimators, multiplicity control and survival rule in a written analysis plan before computing results. A version-control time stamp predates the first analysis code, but no external registry holds the plan, and we had examined related data in earlier work, so the plan gives no independent confirmation. We departed from the plan in four ways. The plan names the event horizons as days</w:t>
-      </w:r>
-      <w:r>
-        <w:t xml:space="preserve"> </w:t>
-      </w:r>
-      <w:r>
-        <w:rPr>
-          <w:iCs/>
-          <w:i/>
-        </w:rPr>
-        <w:t xml:space="preserve">d</w:t>
-      </w:r>
-      <w:r>
-        <w:t xml:space="preserve">+1 and</w:t>
-      </w:r>
-      <w:r>
-        <w:t xml:space="preserve"> </w:t>
-      </w:r>
-      <w:r>
-        <w:rPr>
-          <w:iCs/>
-          <w:i/>
-        </w:rPr>
-        <w:t xml:space="preserve">d</w:t>
-      </w:r>
-      <w:r>
-        <w:t xml:space="preserve">+2 to</w:t>
-      </w:r>
-      <w:r>
-        <w:t xml:space="preserve"> </w:t>
-      </w:r>
-      <w:r>
-        <w:rPr>
-          <w:iCs/>
-          <w:i/>
-        </w:rPr>
-        <w:t xml:space="preserve">d</w:t>
-      </w:r>
-      <w:r>
-        <w:t xml:space="preserve">+5 in one place and as</w:t>
-      </w:r>
-      <w:r>
-        <w:t xml:space="preserve"> </w:t>
-      </w:r>
-      <w:r>
-        <w:rPr>
-          <w:iCs/>
-          <w:i/>
-        </w:rPr>
-        <w:t xml:space="preserve">d</w:t>
-      </w:r>
-      <w:r>
-        <w:t xml:space="preserve">+1 and</w:t>
-      </w:r>
-      <w:r>
-        <w:t xml:space="preserve"> </w:t>
-      </w:r>
-      <w:r>
-        <w:rPr>
-          <w:iCs/>
-          <w:i/>
-        </w:rPr>
-        <w:t xml:space="preserve">d</w:t>
-      </w:r>
-      <w:r>
-        <w:t xml:space="preserve">+1 to</w:t>
-      </w:r>
-      <w:r>
-        <w:t xml:space="preserve"> </w:t>
-      </w:r>
-      <w:r>
-        <w:rPr>
-          <w:iCs/>
-          <w:i/>
-        </w:rPr>
-        <w:t xml:space="preserve">d</w:t>
-      </w:r>
-      <w:r>
-        <w:t xml:space="preserve">+5 in its count of tests, and we implemented the second reading. We split the event half-samples at the median event date instead of at weeks 39 and 40. We report quintile spreads instead of deciles. We did not run the plan’s same-stock control and multivariate model. Analyses added after the first results are exploratory: the decomposition, the next-open returns, the control group, the comparison with sub-limit moves, exact hits, two-way clustering, subsamples, the volume and prior-return terciles, the platform-change split, and the outlier exclusion. The authors also screened several candidate ideas on the same data before choosing this one, so effect-size estimates may overstate the true effect.</w:t>
-      </w:r>
-    </w:p>
-    <w:bookmarkEnd w:id="22"/>
-    <w:bookmarkStart w:id="29" w:name="results"/>
-    <w:p>
-      <w:pPr>
-        <w:pStyle w:val="Heading1"/>
-      </w:pPr>
-      <w:r>
-        <w:t xml:space="preserve">4. Results</w:t>
+        <w:t xml:space="preserve">The family has 26 tests. Twenty-two are weekly Fama and MacBeth (1973) regressions of the next five days’ abnormal return on one rank-normalized characteristic, with Newey and West (1987)</w:t>
+      </w:r>
+      <w:r>
+        <w:t xml:space="preserve"> </w:t>
+      </w:r>
+      <w:r>
+        <w:rPr>
+          <w:iCs/>
+          <w:i/>
+        </w:rPr>
+        <w:t xml:space="preserve">t</w:t>
+      </w:r>
+      <w:r>
+        <w:t xml:space="preserve">-statistics using four lags. The characteristics cover momentum and reversal (5-day, 20-day, 3-month, 6-month, and idiosyncratic momentum), risk (volatility, idiosyncratic volatility, beta, downside deviation, Parkinson (1980) range volatility, the maximum daily return (MAX; Bali et al., 2011), the minimum daily return (MIN), skewness and kurtosis), liquidity and volume (Amihud (2002) illiquidity, log dollar volume, dollar-volume and volume ratios, and the Corwin and Schultz (2012) spread) and intraday behavior (mean overnight return, mean intraday return, frequency of moves of 6.5% or more). The sample has 79 weekly cross-sections. The remaining four tests are the ceiling and floor tests at the two horizons.</w:t>
       </w:r>
     </w:p>
     <w:p>
       <w:pPr>
-        <w:pStyle w:val="FirstParagraph"/>
-      </w:pPr>
-      <w:r>
-        <w:t xml:space="preserve">The event sample holds 3,187 ceiling events on 446 dates and 2,105 floor events on 319 dates, so events cluster in market episodes with several limit closes on the same day. This clustering is why we report standard errors that allow for dependence across dates, weeks and stocks. We first report the null for the 22 characteristics and then the four limit tests. Three exploratory analyses follow: where in the trading day the limit effect arises, whether it breaks at the limit, and whether it survives the 2025 platform change.</w:t>
+        <w:pStyle w:val="BodyText"/>
+      </w:pPr>
+      <w:r>
+        <w:t xml:space="preserve">We adjust the 26</w:t>
+      </w:r>
+      <w:r>
+        <w:t xml:space="preserve"> </w:t>
+      </w:r>
+      <w:r>
+        <w:rPr>
+          <w:iCs/>
+          <w:i/>
+        </w:rPr>
+        <w:t xml:space="preserve">p</w:t>
+      </w:r>
+      <w:r>
+        <w:t xml:space="preserve">-values by the Benjamini–Hochberg (BH) procedure at a 5% FDR and by Holm (1979), and report the hurdle of |</w:t>
+      </w:r>
+      <w:r>
+        <w:rPr>
+          <w:iCs/>
+          <w:i/>
+        </w:rPr>
+        <w:t xml:space="preserve">t</w:t>
+      </w:r>
+      <w:r>
+        <w:t xml:space="preserve">| = 3 of Harvey et al. (2016). A test survives if its BH-adjusted</w:t>
+      </w:r>
+      <w:r>
+        <w:t xml:space="preserve"> </w:t>
+      </w:r>
+      <w:r>
+        <w:rPr>
+          <w:iCs/>
+          <w:i/>
+        </w:rPr>
+        <w:t xml:space="preserve">p</w:t>
+      </w:r>
+      <w:r>
+        <w:t xml:space="preserve">-value is below 5%, its discovery-half sign agrees with the full sample, and its confirmation-half |</w:t>
+      </w:r>
+      <w:r>
+        <w:rPr>
+          <w:iCs/>
+          <w:i/>
+        </w:rPr>
+        <w:t xml:space="preserve">t</w:t>
+      </w:r>
+      <w:r>
+        <w:t xml:space="preserve">| exceeds 1.96. The first 39 weeks form the discovery half. Lookbacks of up to 115 days overlap the discovery half, so the confirmation half is not a strict hold-out.</w:t>
       </w:r>
     </w:p>
     <w:p>
@@ -597,7 +672,88 @@
         <w:pStyle w:val="BodyText"/>
       </w:pPr>
       <w:r>
-        <w:t xml:space="preserve">None of the 22 characteristics reaches |</w:t>
+        <w:t xml:space="preserve">We fixed the family, estimators, multiplicity control, and survival rule in a written analysis plan before computing results. A version-control time stamp predates the first analysis code, but no external registry holds the plan, and we had examined related data in earlier work, so the plan gives no independent confirmation. We departed from the plan in four ways. The plan was ambiguous about the second horizon (days</w:t>
+      </w:r>
+      <w:r>
+        <w:t xml:space="preserve"> </w:t>
+      </w:r>
+      <w:r>
+        <w:rPr>
+          <w:iCs/>
+          <w:i/>
+        </w:rPr>
+        <w:t xml:space="preserve">d</w:t>
+      </w:r>
+      <w:r>
+        <w:t xml:space="preserve">+2 to</w:t>
+      </w:r>
+      <w:r>
+        <w:t xml:space="preserve"> </w:t>
+      </w:r>
+      <w:r>
+        <w:rPr>
+          <w:iCs/>
+          <w:i/>
+        </w:rPr>
+        <w:t xml:space="preserve">d</w:t>
+      </w:r>
+      <w:r>
+        <w:t xml:space="preserve">+5 or</w:t>
+      </w:r>
+      <w:r>
+        <w:t xml:space="preserve"> </w:t>
+      </w:r>
+      <w:r>
+        <w:rPr>
+          <w:iCs/>
+          <w:i/>
+        </w:rPr>
+        <w:t xml:space="preserve">d</w:t>
+      </w:r>
+      <w:r>
+        <w:t xml:space="preserve">+1 to</w:t>
+      </w:r>
+      <w:r>
+        <w:t xml:space="preserve"> </w:t>
+      </w:r>
+      <w:r>
+        <w:rPr>
+          <w:iCs/>
+          <w:i/>
+        </w:rPr>
+        <w:t xml:space="preserve">d</w:t>
+      </w:r>
+      <w:r>
+        <w:t xml:space="preserve">+5), and we implemented the second reading. We split the event half-samples at the median event date instead of at weeks 39 and 40. We report quintile spreads instead of deciles. We did not run the plan’s same-stock control and multivariate model. Analyses added after the first results are exploratory: the decomposition, the next-open returns, the control group, the comparison with sub-limit moves, exact hits, two-way clustering, subsamples, the volume and prior-return terciles, the platform-change split, and the outlier exclusion. We also screened several candidate ideas on the same data before choosing this one, so effect-size estimates may overstate the true effect.</w:t>
+      </w:r>
+    </w:p>
+    <w:bookmarkEnd w:id="23"/>
+    <w:bookmarkStart w:id="30" w:name="results"/>
+    <w:p>
+      <w:pPr>
+        <w:pStyle w:val="Heading1"/>
+      </w:pPr>
+      <w:r>
+        <w:t xml:space="preserve">5. Results</w:t>
+      </w:r>
+    </w:p>
+    <w:p>
+      <w:pPr>
+        <w:pStyle w:val="FirstParagraph"/>
+      </w:pPr>
+      <w:r>
+        <w:t xml:space="preserve">The event sample holds 3,187 ceiling events on 446 dates and 2,105 floor events on 319 dates, so events cluster in market episodes with several limit closes on the same day. This clustering is why we report standard errors that allow for dependence across dates, weeks, and stocks.</w:t>
+      </w:r>
+    </w:p>
+    <w:p>
+      <w:pPr>
+        <w:pStyle w:val="BodyText"/>
+      </w:pPr>
+      <w:r>
+        <w:t xml:space="preserve">Figure 1 plots the</w:t>
+      </w:r>
+      <w:r>
+        <w:t xml:space="preserve"> </w:t>
       </w:r>
       <w:r>
         <w:rPr>
@@ -607,7 +763,7 @@
         <w:t xml:space="preserve">t</w:t>
       </w:r>
       <w:r>
-        <w:t xml:space="preserve">| = 3, and none survives the family-wide control (Figure 1). The largest full-sample |</w:t>
+        <w:t xml:space="preserve">-statistics of the 22 characteristics: none reaches |</w:t>
       </w:r>
       <w:r>
         <w:rPr>
@@ -617,6 +773,16 @@
         <w:t xml:space="preserve">t</w:t>
       </w:r>
       <w:r>
+        <w:t xml:space="preserve">| = 3, and none survives the family-wide control. The largest full-sample |</w:t>
+      </w:r>
+      <w:r>
+        <w:rPr>
+          <w:iCs/>
+          <w:i/>
+        </w:rPr>
+        <w:t xml:space="preserve">t</w:t>
+      </w:r>
+      <w:r>
         <w:t xml:space="preserve">| is 1.45, for 3-month and idiosyncratic momentum (confirmation-half</w:t>
       </w:r>
       <w:r>
@@ -669,7 +835,17 @@
         <w:t xml:space="preserve">t</w:t>
       </w:r>
       <w:r>
-        <w:t xml:space="preserve">| 1.79). The null excludes only large effects. Three features of this market can produce it. The sample is short, so a premium of a tenth of a percentage point per week stays invisible. Daily limits censor the highs and lows that several characteristics use, which weakens range-based measures. Slow-moving signals such as momentum and volatility may also carry little information in a market where short selling is costly and arbitrage capital is thin. Our data cannot tell these explanations apart, and we draw no conclusion about market efficiency from the null.</w:t>
+        <w:t xml:space="preserve">| 1.79). The null excludes only large effects, and excluding the least liquid 20% of stocks leaves the largest |</w:t>
+      </w:r>
+      <w:r>
+        <w:rPr>
+          <w:iCs/>
+          <w:i/>
+        </w:rPr>
+        <w:t xml:space="preserve">t</w:t>
+      </w:r>
+      <w:r>
+        <w:t xml:space="preserve">| at 1.62. The result is in line with the multiple-testing literature: The hurdles of Harvey et al. (2016) and Chordia et al. (2020) and the replication failures that Hou et al. (2020) report lead us to expect few survivors, and no characteristic here reaches even 1.96 in the full sample. Huang et al. (2023) find a size effect and an earnings-to-price effect in Vietnam, but our files contain no market capitalization or accounting data, so we cannot test those two signals and our null does not contradict theirs. Three features of this market can produce it. The sample is short, so a premium of a tenth of a percentage point per week stays invisible. Daily limits censor the highs and lows that several characteristics use, which weakens range-based measures. Slow-moving signals such as momentum and volatility may also carry little information in a market where short selling is costly and arbitrage capital is thin. Our data cannot tell these explanations apart, and we draw no conclusion about market efficiency from the null.</w:t>
       </w:r>
     </w:p>
     <w:p>
@@ -681,18 +857,18 @@
           <wp:inline>
             <wp:extent cx="5753100" cy="4071424"/>
             <wp:effectExtent b="0" l="0" r="0" t="0"/>
-            <wp:docPr descr="Figure 1. t-statistics of the Fama and MacBeth regressions for the 22 characteristics in the full sample, the discovery half and the confirmation half. Dashed lines mark |t| = 1.96 and dotted lines mark |t| = 3. Characteristics are ordered by absolute full-sample t." title="" id="24" name="Picture"/>
+            <wp:docPr descr="Figure 1. t-statistics of the Fama and MacBeth regressions for the 22 characteristics in the full sample, the discovery half and the confirmation half. Dashed lines mark |t| = 1.96 and dotted lines mark |t| = 3. Characteristics are ordered by absolute full-sample t." title="" id="25" name="Picture"/>
             <a:graphic>
               <a:graphicData uri="http://schemas.openxmlformats.org/drawingml/2006/picture">
                 <pic:pic>
                   <pic:nvPicPr>
-                    <pic:cNvPr descr="../output/figures/F1_characteristics.png" id="25" name="Picture"/>
+                    <pic:cNvPr descr="../output/figures/F1_characteristics.png" id="26" name="Picture"/>
                     <pic:cNvPicPr>
                       <a:picLocks noChangeArrowheads="1" noChangeAspect="1"/>
                     </pic:cNvPicPr>
                   </pic:nvPicPr>
                   <pic:blipFill>
-                    <a:blip r:embed="rId23"/>
+                    <a:blip r:embed="rId24"/>
                     <a:stretch>
                       <a:fillRect/>
                     </a:stretch>
@@ -803,7 +979,7 @@
         <w:pStyle w:val="BodyText"/>
       </w:pPr>
       <w:r>
-        <w:t xml:space="preserve">Table 1 reports the event tests. A ceiling close is followed by a market-adjusted return of 1.66% on day</w:t>
+        <w:t xml:space="preserve">Table 1 reports the event tests. Stocks that close at the ceiling earn a market-adjusted return of 1.66% on day</w:t>
       </w:r>
       <w:r>
         <w:t xml:space="preserve"> </w:t>
@@ -842,7 +1018,7 @@
         <w:t xml:space="preserve">d</w:t>
       </w:r>
       <w:r>
-        <w:t xml:space="preserve">+5. A floor close is followed by −0.71% and −1.76%. All four tests survive the BH control (adjusted</w:t>
+        <w:t xml:space="preserve">+5. Stocks that close at the floor earn −0.71% and −1.76%. All four tests survive the BH control (adjusted</w:t>
       </w:r>
       <w:r>
         <w:t xml:space="preserve"> </w:t>
@@ -996,7 +1172,7 @@
         <w:t xml:space="preserve"> </w:t>
       </w:r>
       <w:r>
-        <w:t xml:space="preserve">is −1.14. If we read the planned horizon as days</w:t>
+        <w:t xml:space="preserve">is −1.14. If the second horizon were days</w:t>
       </w:r>
       <w:r>
         <w:t xml:space="preserve"> </w:t>
@@ -1022,7 +1198,7 @@
         <w:t xml:space="preserve">d</w:t>
       </w:r>
       <w:r>
-        <w:t xml:space="preserve">+5, the ceiling test would fail and the floor test would fail the confirmation criterion. The evidence shows a one-day effect after ceiling closes and a one-day effect with some later drift after floor closes. These tests establish that limit closes carry information about the next day that none of the 22 characteristics carries. They leave open when in the day that information arrives, which the next analysis addresses.</w:t>
+        <w:t xml:space="preserve">+5, the ceiling test would fail and the floor test would fail the confirmation criterion. The evidence shows a one-day effect after ceiling closes and a one-day effect with some later drift after floor closes. The ceiling result fits the delayed price discovery that Kim and Rhee (1997) find support for in Tokyo, because the abnormal return arrives after the limit day. None of these studies reports a next-day abnormal return of comparable construction, so we cannot compare magnitudes, and Section 6 compares them in qualitative terms. These tests support H1: limit closes carry information about the next day that none of the 22 characteristics carries. They leave open when in the day that information arrives (H2).</w:t>
       </w:r>
     </w:p>
     <w:p>
@@ -2693,7 +2869,7 @@
         <w:t xml:space="preserve"> </w:t>
       </w:r>
       <w:r>
-        <w:t xml:space="preserve">= −3.5). The close-to-close effect is positive because the gap exceeds the giveback, and the session reverses about 24% of the gap. The decomposition places the effect in the opening auction. A stock that closes at its ceiling carries a queue of unfilled buy orders into the night. Those orders and any overnight news set the opening price, and the session that follows undoes part of the move, which suggests that part of the opening price reflects demand that does not persist. After a floor close the gap is −0.97% (</w:t>
+        <w:t xml:space="preserve">= −3.5). The close-to-close effect is positive because the gap exceeds the giveback, and the session reverses about 24% of the gap. The decomposition places the effect in the opening auction, which supports H2. A stock that closes at its ceiling may carry a queue of unfilled buy orders into the night, the mechanism that delayed price discovery assumes (Kim &amp; Rhee, 1997). Those orders and any overnight news set the opening price, and the session that follows undoes part of the move, which suggests that part of the opening price reflects demand that does not persist. The pattern has the same signs as the overnight-gain-then-intraday-reversal that Berkman et al. (2012) find in U.S. stocks and the cross-period reversal that Lou et al. (2019) and Akbas et al. (2022) document, and it matches the correction of overnight overreaction on the following trading day that Huang et al. (2001) report for Taiwan. It also matches the account-level finding of Chen et al. (2019) that large Shenzhen investors who buy on the limit day sell on the next day, which would produce an intraday reversal after a high opening. The overnight return after a ceiling close is positive, in contrast to the negative average overnight return that Qiao and Dam (2020) find for all Chinese stocks under the T+1 rule, so the ceiling gap is not the negative overnight pattern they report for Chinese stocks. After a floor close the gap is −0.97% (</w:t>
       </w:r>
       <w:r>
         <w:rPr>
@@ -2753,7 +2929,20 @@
         <w:t xml:space="preserve"> </w:t>
       </w:r>
       <w:r>
-        <w:t xml:space="preserve">= −1.8). A holder who sells at the next open instead of the close avoids an average giveback of 0.54 percentage points. These figures use quoted prices and ignore achievable fills: 522 ceiling events were locked at one price all day, and some of those open again at the limit, where a buyer may be rationed. After floor closes, prices keep falling from the next open to the fifth close (Table 2).</w:t>
+        <w:t xml:space="preserve">= −1.8). A holder who sells at the next open instead of the close avoids an average giveback of 0.54 percentage points. These figures, which support H4, use quoted prices and ignore achievable fills: 522 ceiling events were locked at one price all day, and some of those open again at the limit, where a buyer may be rationed. After floor closes, prices fall a further 0.82% from the next open to the fifth close against the market (</w:t>
+      </w:r>
+      <w:r>
+        <w:rPr>
+          <w:iCs/>
+          <w:i/>
+        </w:rPr>
+        <w:t xml:space="preserve">t</w:t>
+      </w:r>
+      <w:r>
+        <w:t xml:space="preserve"> </w:t>
+      </w:r>
+      <w:r>
+        <w:t xml:space="preserve">= −1.7; Table 2), which is not significant at the 5% level.</w:t>
       </w:r>
     </w:p>
     <w:p>
@@ -2806,20 +2995,40 @@
         <w:rPr>
           <w:sz w:val="19"/>
         </w:rPr>
-        <w:t xml:space="preserve">) or same-date non-event stocks in the same liquidity tercile. Open to day 5 is the return from the day-</w:t>
-      </w:r>
-      <w:r>
-        <w:rPr>
-          <w:iCs/>
-          <w:i/>
+        <w:t xml:space="preserve">) or same-date non-event stocks in the same liquidity tercile. Open to day</w:t>
+      </w:r>
+      <w:r>
+        <w:rPr>
           <w:sz w:val="19"/>
         </w:rPr>
+        <w:t xml:space="preserve"> </w:t>
+      </w:r>
+      <w:r>
+        <w:rPr>
+          <w:iCs/>
+          <w:i/>
+          <w:sz w:val="19"/>
+        </w:rPr>
         <w:t xml:space="preserve">d</w:t>
       </w:r>
       <w:r>
         <w:rPr>
           <w:sz w:val="19"/>
         </w:rPr>
+        <w:t xml:space="preserve">+5 is the return from the day-</w:t>
+      </w:r>
+      <w:r>
+        <w:rPr>
+          <w:iCs/>
+          <w:i/>
+          <w:sz w:val="19"/>
+        </w:rPr>
+        <w:t xml:space="preserve">d</w:t>
+      </w:r>
+      <w:r>
+        <w:rPr>
+          <w:sz w:val="19"/>
+        </w:rPr>
         <w:t xml:space="preserve">+1 open to the day-</w:t>
       </w:r>
       <w:r>
@@ -2834,7 +3043,7 @@
         <w:rPr>
           <w:sz w:val="19"/>
         </w:rPr>
-        <w:t xml:space="preserve">+5 close. Exact hits and near hits are defined in Section 3. Close-to-close need not equal the sum of the two components because returns compound. Events are the stock-days with the relevant return.</w:t>
+        <w:t xml:space="preserve">+5 close. Exact hits and near hits are defined in Section 4. Close-to-close need not equal the sum of the two components because returns compound. Events are the stock-days that meet the event definition in Section 4 and have the stated return.</w:t>
       </w:r>
     </w:p>
     <w:tbl>
@@ -2999,7 +3208,33 @@
                 <w:b/>
                 <w:sz w:val="17"/>
               </w:rPr>
-              <w:t xml:space="preserve">Open to day 5</w:t>
+              <w:t xml:space="preserve">Open to day</w:t>
+            </w:r>
+            <w:r>
+              <w:rPr>
+                <w:rFonts w:ascii="Times New Roman" w:hAnsi="Times New Roman"/>
+                <w:b/>
+                <w:sz w:val="17"/>
+              </w:rPr>
+              <w:t xml:space="preserve"> </w:t>
+            </w:r>
+            <w:r>
+              <w:rPr>
+                <w:iCs/>
+                <w:rFonts w:ascii="Times New Roman" w:hAnsi="Times New Roman"/>
+                <w:b/>
+                <w:i/>
+                <w:sz w:val="17"/>
+              </w:rPr>
+              <w:t xml:space="preserve">d</w:t>
+            </w:r>
+            <w:r>
+              <w:rPr>
+                <w:rFonts w:ascii="Times New Roman" w:hAnsi="Times New Roman"/>
+                <w:b/>
+                <w:sz w:val="17"/>
+              </w:rPr>
+              <w:t xml:space="preserve">+5</w:t>
             </w:r>
           </w:p>
         </w:tc>
@@ -5126,18 +5361,18 @@
           <wp:inline>
             <wp:extent cx="5753100" cy="2478258"/>
             <wp:effectExtent b="0" l="0" r="0" t="0"/>
-            <wp:docPr descr="Figure 2. Next-day abnormal return by the size of the day-d move, split into overnight gap, intraday return and close-to-close return. Circles are interior bins, triangles are closes at the 7% limit and squares are moves beyond 6.5% that did not close at the limit. Bars show 95% confidence intervals clustered by date." title="" id="27" name="Picture"/>
+            <wp:docPr descr="Figure 2. Next-day abnormal return by the size of the day-d move, split into overnight gap, intraday return and close-to-close return. Circles are interior bins, triangles are closes at the 7% limit and squares are moves beyond 6.5% that did not close at the limit. Bars show 95% confidence intervals clustered by date." title="" id="28" name="Picture"/>
             <a:graphic>
               <a:graphicData uri="http://schemas.openxmlformats.org/drawingml/2006/picture">
                 <pic:pic>
                   <pic:nvPicPr>
-                    <pic:cNvPr descr="../output/figures/F2_break_at_limit.png" id="28" name="Picture"/>
+                    <pic:cNvPr descr="../output/figures/F2_break_at_limit.png" id="29" name="Picture"/>
                     <pic:cNvPicPr>
                       <a:picLocks noChangeArrowheads="1" noChangeAspect="1"/>
                     </pic:cNvPicPr>
                   </pic:nvPicPr>
                   <pic:blipFill>
-                    <a:blip r:embed="rId26"/>
+                    <a:blip r:embed="rId27"/>
                     <a:stretch>
                       <a:fillRect/>
                     </a:stretch>
@@ -5239,7 +5474,7 @@
         <w:t xml:space="preserve"> </w:t>
       </w:r>
       <w:r>
-        <w:t xml:space="preserve">= 14.5) and the floor gap 1.81 points lower, so a strong close does not explain the contrast. The comparison is an association around a rule-based threshold. It makes no regression-discontinuity claim, because it has no bandwidth choice, manipulation test or covariate balance, and stocks that reach the limit may differ in news content.</w:t>
+        <w:t xml:space="preserve">= 14.5) and the floor gap 1.81 points lower, so a strong close does not explain the contrast, which supports H3. The comparison is an association around a rule-based threshold. It makes no regression-discontinuity claim, because it has no bandwidth choice, manipulation test or covariate balance, and stocks that reach the limit may differ in news content.</w:t>
       </w:r>
     </w:p>
     <w:p>
@@ -5418,7 +5653,33 @@
                 <w:b/>
                 <w:sz w:val="17"/>
               </w:rPr>
-              <w:t xml:space="preserve">Open to day 5</w:t>
+              <w:t xml:space="preserve">Open to day</w:t>
+            </w:r>
+            <w:r>
+              <w:rPr>
+                <w:rFonts w:ascii="Times New Roman" w:hAnsi="Times New Roman"/>
+                <w:b/>
+                <w:sz w:val="17"/>
+              </w:rPr>
+              <w:t xml:space="preserve"> </w:t>
+            </w:r>
+            <w:r>
+              <w:rPr>
+                <w:iCs/>
+                <w:rFonts w:ascii="Times New Roman" w:hAnsi="Times New Roman"/>
+                <w:b/>
+                <w:i/>
+                <w:sz w:val="17"/>
+              </w:rPr>
+              <w:t xml:space="preserve">d</w:t>
+            </w:r>
+            <w:r>
+              <w:rPr>
+                <w:rFonts w:ascii="Times New Roman" w:hAnsi="Times New Roman"/>
+                <w:b/>
+                <w:sz w:val="17"/>
+              </w:rPr>
+              <w:t xml:space="preserve">+5</w:t>
             </w:r>
           </w:p>
         </w:tc>
@@ -6483,7 +6744,7 @@
         <w:t xml:space="preserve"> </w:t>
       </w:r>
       <w:r>
-        <w:t xml:space="preserve">clears at the next opening, the delayed price discovery of Kim and Rhee (1997). (2) Stocks that reach a limit are selected on news and retail attention, which persist overnight and are followed by the overnight-gain-then-reversal of attention-grabbing stocks (Berkman et al., 2012), with or without a limit. (3) The opening call auction overshoots and corrects part of the move within the day. The sample has no announcement data, order book or stock-days without a limit, so we run two partial checks. First, the ceiling gap rises with day-</w:t>
+        <w:t xml:space="preserve">clears at the next opening, the delayed price discovery of Kim and Rhee (1997). (2) Stocks that reach a limit are selected on news and retail attention, which persist overnight and are followed by the overnight-gain-then-reversal of attention-grabbing stocks (Berkman et al., 2012), with or without a limit. (3) The opening call auction overshoots and corrects part of the move within the day. The sample has no announcement data, no order book, and no stock-days without a limit, so we run two partial checks. First, the ceiling gap rises with day-</w:t>
       </w:r>
       <w:r>
         <w:rPr>
@@ -6527,7 +6788,7 @@
         <w:t xml:space="preserve"> </w:t>
       </w:r>
       <w:r>
-        <w:t xml:space="preserve">as a description and treat delayed price discovery as one hypothesis.</w:t>
+        <w:t xml:space="preserve">as a description and treat delayed price discovery as one hypothesis. The comparison also bears on the magnet effect. Cho et al. (2003) and Chen et al. (2024) predict that prices accelerate toward a limit on the limit day, and our data lack the intraday prices needed to test that. The rise of the gap at the limit relative to near-limit moves shows only that the close at the limit carries information that a close just below the limit does not.</w:t>
       </w:r>
     </w:p>
     <w:p>
@@ -7179,7 +7440,30 @@
                 <w:rFonts w:ascii="Times New Roman" w:hAnsi="Times New Roman"/>
                 <w:sz w:val="17"/>
               </w:rPr>
-              <w:t xml:space="preserve">Open to day 5</w:t>
+              <w:t xml:space="preserve">Open to day</w:t>
+            </w:r>
+            <w:r>
+              <w:rPr>
+                <w:rFonts w:ascii="Times New Roman" w:hAnsi="Times New Roman"/>
+                <w:sz w:val="17"/>
+              </w:rPr>
+              <w:t xml:space="preserve"> </w:t>
+            </w:r>
+            <w:r>
+              <w:rPr>
+                <w:iCs/>
+                <w:rFonts w:ascii="Times New Roman" w:hAnsi="Times New Roman"/>
+                <w:i/>
+                <w:sz w:val="17"/>
+              </w:rPr>
+              <w:t xml:space="preserve">d</w:t>
+            </w:r>
+            <w:r>
+              <w:rPr>
+                <w:rFonts w:ascii="Times New Roman" w:hAnsi="Times New Roman"/>
+                <w:sz w:val="17"/>
+              </w:rPr>
+              <w:t xml:space="preserve">+5</w:t>
             </w:r>
           </w:p>
         </w:tc>
@@ -7683,7 +7967,30 @@
                 <w:rFonts w:ascii="Times New Roman" w:hAnsi="Times New Roman"/>
                 <w:sz w:val="17"/>
               </w:rPr>
-              <w:t xml:space="preserve">Open to day 5</w:t>
+              <w:t xml:space="preserve">Open to day</w:t>
+            </w:r>
+            <w:r>
+              <w:rPr>
+                <w:rFonts w:ascii="Times New Roman" w:hAnsi="Times New Roman"/>
+                <w:sz w:val="17"/>
+              </w:rPr>
+              <w:t xml:space="preserve"> </w:t>
+            </w:r>
+            <w:r>
+              <w:rPr>
+                <w:iCs/>
+                <w:rFonts w:ascii="Times New Roman" w:hAnsi="Times New Roman"/>
+                <w:i/>
+                <w:sz w:val="17"/>
+              </w:rPr>
+              <w:t xml:space="preserve">d</w:t>
+            </w:r>
+            <w:r>
+              <w:rPr>
+                <w:rFonts w:ascii="Times New Roman" w:hAnsi="Times New Roman"/>
+                <w:sz w:val="17"/>
+              </w:rPr>
+              <w:t xml:space="preserve">+5</w:t>
             </w:r>
           </w:p>
         </w:tc>
@@ -7783,7 +8090,7 @@
         <w:spacing w:before="160"/>
       </w:pPr>
       <w:r>
-        <w:t xml:space="preserve">The ceiling gap appears in both periods (1.65% before, 2.49% after the move to KRX; difference</w:t>
+        <w:t xml:space="preserve">Band changes in other markets changed volatility, liquidity, and execution quality (Lien et al., 2019; Kim &amp; Jun, 2019; Qi, 2023; Zhang et al., 2022). Our split follows a change in auction priority, not a change in the band, so it speaks to a different margin. The ceiling gap appears in both periods (1.65% before, 2.49% after the move to KRX; difference</w:t>
       </w:r>
       <w:r>
         <w:t xml:space="preserve"> </w:t>
@@ -7815,7 +8122,20 @@
         <w:t xml:space="preserve"> </w:t>
       </w:r>
       <w:r>
-        <w:t xml:space="preserve">= −3.2), and the intraday return after floor closes turns positive (0.64%). The drift from the next open to day 5 after floor closes exists only before the move (−1.73% before, −0.15% after). The change coincides with a different market period, and the post-change sample holds 71% of the ceiling events and 58% of the floor events. The split shows the main pattern on both sides, with differences in detail, and cannot isolate an effect of the auction rules.</w:t>
+        <w:t xml:space="preserve">= −3.2), and the intraday return after floor closes turns positive (0.64%). The drift from the next open to day</w:t>
+      </w:r>
+      <w:r>
+        <w:t xml:space="preserve"> </w:t>
+      </w:r>
+      <w:r>
+        <w:rPr>
+          <w:iCs/>
+          <w:i/>
+        </w:rPr>
+        <w:t xml:space="preserve">d</w:t>
+      </w:r>
+      <w:r>
+        <w:t xml:space="preserve">+5 after floor closes exists only before the move (−1.73% before, −0.15% after). The change coincides with a different market period, and the post-change sample holds 71% of the ceiling events and 58% of the floor events. The split shows the main pattern on both sides, with differences in detail, and cannot isolate an effect of the auction rules.</w:t>
       </w:r>
     </w:p>
     <w:p>
@@ -7868,17 +8188,17 @@
         <w:pStyle w:val="BodyText"/>
       </w:pPr>
       <w:r>
-        <w:t xml:space="preserve">Taken together, the results give a consistent but bounded picture. The limit effect is large in each of the measures we use, it survives alternative benchmarks, clusters and definitions, and it grows as the close approaches the limit. It differs between ceilings and floors in the details: the ceiling effect is a one-day gap with a partial reversal, and the floor effect combines a gap with drift that appears only before the 2025 platform change. The effect is not available to an outside buyer at the quoted next open. What the evidence does not settle is why the gap arises, and Section 5 returns to that question.</w:t>
+        <w:t xml:space="preserve">Taken together, the results support H1 to H4. The limit effect appears in each measure, survives alternative benchmarks, clusters, and definitions, and grows as the close approaches the limit. It differs between ceilings and floors in the details: the ceiling effect is a one-day gap with a partial reversal, and the floor effect combines a gap with drift that appears only before the 2025 platform change. The effect is not available to an outside buyer at the quoted next open. The evidence does not settle why the gap arises, and Section 6 returns to that question.</w:t>
       </w:r>
     </w:p>
-    <w:bookmarkEnd w:id="29"/>
-    <w:bookmarkStart w:id="30" w:name="discussion"/>
+    <w:bookmarkEnd w:id="30"/>
+    <w:bookmarkStart w:id="31" w:name="discussion"/>
     <w:p>
       <w:pPr>
         <w:pStyle w:val="Heading1"/>
       </w:pPr>
       <w:r>
-        <w:t xml:space="preserve">5. Discussion</w:t>
+        <w:t xml:space="preserve">6. Discussion</w:t>
       </w:r>
     </w:p>
     <w:p>
@@ -7886,7 +8206,7 @@
         <w:pStyle w:val="FirstParagraph"/>
       </w:pPr>
       <w:r>
-        <w:t xml:space="preserve">The evidence is consistent with delayed price discovery. The continuation after a ceiling close sits in the opening. Days</w:t>
+        <w:t xml:space="preserve">The evidence is consistent with delayed price discovery and with the rival readings of Section 5. The continuation after a ceiling close sits in the opening. Days</w:t>
       </w:r>
       <w:r>
         <w:t xml:space="preserve"> </w:t>
@@ -7925,7 +8245,7 @@
         <w:t xml:space="preserve">d</w:t>
       </w:r>
       <w:r>
-        <w:t xml:space="preserve">+1 session reverses part of it. Lou et al. (2019) show that overnight and intraday returns have different persistence and that heterogeneous traders can explain the difference. The contrast with stocks that moved almost as far, including those that also closed at their high, is the part of the evidence that a pure attention reading must explain. The post-open drift after floor closes, which exists only before the platform change, does not fit a gap-only reading.</w:t>
+        <w:t xml:space="preserve">+1 session reverses part of it. Lou et al. (2019) show continuation in both periods with an offsetting cross-period reversal. The contrast with stocks that moved almost as far, including those that also closed at their high, is the part of the evidence that a pure attention reading must explain. The post-open drift after floor closes, which exists only before the platform change, does not fit a gap-only reading.</w:t>
       </w:r>
     </w:p>
     <w:p>
@@ -7933,15 +8253,1130 @@
         <w:pStyle w:val="BodyText"/>
       </w:pPr>
       <w:r>
-        <w:t xml:space="preserve">Earlier evidence from Asian markets gives context. Kim and Rhee (1997) read return continuation after limit hits as delayed price discovery, and Berkman and Lee (2002) report more continuation after limit hits in Korea. Our decomposition adds timing: on HOSE the continuation arrives at the next opening and mostly stops there, which differs from a multi-day adjustment. We do not test the magnet effect that Cho et al. (2003) document, because our data lack intraday prices. The close-to-close pattern after ceilings in our sample resembles the continuation in those studies, and the gap-then-reversal shape links it to the overnight-return literature.</w:t>
+        <w:t xml:space="preserve">Our decomposition adds timing to the evidence of Kim and Rhee (1997): on HOSE the continuation arrives at the next opening and stops there after the first day, which differs from a multi-day adjustment. We do not test the magnet effect that Cho et al. (2003) document, because our data lack intraday prices.</w:t>
+      </w:r>
+      <w:r>
+        <w:t xml:space="preserve"> </w:t>
+      </w:r>
+      <w:r>
+        <w:t xml:space="preserve">Table 5 sets each result against the studies reviewed in Section 2. No source reports the next-day abnormal return, the overnight gap, or the intraday return after a limit close in a form that matches ours, so the comparison concerns signs, timing, and mechanism, not magnitudes. Our estimates of +1.7% for the ceiling, +2.2% for the gap, and −0.5% for the intraday return are our estimates for this market. We know of no peer-reviewed study that measures them in the same way.</w:t>
       </w:r>
     </w:p>
     <w:p>
       <w:pPr>
         <w:pStyle w:val="BodyText"/>
-      </w:pPr>
-      <w:r>
-        <w:t xml:space="preserve">The findings bear on two design choices, the width of the band and the priority of auction orders. A 7% band leaves room for a large overnight gap, so the opening auction does much of the adjustment that a wider band would allow on day</w:t>
+        <w:keepNext/>
+        <w:spacing w:after="60"/>
+      </w:pPr>
+      <w:r>
+        <w:rPr>
+          <w:sz w:val="19"/>
+        </w:rPr>
+        <w:t xml:space="preserve">Table 5. Comparison with earlier studies. The second and third columns summarize each source as reported in its abstract or in the records we could access; the last column relates it to our results.</w:t>
+      </w:r>
+    </w:p>
+    <w:tbl>
+      <w:tblPr>
+        <w:tblStyle w:val="Table"/>
+        <w:tblW w:type="dxa" w:w="9070"/>
+        <w:tblLook w:firstRow="1" w:lastRow="0" w:firstColumn="0" w:lastColumn="0" w:noHBand="0" w:noVBand="0" w:val="0020"/>
+        <w:jc w:val="start"/>
+        <w:tblLayout w:type="fixed"/>
+      </w:tblPr>
+      <w:tblGrid>
+        <w:gridCol w:w="2145"/>
+        <w:gridCol w:w="1402"/>
+        <w:gridCol w:w="2760"/>
+        <w:gridCol w:w="2760"/>
+      </w:tblGrid>
+      <w:tr>
+        <w:trPr>
+          <w:tblHeader w:val="true"/>
+          <w:tblHeader/>
+          <w:cantSplit/>
+        </w:trPr>
+        <w:tc>
+          <w:tcPr>
+            <w:tcW w:type="dxa" w:w="2145"/>
+            <w:tcBorders>
+              <w:top w:val="single" w:sz="8" w:color="000000" w:space="0"/>
+              <w:bottom w:val="single" w:sz="6" w:color="000000" w:space="0"/>
+            </w:tcBorders>
+          </w:tcPr>
+          <w:p>
+            <w:pPr>
+              <w:pStyle w:val="Compact"/>
+              <w:keepNext/>
+              <w:spacing w:after="20" w:before="20" w:line="240" w:lineRule="auto"/>
+              <w:jc w:val="left"/>
+            </w:pPr>
+            <w:r>
+              <w:rPr>
+                <w:rFonts w:ascii="Times New Roman" w:hAnsi="Times New Roman"/>
+                <w:b/>
+                <w:sz w:val="17"/>
+              </w:rPr>
+              <w:t xml:space="preserve">Study</w:t>
+            </w:r>
+          </w:p>
+        </w:tc>
+        <w:tc>
+          <w:tcPr>
+            <w:tcW w:type="dxa" w:w="1402"/>
+            <w:tcBorders>
+              <w:top w:val="single" w:sz="8" w:color="000000" w:space="0"/>
+              <w:bottom w:val="single" w:sz="6" w:color="000000" w:space="0"/>
+            </w:tcBorders>
+          </w:tcPr>
+          <w:p>
+            <w:pPr>
+              <w:pStyle w:val="Compact"/>
+              <w:keepNext/>
+              <w:spacing w:after="20" w:before="20" w:line="240" w:lineRule="auto"/>
+              <w:jc w:val="center"/>
+            </w:pPr>
+            <w:r>
+              <w:rPr>
+                <w:rFonts w:ascii="Times New Roman" w:hAnsi="Times New Roman"/>
+                <w:b/>
+                <w:sz w:val="17"/>
+              </w:rPr>
+              <w:t xml:space="preserve">Setting</w:t>
+            </w:r>
+          </w:p>
+        </w:tc>
+        <w:tc>
+          <w:tcPr>
+            <w:tcW w:type="dxa" w:w="2760"/>
+            <w:tcBorders>
+              <w:top w:val="single" w:sz="8" w:color="000000" w:space="0"/>
+              <w:bottom w:val="single" w:sz="6" w:color="000000" w:space="0"/>
+            </w:tcBorders>
+          </w:tcPr>
+          <w:p>
+            <w:pPr>
+              <w:pStyle w:val="Compact"/>
+              <w:keepNext/>
+              <w:spacing w:after="20" w:before="20" w:line="240" w:lineRule="auto"/>
+              <w:jc w:val="left"/>
+            </w:pPr>
+            <w:r>
+              <w:rPr>
+                <w:rFonts w:ascii="Times New Roman" w:hAnsi="Times New Roman"/>
+                <w:b/>
+                <w:sz w:val="17"/>
+              </w:rPr>
+              <w:t xml:space="preserve">Reported finding</w:t>
+            </w:r>
+          </w:p>
+        </w:tc>
+        <w:tc>
+          <w:tcPr>
+            <w:tcW w:type="dxa" w:w="2760"/>
+            <w:tcBorders>
+              <w:top w:val="single" w:sz="8" w:color="000000" w:space="0"/>
+              <w:bottom w:val="single" w:sz="6" w:color="000000" w:space="0"/>
+            </w:tcBorders>
+          </w:tcPr>
+          <w:p>
+            <w:pPr>
+              <w:pStyle w:val="Compact"/>
+              <w:keepNext/>
+              <w:spacing w:after="20" w:before="20" w:line="240" w:lineRule="auto"/>
+              <w:jc w:val="left"/>
+            </w:pPr>
+            <w:r>
+              <w:rPr>
+                <w:rFonts w:ascii="Times New Roman" w:hAnsi="Times New Roman"/>
+                <w:b/>
+                <w:sz w:val="17"/>
+              </w:rPr>
+              <w:t xml:space="preserve">Relation to our result</w:t>
+            </w:r>
+          </w:p>
+        </w:tc>
+      </w:tr>
+      <w:tr>
+        <w:trPr>
+          <w:cantSplit/>
+        </w:trPr>
+        <w:tc>
+          <w:tcPr>
+            <w:tcW w:type="dxa" w:w="2145"/>
+          </w:tcPr>
+          <w:p>
+            <w:pPr>
+              <w:pStyle w:val="Compact"/>
+              <w:keepNext/>
+              <w:spacing w:after="20" w:before="20" w:line="240" w:lineRule="auto"/>
+              <w:jc w:val="left"/>
+            </w:pPr>
+            <w:r>
+              <w:rPr>
+                <w:rFonts w:ascii="Times New Roman" w:hAnsi="Times New Roman"/>
+                <w:sz w:val="17"/>
+              </w:rPr>
+              <w:t xml:space="preserve">Kim and Rhee (1997)</w:t>
+            </w:r>
+          </w:p>
+        </w:tc>
+        <w:tc>
+          <w:tcPr>
+            <w:tcW w:type="dxa" w:w="1402"/>
+          </w:tcPr>
+          <w:p>
+            <w:pPr>
+              <w:pStyle w:val="Compact"/>
+              <w:keepNext/>
+              <w:spacing w:after="20" w:before="20" w:line="240" w:lineRule="auto"/>
+              <w:jc w:val="center"/>
+            </w:pPr>
+            <w:r>
+              <w:rPr>
+                <w:rFonts w:ascii="Times New Roman" w:hAnsi="Times New Roman"/>
+                <w:sz w:val="17"/>
+              </w:rPr>
+              <w:t xml:space="preserve">Tokyo; limit-hit events</w:t>
+            </w:r>
+          </w:p>
+        </w:tc>
+        <w:tc>
+          <w:tcPr>
+            <w:tcW w:type="dxa" w:w="2760"/>
+          </w:tcPr>
+          <w:p>
+            <w:pPr>
+              <w:pStyle w:val="Compact"/>
+              <w:keepNext/>
+              <w:spacing w:after="20" w:before="20" w:line="240" w:lineRule="auto"/>
+              <w:jc w:val="left"/>
+            </w:pPr>
+            <w:r>
+              <w:rPr>
+                <w:rFonts w:ascii="Times New Roman" w:hAnsi="Times New Roman"/>
+                <w:sz w:val="17"/>
+              </w:rPr>
+              <w:t xml:space="preserve">Support for volatility spillover, delayed price discovery, and trading interference</w:t>
+            </w:r>
+          </w:p>
+        </w:tc>
+        <w:tc>
+          <w:tcPr>
+            <w:tcW w:type="dxa" w:w="2760"/>
+          </w:tcPr>
+          <w:p>
+            <w:pPr>
+              <w:pStyle w:val="Compact"/>
+              <w:keepNext/>
+              <w:spacing w:after="20" w:before="20" w:line="240" w:lineRule="auto"/>
+              <w:jc w:val="left"/>
+            </w:pPr>
+            <w:r>
+              <w:rPr>
+                <w:rFonts w:ascii="Times New Roman" w:hAnsi="Times New Roman"/>
+                <w:sz w:val="17"/>
+              </w:rPr>
+              <w:t xml:space="preserve">Our significant next-day return after ceiling closes is consistent with delayed price discovery; we do not test spillover or interference</w:t>
+            </w:r>
+          </w:p>
+        </w:tc>
+      </w:tr>
+      <w:tr>
+        <w:trPr>
+          <w:cantSplit/>
+        </w:trPr>
+        <w:tc>
+          <w:tcPr>
+            <w:tcW w:type="dxa" w:w="2145"/>
+          </w:tcPr>
+          <w:p>
+            <w:pPr>
+              <w:pStyle w:val="Compact"/>
+              <w:keepNext/>
+              <w:spacing w:after="20" w:before="20" w:line="240" w:lineRule="auto"/>
+              <w:jc w:val="left"/>
+            </w:pPr>
+            <w:r>
+              <w:rPr>
+                <w:rFonts w:ascii="Times New Roman" w:hAnsi="Times New Roman"/>
+                <w:sz w:val="17"/>
+              </w:rPr>
+              <w:t xml:space="preserve">Berkman and Lee (2002)</w:t>
+            </w:r>
+          </w:p>
+        </w:tc>
+        <w:tc>
+          <w:tcPr>
+            <w:tcW w:type="dxa" w:w="1402"/>
+          </w:tcPr>
+          <w:p>
+            <w:pPr>
+              <w:pStyle w:val="Compact"/>
+              <w:keepNext/>
+              <w:spacing w:after="20" w:before="20" w:line="240" w:lineRule="auto"/>
+              <w:jc w:val="center"/>
+            </w:pPr>
+            <w:r>
+              <w:rPr>
+                <w:rFonts w:ascii="Times New Roman" w:hAnsi="Times New Roman"/>
+                <w:sz w:val="17"/>
+              </w:rPr>
+              <w:t xml:space="preserve">Korea; revision of the limit system</w:t>
+            </w:r>
+          </w:p>
+        </w:tc>
+        <w:tc>
+          <w:tcPr>
+            <w:tcW w:type="dxa" w:w="2760"/>
+          </w:tcPr>
+          <w:p>
+            <w:pPr>
+              <w:pStyle w:val="Compact"/>
+              <w:keepNext/>
+              <w:spacing w:after="20" w:before="20" w:line="240" w:lineRule="auto"/>
+              <w:jc w:val="left"/>
+            </w:pPr>
+            <w:r>
+              <w:rPr>
+                <w:rFonts w:ascii="Times New Roman" w:hAnsi="Times New Roman"/>
+                <w:sz w:val="17"/>
+              </w:rPr>
+              <w:t xml:space="preserve">Volatility and trading activity examined around the revision</w:t>
+            </w:r>
+          </w:p>
+        </w:tc>
+        <w:tc>
+          <w:tcPr>
+            <w:tcW w:type="dxa" w:w="2760"/>
+          </w:tcPr>
+          <w:p>
+            <w:pPr>
+              <w:pStyle w:val="Compact"/>
+              <w:keepNext/>
+              <w:spacing w:after="20" w:before="20" w:line="240" w:lineRule="auto"/>
+              <w:jc w:val="left"/>
+            </w:pPr>
+            <w:r>
+              <w:rPr>
+                <w:rFonts w:ascii="Times New Roman" w:hAnsi="Times New Roman"/>
+                <w:sz w:val="17"/>
+              </w:rPr>
+              <w:t xml:space="preserve">Different question; no comparison with our returns</w:t>
+            </w:r>
+          </w:p>
+        </w:tc>
+      </w:tr>
+      <w:tr>
+        <w:trPr>
+          <w:cantSplit/>
+        </w:trPr>
+        <w:tc>
+          <w:tcPr>
+            <w:tcW w:type="dxa" w:w="2145"/>
+          </w:tcPr>
+          <w:p>
+            <w:pPr>
+              <w:pStyle w:val="Compact"/>
+              <w:keepNext/>
+              <w:spacing w:after="20" w:before="20" w:line="240" w:lineRule="auto"/>
+              <w:jc w:val="left"/>
+            </w:pPr>
+            <w:r>
+              <w:rPr>
+                <w:rFonts w:ascii="Times New Roman" w:hAnsi="Times New Roman"/>
+                <w:sz w:val="17"/>
+              </w:rPr>
+              <w:t xml:space="preserve">Huang et al. (2001)</w:t>
+            </w:r>
+          </w:p>
+        </w:tc>
+        <w:tc>
+          <w:tcPr>
+            <w:tcW w:type="dxa" w:w="1402"/>
+          </w:tcPr>
+          <w:p>
+            <w:pPr>
+              <w:pStyle w:val="Compact"/>
+              <w:keepNext/>
+              <w:spacing w:after="20" w:before="20" w:line="240" w:lineRule="auto"/>
+              <w:jc w:val="center"/>
+            </w:pPr>
+            <w:r>
+              <w:rPr>
+                <w:rFonts w:ascii="Times New Roman" w:hAnsi="Times New Roman"/>
+                <w:sz w:val="17"/>
+              </w:rPr>
+              <w:t xml:space="preserve">Taiwan; limit hits</w:t>
+            </w:r>
+          </w:p>
+        </w:tc>
+        <w:tc>
+          <w:tcPr>
+            <w:tcW w:type="dxa" w:w="2760"/>
+          </w:tcPr>
+          <w:p>
+            <w:pPr>
+              <w:pStyle w:val="Compact"/>
+              <w:keepNext/>
+              <w:spacing w:after="20" w:before="20" w:line="240" w:lineRule="auto"/>
+              <w:jc w:val="left"/>
+            </w:pPr>
+            <w:r>
+              <w:rPr>
+                <w:rFonts w:ascii="Times New Roman" w:hAnsi="Times New Roman"/>
+                <w:sz w:val="17"/>
+              </w:rPr>
+              <w:t xml:space="preserve">Overnight overreaction after limit hits corrected on the following day</w:t>
+            </w:r>
+          </w:p>
+        </w:tc>
+        <w:tc>
+          <w:tcPr>
+            <w:tcW w:type="dxa" w:w="2760"/>
+          </w:tcPr>
+          <w:p>
+            <w:pPr>
+              <w:pStyle w:val="Compact"/>
+              <w:keepNext/>
+              <w:spacing w:after="20" w:before="20" w:line="240" w:lineRule="auto"/>
+              <w:jc w:val="left"/>
+            </w:pPr>
+            <w:r>
+              <w:rPr>
+                <w:rFonts w:ascii="Times New Roman" w:hAnsi="Times New Roman"/>
+                <w:sz w:val="17"/>
+              </w:rPr>
+              <w:t xml:space="preserve">Same timing: positive gap, partial intraday reversal</w:t>
+            </w:r>
+          </w:p>
+        </w:tc>
+      </w:tr>
+      <w:tr>
+        <w:trPr>
+          <w:cantSplit/>
+        </w:trPr>
+        <w:tc>
+          <w:tcPr>
+            <w:tcW w:type="dxa" w:w="2145"/>
+          </w:tcPr>
+          <w:p>
+            <w:pPr>
+              <w:pStyle w:val="Compact"/>
+              <w:keepNext/>
+              <w:spacing w:after="20" w:before="20" w:line="240" w:lineRule="auto"/>
+              <w:jc w:val="left"/>
+            </w:pPr>
+            <w:r>
+              <w:rPr>
+                <w:rFonts w:ascii="Times New Roman" w:hAnsi="Times New Roman"/>
+                <w:sz w:val="17"/>
+              </w:rPr>
+              <w:t xml:space="preserve">Cho et al. (2003)</w:t>
+            </w:r>
+          </w:p>
+        </w:tc>
+        <w:tc>
+          <w:tcPr>
+            <w:tcW w:type="dxa" w:w="1402"/>
+          </w:tcPr>
+          <w:p>
+            <w:pPr>
+              <w:pStyle w:val="Compact"/>
+              <w:keepNext/>
+              <w:spacing w:after="20" w:before="20" w:line="240" w:lineRule="auto"/>
+              <w:jc w:val="center"/>
+            </w:pPr>
+            <w:r>
+              <w:rPr>
+                <w:rFonts w:ascii="Times New Roman" w:hAnsi="Times New Roman"/>
+                <w:sz w:val="17"/>
+              </w:rPr>
+              <w:t xml:space="preserve">Taiwan; five-minute data</w:t>
+            </w:r>
+          </w:p>
+        </w:tc>
+        <w:tc>
+          <w:tcPr>
+            <w:tcW w:type="dxa" w:w="2760"/>
+          </w:tcPr>
+          <w:p>
+            <w:pPr>
+              <w:pStyle w:val="Compact"/>
+              <w:keepNext/>
+              <w:spacing w:after="20" w:before="20" w:line="240" w:lineRule="auto"/>
+              <w:jc w:val="left"/>
+            </w:pPr>
+            <w:r>
+              <w:rPr>
+                <w:rFonts w:ascii="Times New Roman" w:hAnsi="Times New Roman"/>
+                <w:sz w:val="17"/>
+              </w:rPr>
+              <w:t xml:space="preserve">Prices accelerate toward the upper limit</w:t>
+            </w:r>
+          </w:p>
+        </w:tc>
+        <w:tc>
+          <w:tcPr>
+            <w:tcW w:type="dxa" w:w="2760"/>
+          </w:tcPr>
+          <w:p>
+            <w:pPr>
+              <w:pStyle w:val="Compact"/>
+              <w:keepNext/>
+              <w:spacing w:after="20" w:before="20" w:line="240" w:lineRule="auto"/>
+              <w:jc w:val="left"/>
+            </w:pPr>
+            <w:r>
+              <w:rPr>
+                <w:rFonts w:ascii="Times New Roman" w:hAnsi="Times New Roman"/>
+                <w:sz w:val="17"/>
+              </w:rPr>
+              <w:t xml:space="preserve">Not tested; our data lack intraday prices</w:t>
+            </w:r>
+          </w:p>
+        </w:tc>
+      </w:tr>
+      <w:tr>
+        <w:trPr>
+          <w:cantSplit/>
+        </w:trPr>
+        <w:tc>
+          <w:tcPr>
+            <w:tcW w:type="dxa" w:w="2145"/>
+          </w:tcPr>
+          <w:p>
+            <w:pPr>
+              <w:pStyle w:val="Compact"/>
+              <w:keepNext/>
+              <w:spacing w:after="20" w:before="20" w:line="240" w:lineRule="auto"/>
+              <w:jc w:val="left"/>
+            </w:pPr>
+            <w:r>
+              <w:rPr>
+                <w:rFonts w:ascii="Times New Roman" w:hAnsi="Times New Roman"/>
+                <w:sz w:val="17"/>
+              </w:rPr>
+              <w:t xml:space="preserve">Chen et al. (2019)</w:t>
+            </w:r>
+          </w:p>
+        </w:tc>
+        <w:tc>
+          <w:tcPr>
+            <w:tcW w:type="dxa" w:w="1402"/>
+          </w:tcPr>
+          <w:p>
+            <w:pPr>
+              <w:pStyle w:val="Compact"/>
+              <w:keepNext/>
+              <w:spacing w:after="20" w:before="20" w:line="240" w:lineRule="auto"/>
+              <w:jc w:val="center"/>
+            </w:pPr>
+            <w:r>
+              <w:rPr>
+                <w:rFonts w:ascii="Times New Roman" w:hAnsi="Times New Roman"/>
+                <w:sz w:val="17"/>
+              </w:rPr>
+              <w:t xml:space="preserve">Shenzhen; account-level data</w:t>
+            </w:r>
+          </w:p>
+        </w:tc>
+        <w:tc>
+          <w:tcPr>
+            <w:tcW w:type="dxa" w:w="2760"/>
+          </w:tcPr>
+          <w:p>
+            <w:pPr>
+              <w:pStyle w:val="Compact"/>
+              <w:keepNext/>
+              <w:spacing w:after="20" w:before="20" w:line="240" w:lineRule="auto"/>
+              <w:jc w:val="left"/>
+            </w:pPr>
+            <w:r>
+              <w:rPr>
+                <w:rFonts w:ascii="Times New Roman" w:hAnsi="Times New Roman"/>
+                <w:sz w:val="17"/>
+              </w:rPr>
+              <w:t xml:space="preserve">Large investors buy on the limit day and sell on the next day; their net buying predicts long-run reversal</w:t>
+            </w:r>
+          </w:p>
+        </w:tc>
+        <w:tc>
+          <w:tcPr>
+            <w:tcW w:type="dxa" w:w="2760"/>
+          </w:tcPr>
+          <w:p>
+            <w:pPr>
+              <w:pStyle w:val="Compact"/>
+              <w:keepNext/>
+              <w:spacing w:after="20" w:before="20" w:line="240" w:lineRule="auto"/>
+              <w:jc w:val="left"/>
+            </w:pPr>
+            <w:r>
+              <w:rPr>
+                <w:rFonts w:ascii="Times New Roman" w:hAnsi="Times New Roman"/>
+                <w:sz w:val="17"/>
+              </w:rPr>
+              <w:t xml:space="preserve">Consistent with our intraday reversal; our data lack account identities</w:t>
+            </w:r>
+          </w:p>
+        </w:tc>
+      </w:tr>
+      <w:tr>
+        <w:trPr>
+          <w:cantSplit/>
+        </w:trPr>
+        <w:tc>
+          <w:tcPr>
+            <w:tcW w:type="dxa" w:w="2145"/>
+          </w:tcPr>
+          <w:p>
+            <w:pPr>
+              <w:pStyle w:val="Compact"/>
+              <w:keepNext/>
+              <w:spacing w:after="20" w:before="20" w:line="240" w:lineRule="auto"/>
+              <w:jc w:val="left"/>
+            </w:pPr>
+            <w:r>
+              <w:rPr>
+                <w:rFonts w:ascii="Times New Roman" w:hAnsi="Times New Roman"/>
+                <w:sz w:val="17"/>
+              </w:rPr>
+              <w:t xml:space="preserve">Qi (2023)</w:t>
+            </w:r>
+          </w:p>
+        </w:tc>
+        <w:tc>
+          <w:tcPr>
+            <w:tcW w:type="dxa" w:w="1402"/>
+          </w:tcPr>
+          <w:p>
+            <w:pPr>
+              <w:pStyle w:val="Compact"/>
+              <w:keepNext/>
+              <w:spacing w:after="20" w:before="20" w:line="240" w:lineRule="auto"/>
+              <w:jc w:val="center"/>
+            </w:pPr>
+            <w:r>
+              <w:rPr>
+                <w:rFonts w:ascii="Times New Roman" w:hAnsi="Times New Roman"/>
+                <w:sz w:val="17"/>
+              </w:rPr>
+              <w:t xml:space="preserve">ChiNext; band widened from 10% to 20%</w:t>
+            </w:r>
+          </w:p>
+        </w:tc>
+        <w:tc>
+          <w:tcPr>
+            <w:tcW w:type="dxa" w:w="2760"/>
+          </w:tcPr>
+          <w:p>
+            <w:pPr>
+              <w:pStyle w:val="Compact"/>
+              <w:keepNext/>
+              <w:spacing w:after="20" w:before="20" w:line="240" w:lineRule="auto"/>
+              <w:jc w:val="left"/>
+            </w:pPr>
+            <w:r>
+              <w:rPr>
+                <w:rFonts w:ascii="Times New Roman" w:hAnsi="Times New Roman"/>
+                <w:sz w:val="17"/>
+              </w:rPr>
+              <w:t xml:space="preserve">Delayed price discovery, volatility spillover, and trading interference, stronger at the lower limit; no magnet effect</w:t>
+            </w:r>
+          </w:p>
+        </w:tc>
+        <w:tc>
+          <w:tcPr>
+            <w:tcW w:type="dxa" w:w="2760"/>
+          </w:tcPr>
+          <w:p>
+            <w:pPr>
+              <w:pStyle w:val="Compact"/>
+              <w:keepNext/>
+              <w:spacing w:after="20" w:before="20" w:line="240" w:lineRule="auto"/>
+              <w:jc w:val="left"/>
+            </w:pPr>
+            <w:r>
+              <w:rPr>
+                <w:rFonts w:ascii="Times New Roman" w:hAnsi="Times New Roman"/>
+                <w:sz w:val="17"/>
+              </w:rPr>
+              <w:t xml:space="preserve">Different outcome: Qi studies market quality after a band change, we study returns after limit closes; both ceiling and floor closes carry a significant next-day return here, with a weaker floor effect that depends on the benchmark</w:t>
+            </w:r>
+          </w:p>
+        </w:tc>
+      </w:tr>
+      <w:tr>
+        <w:trPr>
+          <w:cantSplit/>
+        </w:trPr>
+        <w:tc>
+          <w:tcPr>
+            <w:tcW w:type="dxa" w:w="2145"/>
+          </w:tcPr>
+          <w:p>
+            <w:pPr>
+              <w:pStyle w:val="Compact"/>
+              <w:keepNext/>
+              <w:spacing w:after="20" w:before="20" w:line="240" w:lineRule="auto"/>
+              <w:jc w:val="left"/>
+            </w:pPr>
+            <w:r>
+              <w:rPr>
+                <w:rFonts w:ascii="Times New Roman" w:hAnsi="Times New Roman"/>
+                <w:sz w:val="17"/>
+              </w:rPr>
+              <w:t xml:space="preserve">Lin et al. (2023); Zeng et al. (2024)</w:t>
+            </w:r>
+          </w:p>
+        </w:tc>
+        <w:tc>
+          <w:tcPr>
+            <w:tcW w:type="dxa" w:w="1402"/>
+          </w:tcPr>
+          <w:p>
+            <w:pPr>
+              <w:pStyle w:val="Compact"/>
+              <w:keepNext/>
+              <w:spacing w:after="20" w:before="20" w:line="240" w:lineRule="auto"/>
+              <w:jc w:val="center"/>
+            </w:pPr>
+            <w:r>
+              <w:rPr>
+                <w:rFonts w:ascii="Times New Roman" w:hAnsi="Times New Roman"/>
+                <w:sz w:val="17"/>
+              </w:rPr>
+              <w:t xml:space="preserve">China; cross-section of stocks</w:t>
+            </w:r>
+          </w:p>
+        </w:tc>
+        <w:tc>
+          <w:tcPr>
+            <w:tcW w:type="dxa" w:w="2760"/>
+          </w:tcPr>
+          <w:p>
+            <w:pPr>
+              <w:pStyle w:val="Compact"/>
+              <w:keepNext/>
+              <w:spacing w:after="20" w:before="20" w:line="240" w:lineRule="auto"/>
+              <w:jc w:val="left"/>
+            </w:pPr>
+            <w:r>
+              <w:rPr>
+                <w:rFonts w:ascii="Times New Roman" w:hAnsi="Times New Roman"/>
+                <w:sz w:val="17"/>
+              </w:rPr>
+              <w:t xml:space="preserve">Stocks with large limit exposure, or frequent limit hits, earn lower future returns</w:t>
+            </w:r>
+          </w:p>
+        </w:tc>
+        <w:tc>
+          <w:tcPr>
+            <w:tcW w:type="dxa" w:w="2760"/>
+          </w:tcPr>
+          <w:p>
+            <w:pPr>
+              <w:pStyle w:val="Compact"/>
+              <w:keepNext/>
+              <w:spacing w:after="20" w:before="20" w:line="240" w:lineRule="auto"/>
+              <w:jc w:val="left"/>
+            </w:pPr>
+            <w:r>
+              <w:rPr>
+                <w:rFonts w:ascii="Times New Roman" w:hAnsi="Times New Roman"/>
+                <w:sz w:val="17"/>
+              </w:rPr>
+              <w:t xml:space="preserve">Different horizon; a positive one-day return can coexist with later reversal, which we do not measure</w:t>
+            </w:r>
+          </w:p>
+        </w:tc>
+      </w:tr>
+      <w:tr>
+        <w:trPr>
+          <w:cantSplit/>
+        </w:trPr>
+        <w:tc>
+          <w:tcPr>
+            <w:tcW w:type="dxa" w:w="2145"/>
+          </w:tcPr>
+          <w:p>
+            <w:pPr>
+              <w:pStyle w:val="Compact"/>
+              <w:keepNext/>
+              <w:spacing w:after="20" w:before="20" w:line="240" w:lineRule="auto"/>
+              <w:jc w:val="left"/>
+            </w:pPr>
+            <w:r>
+              <w:rPr>
+                <w:rFonts w:ascii="Times New Roman" w:hAnsi="Times New Roman"/>
+                <w:sz w:val="17"/>
+              </w:rPr>
+              <w:t xml:space="preserve">Berkman et al. (2012)</w:t>
+            </w:r>
+          </w:p>
+        </w:tc>
+        <w:tc>
+          <w:tcPr>
+            <w:tcW w:type="dxa" w:w="1402"/>
+          </w:tcPr>
+          <w:p>
+            <w:pPr>
+              <w:pStyle w:val="Compact"/>
+              <w:keepNext/>
+              <w:spacing w:after="20" w:before="20" w:line="240" w:lineRule="auto"/>
+              <w:jc w:val="center"/>
+            </w:pPr>
+            <w:r>
+              <w:rPr>
+                <w:rFonts w:ascii="Times New Roman" w:hAnsi="Times New Roman"/>
+                <w:sz w:val="17"/>
+              </w:rPr>
+              <w:t xml:space="preserve">United States; intraday data</w:t>
+            </w:r>
+          </w:p>
+        </w:tc>
+        <w:tc>
+          <w:tcPr>
+            <w:tcW w:type="dxa" w:w="2760"/>
+          </w:tcPr>
+          <w:p>
+            <w:pPr>
+              <w:pStyle w:val="Compact"/>
+              <w:keepNext/>
+              <w:spacing w:after="20" w:before="20" w:line="240" w:lineRule="auto"/>
+              <w:jc w:val="left"/>
+            </w:pPr>
+            <w:r>
+              <w:rPr>
+                <w:rFonts w:ascii="Times New Roman" w:hAnsi="Times New Roman"/>
+                <w:sz w:val="17"/>
+              </w:rPr>
+              <w:t xml:space="preserve">Positive overnight returns followed by intraday reversals, concentrated in high-attention stocks</w:t>
+            </w:r>
+          </w:p>
+        </w:tc>
+        <w:tc>
+          <w:tcPr>
+            <w:tcW w:type="dxa" w:w="2760"/>
+          </w:tcPr>
+          <w:p>
+            <w:pPr>
+              <w:pStyle w:val="Compact"/>
+              <w:keepNext/>
+              <w:spacing w:after="20" w:before="20" w:line="240" w:lineRule="auto"/>
+              <w:jc w:val="left"/>
+            </w:pPr>
+            <w:r>
+              <w:rPr>
+                <w:rFonts w:ascii="Times New Roman" w:hAnsi="Times New Roman"/>
+                <w:sz w:val="17"/>
+              </w:rPr>
+              <w:t xml:space="preserve">Same signs after limit closes; the gap here also rises with volume and prior return</w:t>
+            </w:r>
+          </w:p>
+        </w:tc>
+      </w:tr>
+      <w:tr>
+        <w:trPr>
+          <w:cantSplit/>
+        </w:trPr>
+        <w:tc>
+          <w:tcPr>
+            <w:tcW w:type="dxa" w:w="2145"/>
+          </w:tcPr>
+          <w:p>
+            <w:pPr>
+              <w:pStyle w:val="Compact"/>
+              <w:keepNext/>
+              <w:spacing w:after="20" w:before="20" w:line="240" w:lineRule="auto"/>
+              <w:jc w:val="left"/>
+            </w:pPr>
+            <w:r>
+              <w:rPr>
+                <w:rFonts w:ascii="Times New Roman" w:hAnsi="Times New Roman"/>
+                <w:sz w:val="17"/>
+              </w:rPr>
+              <w:t xml:space="preserve">Lou et al. (2019)</w:t>
+            </w:r>
+          </w:p>
+        </w:tc>
+        <w:tc>
+          <w:tcPr>
+            <w:tcW w:type="dxa" w:w="1402"/>
+          </w:tcPr>
+          <w:p>
+            <w:pPr>
+              <w:pStyle w:val="Compact"/>
+              <w:keepNext/>
+              <w:spacing w:after="20" w:before="20" w:line="240" w:lineRule="auto"/>
+              <w:jc w:val="center"/>
+            </w:pPr>
+            <w:r>
+              <w:rPr>
+                <w:rFonts w:ascii="Times New Roman" w:hAnsi="Times New Roman"/>
+                <w:sz w:val="17"/>
+              </w:rPr>
+              <w:t xml:space="preserve">United States; stock-level returns</w:t>
+            </w:r>
+          </w:p>
+        </w:tc>
+        <w:tc>
+          <w:tcPr>
+            <w:tcW w:type="dxa" w:w="2760"/>
+          </w:tcPr>
+          <w:p>
+            <w:pPr>
+              <w:pStyle w:val="Compact"/>
+              <w:keepNext/>
+              <w:spacing w:after="20" w:before="20" w:line="240" w:lineRule="auto"/>
+              <w:jc w:val="left"/>
+            </w:pPr>
+            <w:r>
+              <w:rPr>
+                <w:rFonts w:ascii="Times New Roman" w:hAnsi="Times New Roman"/>
+                <w:sz w:val="17"/>
+              </w:rPr>
+              <w:t xml:space="preserve">Overnight and intraday continuation with an offsetting cross-period reversal</w:t>
+            </w:r>
+          </w:p>
+        </w:tc>
+        <w:tc>
+          <w:tcPr>
+            <w:tcW w:type="dxa" w:w="2760"/>
+          </w:tcPr>
+          <w:p>
+            <w:pPr>
+              <w:pStyle w:val="Compact"/>
+              <w:keepNext/>
+              <w:spacing w:after="20" w:before="20" w:line="240" w:lineRule="auto"/>
+              <w:jc w:val="left"/>
+            </w:pPr>
+            <w:r>
+              <w:rPr>
+                <w:rFonts w:ascii="Times New Roman" w:hAnsi="Times New Roman"/>
+                <w:sz w:val="17"/>
+              </w:rPr>
+              <w:t xml:space="preserve">The gap-then-reversal has the sign of that cross-period reversal at a one-day horizon</w:t>
+            </w:r>
+          </w:p>
+        </w:tc>
+      </w:tr>
+      <w:tr>
+        <w:trPr>
+          <w:cantSplit/>
+        </w:trPr>
+        <w:tc>
+          <w:tcPr>
+            <w:tcW w:type="dxa" w:w="2145"/>
+          </w:tcPr>
+          <w:p>
+            <w:pPr>
+              <w:pStyle w:val="Compact"/>
+              <w:keepNext/>
+              <w:spacing w:after="20" w:before="20" w:line="240" w:lineRule="auto"/>
+              <w:jc w:val="left"/>
+            </w:pPr>
+            <w:r>
+              <w:rPr>
+                <w:rFonts w:ascii="Times New Roman" w:hAnsi="Times New Roman"/>
+                <w:sz w:val="17"/>
+              </w:rPr>
+              <w:t xml:space="preserve">Qiao and Dam (2020)</w:t>
+            </w:r>
+          </w:p>
+        </w:tc>
+        <w:tc>
+          <w:tcPr>
+            <w:tcW w:type="dxa" w:w="1402"/>
+          </w:tcPr>
+          <w:p>
+            <w:pPr>
+              <w:pStyle w:val="Compact"/>
+              <w:keepNext/>
+              <w:spacing w:after="20" w:before="20" w:line="240" w:lineRule="auto"/>
+              <w:jc w:val="center"/>
+            </w:pPr>
+            <w:r>
+              <w:rPr>
+                <w:rFonts w:ascii="Times New Roman" w:hAnsi="Times New Roman"/>
+                <w:sz w:val="17"/>
+              </w:rPr>
+              <w:t xml:space="preserve">China A-shares; all stocks</w:t>
+            </w:r>
+          </w:p>
+        </w:tc>
+        <w:tc>
+          <w:tcPr>
+            <w:tcW w:type="dxa" w:w="2760"/>
+          </w:tcPr>
+          <w:p>
+            <w:pPr>
+              <w:pStyle w:val="Compact"/>
+              <w:keepNext/>
+              <w:spacing w:after="20" w:before="20" w:line="240" w:lineRule="auto"/>
+              <w:jc w:val="left"/>
+            </w:pPr>
+            <w:r>
+              <w:rPr>
+                <w:rFonts w:ascii="Times New Roman" w:hAnsi="Times New Roman"/>
+                <w:sz w:val="17"/>
+              </w:rPr>
+              <w:t xml:space="preserve">Average overnight return is negative; T+1 rule lowers opening prices</w:t>
+            </w:r>
+          </w:p>
+        </w:tc>
+        <w:tc>
+          <w:tcPr>
+            <w:tcW w:type="dxa" w:w="2760"/>
+          </w:tcPr>
+          <w:p>
+            <w:pPr>
+              <w:pStyle w:val="Compact"/>
+              <w:keepNext/>
+              <w:spacing w:after="20" w:before="20" w:line="240" w:lineRule="auto"/>
+              <w:jc w:val="left"/>
+            </w:pPr>
+            <w:r>
+              <w:rPr>
+                <w:rFonts w:ascii="Times New Roman" w:hAnsi="Times New Roman"/>
+                <w:sz w:val="17"/>
+              </w:rPr>
+              <w:t xml:space="preserve">Opposite sign: the overnight return after a ceiling close is positive</w:t>
+            </w:r>
+          </w:p>
+        </w:tc>
+      </w:tr>
+      <w:tr>
+        <w:trPr>
+          <w:cantSplit/>
+        </w:trPr>
+        <w:tc>
+          <w:tcPr>
+            <w:tcW w:type="dxa" w:w="2145"/>
+            <w:tcBorders>
+              <w:bottom w:val="single" w:sz="8" w:color="000000" w:space="0"/>
+            </w:tcBorders>
+          </w:tcPr>
+          <w:p>
+            <w:pPr>
+              <w:pStyle w:val="Compact"/>
+              <w:spacing w:after="20" w:before="20" w:line="240" w:lineRule="auto"/>
+              <w:jc w:val="left"/>
+            </w:pPr>
+            <w:r>
+              <w:rPr>
+                <w:rFonts w:ascii="Times New Roman" w:hAnsi="Times New Roman"/>
+                <w:sz w:val="17"/>
+              </w:rPr>
+              <w:t xml:space="preserve">Hou et al. (2020); Harvey et al. (2016)</w:t>
+            </w:r>
+          </w:p>
+        </w:tc>
+        <w:tc>
+          <w:tcPr>
+            <w:tcW w:type="dxa" w:w="1402"/>
+            <w:tcBorders>
+              <w:bottom w:val="single" w:sz="8" w:color="000000" w:space="0"/>
+            </w:tcBorders>
+          </w:tcPr>
+          <w:p>
+            <w:pPr>
+              <w:pStyle w:val="Compact"/>
+              <w:spacing w:after="20" w:before="20" w:line="240" w:lineRule="auto"/>
+              <w:jc w:val="center"/>
+            </w:pPr>
+            <w:r>
+              <w:rPr>
+                <w:rFonts w:ascii="Times New Roman" w:hAnsi="Times New Roman"/>
+                <w:sz w:val="17"/>
+              </w:rPr>
+              <w:t xml:space="preserve">United States; published anomalies</w:t>
+            </w:r>
+          </w:p>
+        </w:tc>
+        <w:tc>
+          <w:tcPr>
+            <w:tcW w:type="dxa" w:w="2760"/>
+            <w:tcBorders>
+              <w:bottom w:val="single" w:sz="8" w:color="000000" w:space="0"/>
+            </w:tcBorders>
+          </w:tcPr>
+          <w:p>
+            <w:pPr>
+              <w:pStyle w:val="Compact"/>
+              <w:spacing w:after="20" w:before="20" w:line="240" w:lineRule="auto"/>
+              <w:jc w:val="left"/>
+            </w:pPr>
+            <w:r>
+              <w:rPr>
+                <w:rFonts w:ascii="Times New Roman" w:hAnsi="Times New Roman"/>
+                <w:sz w:val="17"/>
+              </w:rPr>
+              <w:t xml:space="preserve">With microcaps mitigated, 65% of 452 anomalies fail the 1.96 hurdle; a new factor needs</w:t>
+            </w:r>
+            <w:r>
+              <w:rPr>
+                <w:rFonts w:ascii="Times New Roman" w:hAnsi="Times New Roman"/>
+                <w:sz w:val="17"/>
+              </w:rPr>
+              <w:t xml:space="preserve"> </w:t>
+            </w:r>
+            <w:r>
+              <w:rPr>
+                <w:iCs/>
+                <w:rFonts w:ascii="Times New Roman" w:hAnsi="Times New Roman"/>
+                <w:i/>
+                <w:sz w:val="17"/>
+              </w:rPr>
+              <w:t xml:space="preserve">t</w:t>
+            </w:r>
+            <w:r>
+              <w:rPr>
+                <w:rFonts w:ascii="Times New Roman" w:hAnsi="Times New Roman"/>
+                <w:sz w:val="17"/>
+              </w:rPr>
+              <w:t xml:space="preserve"> </w:t>
+            </w:r>
+            <w:r>
+              <w:rPr>
+                <w:rFonts w:ascii="Times New Roman" w:hAnsi="Times New Roman"/>
+                <w:sz w:val="17"/>
+              </w:rPr>
+              <w:t xml:space="preserve">above 3.0</w:t>
+            </w:r>
+          </w:p>
+        </w:tc>
+        <w:tc>
+          <w:tcPr>
+            <w:tcW w:type="dxa" w:w="2760"/>
+            <w:tcBorders>
+              <w:bottom w:val="single" w:sz="8" w:color="000000" w:space="0"/>
+            </w:tcBorders>
+          </w:tcPr>
+          <w:p>
+            <w:pPr>
+              <w:pStyle w:val="Compact"/>
+              <w:spacing w:after="20" w:before="20" w:line="240" w:lineRule="auto"/>
+              <w:jc w:val="left"/>
+            </w:pPr>
+            <w:r>
+              <w:rPr>
+                <w:rFonts w:ascii="Times New Roman" w:hAnsi="Times New Roman"/>
+                <w:sz w:val="17"/>
+              </w:rPr>
+              <w:t xml:space="preserve">None of our 22 characteristics reaches 1.96</w:t>
+            </w:r>
+          </w:p>
+        </w:tc>
+      </w:tr>
+    </w:tbl>
+    <w:p>
+      <w:pPr>
+        <w:pStyle w:val="BodyText"/>
+        <w:spacing w:before="160"/>
+      </w:pPr>
+      <w:r>
+        <w:t xml:space="preserve">The findings bear on two design choices, the width of the band and the priority of auction orders. A 7% band leaves room for a large overnight gap, so the opening auction may do much of the adjustment that a wider band would allow on day</w:t>
       </w:r>
       <w:r>
         <w:t xml:space="preserve"> </w:t>
@@ -7954,7 +9389,7 @@
         <w:t xml:space="preserve">d</w:t>
       </w:r>
       <w:r>
-        <w:t xml:space="preserve">. The floor gap grows and the intraday return after floor closes turns positive after ATO orders lose priority (Table 4), which suggests that auction design shapes how overnight pressure resolves. The split cannot identify the rule change, because the market period changed with it. The widening of the ChiNext band studied by Qi (2023) shows how a band change can serve as a natural experiment, and a similar change on HOSE would test the readings directly.</w:t>
+        <w:t xml:space="preserve">. The floor gap grows and the intraday return after floor closes turns positive after at-the-open orders lose priority (Table 4), which suggests that auction design shapes how overnight pressure resolves. The split cannot identify the rule change, because the market period changed with it. The widening of the ChiNext band studied by Qi (2023) shows how a band change can serve as a natural experiment, and a similar change on HOSE would test the readings directly.</w:t>
       </w:r>
     </w:p>
     <w:p>
@@ -7962,7 +9397,7 @@
         <w:pStyle w:val="BodyText"/>
       </w:pPr>
       <w:r>
-        <w:t xml:space="preserve">The volume and prior-return results point to an attention channel. If attention drives the gap, the limit acts as an amplifier: a stock at its ceiling appears on screens and rankings the next morning, and a queue at the limit signals excess demand to every investor. Berkman et al. (2012) trace the overnight returns of U.S. stocks to such attention, and Lou et al. (2019) trace the split between overnight and intraday returns to heterogeneous traders. A limit then adds a visible, rule-based trigger to a mechanism that already exists without limits. Under this reading the limit does not delay information so much as create the attention event.</w:t>
+        <w:t xml:space="preserve">The volume and prior-return results fit an attention channel. If attention drives the gap, the limit acts as an amplifier: a stock at its ceiling may appear on screens and rankings the next morning, and a queue at the limit may signal excess demand to every investor. Berkman et al. (2012) trace the overnight returns of U.S. stocks to such attention, and Akbas et al. (2022) and Lu et al. (2023) trace the split between overnight and intraday returns to different clienteles, with noise traders overnight, arbitrageurs by day, and market makers absorbing retail imbalances near the open. A limit then adds a visible, rule-based trigger to a mechanism that already exists without limits. Under this reading the limit creates the attention event.</w:t>
       </w:r>
     </w:p>
     <w:p>
@@ -7970,7 +9405,7 @@
         <w:pStyle w:val="BodyText"/>
       </w:pPr>
       <w:r>
-        <w:t xml:space="preserve">We use the 22 characteristics to set the multiplicity burden and as a null benchmark: the procedure that lets the limit tests survive leaves no characteristic significant. The null says little about the cross-section because power is low (Section 4). Limit hits are rare: about 2.0% of stock-days in the event window close at the ceiling, and we do not claim that limit hits explain the cross-section of returns.</w:t>
+        <w:t xml:space="preserve">We use the 22 characteristics to set the multiplicity burden and as a null benchmark: the procedure that lets the limit tests survive leaves no characteristic significant. The null says little about the cross-section because power is low (Section 5). Limit hits are rare: about 2.0% of stock-days in the event window meet the ceiling definition, and we do not claim that limit hits explain the cross-section of returns.</w:t>
       </w:r>
     </w:p>
     <w:p>
@@ -7981,14 +9416,14 @@
         <w:t xml:space="preserve">The estimates describe what follows limit closes on HOSE in 2024 to 2026: the next opening carries about two percentage points after ceiling closes and about one after floor closes. They cannot show what the limit does to price discovery: the band does not vary, no period lacks a limit, and we measure none of the benefits a limit is meant to deliver. Announcement time stamps, order-book queue sizes at the close, and a market or period without a limit would test the readings. For investors, the figures suggest that buying limit-up stocks at the quoted open returned −0.75% by the fifth close. The figures omit costs and rationing at the open, so they offer no trading advice.</w:t>
       </w:r>
     </w:p>
-    <w:bookmarkEnd w:id="30"/>
-    <w:bookmarkStart w:id="31" w:name="limitations"/>
+    <w:bookmarkEnd w:id="31"/>
+    <w:bookmarkStart w:id="32" w:name="limitations"/>
     <w:p>
       <w:pPr>
         <w:pStyle w:val="Heading1"/>
       </w:pPr>
       <w:r>
-        <w:t xml:space="preserve">6. Limitations</w:t>
+        <w:t xml:space="preserve">7. Limitations</w:t>
       </w:r>
     </w:p>
     <w:p>
@@ -8000,17 +9435,17 @@
         <w:pStyle w:val="Compact"/>
       </w:pPr>
       <w:r>
-        <w:t xml:space="preserve">The sample covers about 25 months on one exchange, with one trading-platform change and a period of market stress. (ii) We have no order-book, investor-type, announcement or news data, so the unfilled-demand mechanism is inferred and selection on news is not separated from it. (iii) The 7% band, the reference price and the platform change come from brokerage and press descriptions and we check only against the return distribution, with no exchange circulars. Tick sizes, reference-price treatment on corporate-action days, and wider bands for first-day listings and resumed trading are assumptions. (iv) Prices may be adjusted for corporate actions in ways that affect event classification, and the listing snapshot excludes earlier delistings. (v) Clustered standard errors allow dependence across dates, weeks, blocks, and stocks, but events in the same market episode may depend on each other more, and we did not compute calendar-time portfolio or Driscoll–Kraay estimates. (vi) Several characteristics (5-day return, MAX, MIN, move frequency, overnight return) share inputs with the event definition, and the Corwin–Schultz spread and range volatility use high and low prices that limits censor. (vii) The floor effect depends on the benchmark, and we built no beta- and size-matched control for the five-day outcome. (viii) The characteristic tests have limited power, and the effect sizes carry winner’s-curse bias because the authors chose the idea among several.</w:t>
+        <w:t xml:space="preserve">The sample covers about 25 months on one exchange, with one trading-platform change and a period of market stress. (ii) We have no order-book, investor-type, announcement or news data, so the unfilled-demand mechanism is inferred and selection on news is not separated from it. (iii) The 7% band, the reference price and the platform change come from brokerage and press descriptions and we check only against the return distribution, with no exchange circulars. Tick sizes, reference-price treatment on corporate-action days, and wider bands for first-day listings and resumed trading are assumptions. (iv) Prices may be adjusted for corporate actions in ways that affect event classification, and the listing snapshot excludes earlier delistings. (v) Clustered standard errors allow dependence across dates, weeks, blocks, and stocks, but events in the same market episode may depend on each other more, and we did not compute calendar-time portfolio or Driscoll–Kraay estimates. (vi) Several characteristics (5-day return, MAX, MIN, move frequency, overnight return) share inputs with the event definition, and the Corwin–Schultz spread and range volatility use high and low prices that limits censor. (vii) The floor effect depends on the benchmark, and we built no beta- and size-matched control for the five-day outcome. (viii) The characteristic tests have limited power, and the effect sizes carry winner’s-curse bias because we chose the idea among several.</w:t>
       </w:r>
     </w:p>
-    <w:bookmarkEnd w:id="31"/>
-    <w:bookmarkStart w:id="32" w:name="conclusion"/>
+    <w:bookmarkEnd w:id="32"/>
+    <w:bookmarkStart w:id="33" w:name="conclusion"/>
     <w:p>
       <w:pPr>
         <w:pStyle w:val="Heading1"/>
       </w:pPr>
       <w:r>
-        <w:t xml:space="preserve">7. Conclusion</w:t>
+        <w:t xml:space="preserve">8. Conclusion</w:t>
       </w:r>
     </w:p>
     <w:p>
@@ -8018,11 +9453,11 @@
         <w:pStyle w:val="FirstParagraph"/>
       </w:pPr>
       <w:r>
-        <w:t xml:space="preserve">Of 26 tests on 347 HOSE stocks, the four price-limit tests survive FDR control and a confirmation half, and the 22 characteristic tests do not, although the latter have limited power. A ceiling close is followed by a next-day abnormal return of about 1.7%, which is an overnight gap of 2.2% less an intraday reversal of 0.5%. The gap is 2.7 percentage points larger than for stocks that rose 5% to 6.5% and 3.1 points larger than for those that also closed at their high. The pattern is consistent with delayed price discovery at the limit, but news and attention remain possible. An outside buyer at the next open earns −0.75% by the fifth close. Longer samples, announcement data and order-book data would let future work separate the readings.</w:t>
+        <w:t xml:space="preserve">Of 26 tests on 347 HOSE stocks, the four price-limit tests survive FDR control and a confirmation half, and the 22 characteristic tests do not, although the latter have limited power. A ceiling close is followed by a next-day abnormal return of about 1.7%, which is an overnight gap of 2.2% less an intraday reversal of 0.5%. The gap is 2.7 percentage points larger than for stocks that rose 5% to 6.5% and 3.1 points larger than for those that also closed at their high. The pattern is consistent with delayed price discovery at the limit, but news and attention remain possible. An outside buyer at the next open loses 0.75% by the fifth close against the market. Longer samples, announcement data and order-book data would let future work separate the readings.</w:t>
       </w:r>
     </w:p>
-    <w:bookmarkEnd w:id="32"/>
-    <w:bookmarkStart w:id="33" w:name="declarations"/>
+    <w:bookmarkEnd w:id="33"/>
+    <w:bookmarkStart w:id="34" w:name="declarations"/>
     <w:p>
       <w:pPr>
         <w:pStyle w:val="Heading1"/>
@@ -8046,7 +9481,7 @@
         <w:t xml:space="preserve"> </w:t>
       </w:r>
       <w:r>
-        <w:t xml:space="preserve">The authors used Claude (Anthropic) to write analysis code, draft text and check numbers against output files. The authors are responsible for all content. We checked the references and the institutional facts in Section 2 by web search and did not consult primary documents.</w:t>
+        <w:t xml:space="preserve">The authors used Claude (Anthropic) to write analysis code, draft text and check numbers against output files. The authors are responsible for all content. We checked the references and the institutional facts in Section 3 by web search and did not consult primary documents.</w:t>
       </w:r>
     </w:p>
     <w:p>
@@ -8097,10 +9532,10 @@
         <w:rPr>
           <w:rStyle w:val="VerbatimChar"/>
         </w:rPr>
-        <w:t xml:space="preserve">49</w:t>
-      </w:r>
-      <w:r>
-        <w:t xml:space="preserve">, tables in</w:t>
+        <w:t xml:space="preserve">50</w:t>
+      </w:r>
+      <w:r>
+        <w:t xml:space="preserve">, tables C1 to C26 in</w:t>
       </w:r>
       <w:r>
         <w:t xml:space="preserve"> </w:t>
@@ -8112,7 +9547,7 @@
         <w:t xml:space="preserve">paper2/output/tables</w:t>
       </w:r>
       <w:r>
-        <w:t xml:space="preserve">). The data come from the vnstock library; we did not record the library version or retrieval dates.</w:t>
+        <w:t xml:space="preserve">). The data come from the vnstock library (version 4.0.4, source VCI), retrieved on 24 September 2026.</w:t>
       </w:r>
     </w:p>
     <w:p>
@@ -8133,8 +9568,8 @@
         <w:t xml:space="preserve">[To be completed by the authors.]</w:t>
       </w:r>
     </w:p>
-    <w:bookmarkEnd w:id="33"/>
-    <w:bookmarkStart w:id="55" w:name="references"/>
+    <w:bookmarkEnd w:id="34"/>
+    <w:bookmarkStart w:id="64" w:name="references"/>
     <w:p>
       <w:pPr>
         <w:pStyle w:val="Heading1"/>
@@ -8148,6 +9583,59 @@
         <w:pStyle w:val="FirstParagraph"/>
       </w:pPr>
       <w:r>
+        <w:t xml:space="preserve">Aboody, D., Even-Tov, O., Lehavy, R., &amp; Trueman, B. (2018). Overnight returns and firm-specific investor sentiment.</w:t>
+      </w:r>
+      <w:r>
+        <w:t xml:space="preserve"> </w:t>
+      </w:r>
+      <w:r>
+        <w:rPr>
+          <w:iCs/>
+          <w:i/>
+        </w:rPr>
+        <w:t xml:space="preserve">Journal of Financial and Quantitative Analysis, 53</w:t>
+      </w:r>
+      <w:r>
+        <w:t xml:space="preserve">(2), 485–505.</w:t>
+      </w:r>
+    </w:p>
+    <w:p>
+      <w:pPr>
+        <w:pStyle w:val="BodyText"/>
+      </w:pPr>
+      <w:r>
+        <w:t xml:space="preserve">Akbas, F., Boehmer, E., Jiang, C., &amp; Koch, P. D. (2022). Overnight returns, daytime reversals, and future stock returns.</w:t>
+      </w:r>
+      <w:r>
+        <w:t xml:space="preserve"> </w:t>
+      </w:r>
+      <w:r>
+        <w:rPr>
+          <w:iCs/>
+          <w:i/>
+        </w:rPr>
+        <w:t xml:space="preserve">Journal of Financial Economics, 145</w:t>
+      </w:r>
+      <w:r>
+        <w:t xml:space="preserve">(3), 850–875.</w:t>
+      </w:r>
+      <w:r>
+        <w:t xml:space="preserve"> </w:t>
+      </w:r>
+      <w:hyperlink r:id="rId35">
+        <w:r>
+          <w:rPr>
+            <w:rStyle w:val="Hyperlink"/>
+          </w:rPr>
+          <w:t xml:space="preserve">https://doi.org/10.1016/j.jfineco.2021.09.019</w:t>
+        </w:r>
+      </w:hyperlink>
+    </w:p>
+    <w:p>
+      <w:pPr>
+        <w:pStyle w:val="BodyText"/>
+      </w:pPr>
+      <w:r>
         <w:t xml:space="preserve">Amihud, Y. (2002). Illiquidity and stock returns: Cross-section and time-series effects.</w:t>
       </w:r>
       <w:r>
@@ -8166,7 +9654,7 @@
       <w:r>
         <w:t xml:space="preserve"> </w:t>
       </w:r>
-      <w:hyperlink r:id="rId34">
+      <w:hyperlink r:id="rId36">
         <w:r>
           <w:rPr>
             <w:rStyle w:val="Hyperlink"/>
@@ -8198,7 +9686,7 @@
       <w:r>
         <w:t xml:space="preserve"> </w:t>
       </w:r>
-      <w:hyperlink r:id="rId35">
+      <w:hyperlink r:id="rId37">
         <w:r>
           <w:rPr>
             <w:rStyle w:val="Hyperlink"/>
@@ -8230,7 +9718,7 @@
       <w:r>
         <w:t xml:space="preserve"> </w:t>
       </w:r>
-      <w:hyperlink r:id="rId36">
+      <w:hyperlink r:id="rId38">
         <w:r>
           <w:rPr>
             <w:rStyle w:val="Hyperlink"/>
@@ -8262,7 +9750,7 @@
       <w:r>
         <w:t xml:space="preserve"> </w:t>
       </w:r>
-      <w:hyperlink r:id="rId37">
+      <w:hyperlink r:id="rId39">
         <w:r>
           <w:rPr>
             <w:rStyle w:val="Hyperlink"/>
@@ -8294,7 +9782,7 @@
       <w:r>
         <w:t xml:space="preserve"> </w:t>
       </w:r>
-      <w:hyperlink r:id="rId38">
+      <w:hyperlink r:id="rId40">
         <w:r>
           <w:rPr>
             <w:rStyle w:val="Hyperlink"/>
@@ -8326,7 +9814,7 @@
       <w:r>
         <w:t xml:space="preserve"> </w:t>
       </w:r>
-      <w:hyperlink r:id="rId39">
+      <w:hyperlink r:id="rId41">
         <w:r>
           <w:rPr>
             <w:rStyle w:val="Hyperlink"/>
@@ -8340,6 +9828,27 @@
         <w:pStyle w:val="BodyText"/>
       </w:pPr>
       <w:r>
+        <w:t xml:space="preserve">Bogousslavsky, V. (2021). The cross-section of intraday and overnight returns.</w:t>
+      </w:r>
+      <w:r>
+        <w:t xml:space="preserve"> </w:t>
+      </w:r>
+      <w:r>
+        <w:rPr>
+          <w:iCs/>
+          <w:i/>
+        </w:rPr>
+        <w:t xml:space="preserve">Journal of Financial Economics, 141</w:t>
+      </w:r>
+      <w:r>
+        <w:t xml:space="preserve">(1), 172–194.</w:t>
+      </w:r>
+    </w:p>
+    <w:p>
+      <w:pPr>
+        <w:pStyle w:val="BodyText"/>
+      </w:pPr>
+      <w:r>
         <w:t xml:space="preserve">Brennan, M. J. (1986). A theory of price limits in futures markets.</w:t>
       </w:r>
       <w:r>
@@ -8358,7 +9867,7 @@
       <w:r>
         <w:t xml:space="preserve"> </w:t>
       </w:r>
-      <w:hyperlink r:id="rId40">
+      <w:hyperlink r:id="rId42">
         <w:r>
           <w:rPr>
             <w:rStyle w:val="Hyperlink"/>
@@ -8372,6 +9881,70 @@
         <w:pStyle w:val="BodyText"/>
       </w:pPr>
       <w:r>
+        <w:t xml:space="preserve">Chen, H., Petukhov, A., Wang, J., &amp; Xing, H. (2024). The dark side of circuit breakers.</w:t>
+      </w:r>
+      <w:r>
+        <w:t xml:space="preserve"> </w:t>
+      </w:r>
+      <w:r>
+        <w:rPr>
+          <w:iCs/>
+          <w:i/>
+        </w:rPr>
+        <w:t xml:space="preserve">The Journal of Finance, 79</w:t>
+      </w:r>
+      <w:r>
+        <w:t xml:space="preserve">(2), 1405–1455.</w:t>
+      </w:r>
+      <w:r>
+        <w:t xml:space="preserve"> </w:t>
+      </w:r>
+      <w:hyperlink r:id="rId43">
+        <w:r>
+          <w:rPr>
+            <w:rStyle w:val="Hyperlink"/>
+          </w:rPr>
+          <w:t xml:space="preserve">https://doi.org/10.1111/jofi.13310</w:t>
+        </w:r>
+      </w:hyperlink>
+    </w:p>
+    <w:p>
+      <w:pPr>
+        <w:pStyle w:val="BodyText"/>
+      </w:pPr>
+      <w:r>
+        <w:t xml:space="preserve">Chen, T., Gao, Z., He, J., Jiang, W., &amp; Xiong, W. (2019). Daily price limits and destructive market behavior.</w:t>
+      </w:r>
+      <w:r>
+        <w:t xml:space="preserve"> </w:t>
+      </w:r>
+      <w:r>
+        <w:rPr>
+          <w:iCs/>
+          <w:i/>
+        </w:rPr>
+        <w:t xml:space="preserve">Journal of Econometrics, 208</w:t>
+      </w:r>
+      <w:r>
+        <w:t xml:space="preserve">(1), 249–264.</w:t>
+      </w:r>
+      <w:r>
+        <w:t xml:space="preserve"> </w:t>
+      </w:r>
+      <w:hyperlink r:id="rId44">
+        <w:r>
+          <w:rPr>
+            <w:rStyle w:val="Hyperlink"/>
+          </w:rPr>
+          <w:t xml:space="preserve">https://doi.org/10.1016/j.jeconom.2018.09.014</w:t>
+        </w:r>
+      </w:hyperlink>
+    </w:p>
+    <w:p>
+      <w:pPr>
+        <w:pStyle w:val="BodyText"/>
+      </w:pPr>
+      <w:r>
         <w:t xml:space="preserve">Chen, Y.-M. (1993). Price limits and stock market volatility in Taiwan.</w:t>
       </w:r>
       <w:r>
@@ -8390,7 +9963,7 @@
       <w:r>
         <w:t xml:space="preserve"> </w:t>
       </w:r>
-      <w:hyperlink r:id="rId41">
+      <w:hyperlink r:id="rId45">
         <w:r>
           <w:rPr>
             <w:rStyle w:val="Hyperlink"/>
@@ -8422,7 +9995,7 @@
       <w:r>
         <w:t xml:space="preserve"> </w:t>
       </w:r>
-      <w:hyperlink r:id="rId42">
+      <w:hyperlink r:id="rId46">
         <w:r>
           <w:rPr>
             <w:rStyle w:val="Hyperlink"/>
@@ -8436,6 +10009,27 @@
         <w:pStyle w:val="BodyText"/>
       </w:pPr>
       <w:r>
+        <w:t xml:space="preserve">Chordia, T., Goyal, A., &amp; Saretto, A. (2020). Anomalies and false rejections.</w:t>
+      </w:r>
+      <w:r>
+        <w:t xml:space="preserve"> </w:t>
+      </w:r>
+      <w:r>
+        <w:rPr>
+          <w:iCs/>
+          <w:i/>
+        </w:rPr>
+        <w:t xml:space="preserve">The Review of Financial Studies, 33</w:t>
+      </w:r>
+      <w:r>
+        <w:t xml:space="preserve">(5), 2134–2179.</w:t>
+      </w:r>
+    </w:p>
+    <w:p>
+      <w:pPr>
+        <w:pStyle w:val="BodyText"/>
+      </w:pPr>
+      <w:r>
         <w:t xml:space="preserve">Corwin, S. A., &amp; Schultz, P. (2012). A simple way to estimate bid-ask spreads from daily high and low prices.</w:t>
       </w:r>
       <w:r>
@@ -8454,7 +10048,7 @@
       <w:r>
         <w:t xml:space="preserve"> </w:t>
       </w:r>
-      <w:hyperlink r:id="rId43">
+      <w:hyperlink r:id="rId47">
         <w:r>
           <w:rPr>
             <w:rStyle w:val="Hyperlink"/>
@@ -8468,6 +10062,27 @@
         <w:pStyle w:val="BodyText"/>
       </w:pPr>
       <w:r>
+        <w:t xml:space="preserve">Deb, S. S., Kalev, P. S., &amp; Marisetty, V. B. (2013). Flexible price limits: The case of Tokyo Stock Exchange.</w:t>
+      </w:r>
+      <w:r>
+        <w:t xml:space="preserve"> </w:t>
+      </w:r>
+      <w:r>
+        <w:rPr>
+          <w:iCs/>
+          <w:i/>
+        </w:rPr>
+        <w:t xml:space="preserve">Journal of International Financial Markets, Institutions and Money, 24</w:t>
+      </w:r>
+      <w:r>
+        <w:t xml:space="preserve">, 66–84.</w:t>
+      </w:r>
+    </w:p>
+    <w:p>
+      <w:pPr>
+        <w:pStyle w:val="BodyText"/>
+      </w:pPr>
+      <w:r>
         <w:t xml:space="preserve">Fama, E. F., &amp; MacBeth, J. D. (1973). Risk, return, and equilibrium: Empirical tests.</w:t>
       </w:r>
       <w:r>
@@ -8486,7 +10101,7 @@
       <w:r>
         <w:t xml:space="preserve"> </w:t>
       </w:r>
-      <w:hyperlink r:id="rId44">
+      <w:hyperlink r:id="rId48">
         <w:r>
           <w:rPr>
             <w:rStyle w:val="Hyperlink"/>
@@ -8500,6 +10115,91 @@
         <w:pStyle w:val="BodyText"/>
       </w:pPr>
       <w:r>
+        <w:t xml:space="preserve">Greenwald, B. C., &amp; Stein, J. C. (1991). Transactional risk, market crashes, and the role of circuit breakers.</w:t>
+      </w:r>
+      <w:r>
+        <w:t xml:space="preserve"> </w:t>
+      </w:r>
+      <w:r>
+        <w:rPr>
+          <w:iCs/>
+          <w:i/>
+        </w:rPr>
+        <w:t xml:space="preserve">Journal of Business, 64</w:t>
+      </w:r>
+      <w:r>
+        <w:t xml:space="preserve">(4), 443–462.</w:t>
+      </w:r>
+    </w:p>
+    <w:p>
+      <w:pPr>
+        <w:pStyle w:val="BodyText"/>
+      </w:pPr>
+      <w:r>
+        <w:t xml:space="preserve">Gutierrez, R. C., Jr., &amp; Kelley, E. K. (2008). The long-lasting momentum in weekly returns.</w:t>
+      </w:r>
+      <w:r>
+        <w:t xml:space="preserve"> </w:t>
+      </w:r>
+      <w:r>
+        <w:rPr>
+          <w:iCs/>
+          <w:i/>
+        </w:rPr>
+        <w:t xml:space="preserve">The Journal of Finance, 63</w:t>
+      </w:r>
+      <w:r>
+        <w:t xml:space="preserve">(1), 415–447.</w:t>
+      </w:r>
+      <w:r>
+        <w:t xml:space="preserve"> </w:t>
+      </w:r>
+      <w:hyperlink r:id="rId49">
+        <w:r>
+          <w:rPr>
+            <w:rStyle w:val="Hyperlink"/>
+          </w:rPr>
+          <w:t xml:space="preserve">https://doi.org/10.1111/j.1540-6261.2008.01320.x</w:t>
+        </w:r>
+      </w:hyperlink>
+    </w:p>
+    <w:p>
+      <w:pPr>
+        <w:pStyle w:val="BodyText"/>
+      </w:pPr>
+      <w:r>
+        <w:t xml:space="preserve">Harvey, C. R., &amp; Liu, Y. (2020). False (and missed) discoveries in financial economics.</w:t>
+      </w:r>
+      <w:r>
+        <w:t xml:space="preserve"> </w:t>
+      </w:r>
+      <w:r>
+        <w:rPr>
+          <w:iCs/>
+          <w:i/>
+        </w:rPr>
+        <w:t xml:space="preserve">The Journal of Finance, 75</w:t>
+      </w:r>
+      <w:r>
+        <w:t xml:space="preserve">(5), 2503–2553.</w:t>
+      </w:r>
+      <w:r>
+        <w:t xml:space="preserve"> </w:t>
+      </w:r>
+      <w:hyperlink r:id="rId50">
+        <w:r>
+          <w:rPr>
+            <w:rStyle w:val="Hyperlink"/>
+          </w:rPr>
+          <w:t xml:space="preserve">https://doi.org/10.1111/jofi.12951</w:t>
+        </w:r>
+      </w:hyperlink>
+    </w:p>
+    <w:p>
+      <w:pPr>
+        <w:pStyle w:val="BodyText"/>
+      </w:pPr>
+      <w:r>
         <w:t xml:space="preserve">Harvey, C. R., Liu, Y., &amp; Zhu, H. (2016). …and the cross-section of expected returns.</w:t>
       </w:r>
       <w:r>
@@ -8518,7 +10218,7 @@
       <w:r>
         <w:t xml:space="preserve"> </w:t>
       </w:r>
-      <w:hyperlink r:id="rId45">
+      <w:hyperlink r:id="rId51">
         <w:r>
           <w:rPr>
             <w:rStyle w:val="Hyperlink"/>
@@ -8553,6 +10253,27 @@
         <w:pStyle w:val="BodyText"/>
       </w:pPr>
       <w:r>
+        <w:t xml:space="preserve">Hou, K., Xue, C., &amp; Zhang, L. (2020). Replicating anomalies.</w:t>
+      </w:r>
+      <w:r>
+        <w:t xml:space="preserve"> </w:t>
+      </w:r>
+      <w:r>
+        <w:rPr>
+          <w:iCs/>
+          <w:i/>
+        </w:rPr>
+        <w:t xml:space="preserve">The Review of Financial Studies, 33</w:t>
+      </w:r>
+      <w:r>
+        <w:t xml:space="preserve">(5), 2019–2133.</w:t>
+      </w:r>
+    </w:p>
+    <w:p>
+      <w:pPr>
+        <w:pStyle w:val="BodyText"/>
+      </w:pPr>
+      <w:r>
         <w:t xml:space="preserve">HSC. (2025).</w:t>
       </w:r>
       <w:r>
@@ -8574,7 +10295,7 @@
       <w:r>
         <w:t xml:space="preserve"> </w:t>
       </w:r>
-      <w:hyperlink r:id="rId46">
+      <w:hyperlink r:id="rId52">
         <w:r>
           <w:rPr>
             <w:rStyle w:val="Hyperlink"/>
@@ -8588,6 +10309,154 @@
         <w:pStyle w:val="BodyText"/>
       </w:pPr>
       <w:r>
+        <w:t xml:space="preserve">Huang, X., Liu, C., &amp; Shu, T. (2023). Factors and anomalies in the Vietnamese stock market.</w:t>
+      </w:r>
+      <w:r>
+        <w:t xml:space="preserve"> </w:t>
+      </w:r>
+      <w:r>
+        <w:rPr>
+          <w:iCs/>
+          <w:i/>
+        </w:rPr>
+        <w:t xml:space="preserve">Pacific-Basin Finance Journal, 82</w:t>
+      </w:r>
+      <w:r>
+        <w:t xml:space="preserve">.</w:t>
+      </w:r>
+    </w:p>
+    <w:p>
+      <w:pPr>
+        <w:pStyle w:val="BodyText"/>
+      </w:pPr>
+      <w:r>
+        <w:t xml:space="preserve">Huang, Y.-S., Fu, T.-W., &amp; Ke, M.-C. (2001). Daily price limits and stock price behavior: Evidence from the Taiwan Stock Exchange.</w:t>
+      </w:r>
+      <w:r>
+        <w:t xml:space="preserve"> </w:t>
+      </w:r>
+      <w:r>
+        <w:rPr>
+          <w:iCs/>
+          <w:i/>
+        </w:rPr>
+        <w:t xml:space="preserve">International Review of Economics &amp; Finance, 10</w:t>
+      </w:r>
+      <w:r>
+        <w:t xml:space="preserve">(3), 263–288.</w:t>
+      </w:r>
+    </w:p>
+    <w:p>
+      <w:pPr>
+        <w:pStyle w:val="BodyText"/>
+      </w:pPr>
+      <w:r>
+        <w:t xml:space="preserve">Jia, S., An, Y., Yang, L., &amp; Zhou, F. (2024). Price limit relaxation and stock price crash risk: Evidence from China.</w:t>
+      </w:r>
+      <w:r>
+        <w:t xml:space="preserve"> </w:t>
+      </w:r>
+      <w:r>
+        <w:rPr>
+          <w:iCs/>
+          <w:i/>
+        </w:rPr>
+        <w:t xml:space="preserve">Finance Research Letters, 59</w:t>
+      </w:r>
+      <w:r>
+        <w:t xml:space="preserve">, 104715.</w:t>
+      </w:r>
+      <w:r>
+        <w:t xml:space="preserve"> </w:t>
+      </w:r>
+      <w:hyperlink r:id="rId53">
+        <w:r>
+          <w:rPr>
+            <w:rStyle w:val="Hyperlink"/>
+          </w:rPr>
+          <w:t xml:space="preserve">https://doi.org/10.1016/j.frl.2023.104715</w:t>
+        </w:r>
+      </w:hyperlink>
+    </w:p>
+    <w:p>
+      <w:pPr>
+        <w:pStyle w:val="BodyText"/>
+      </w:pPr>
+      <w:r>
+        <w:t xml:space="preserve">Jones, C. M., Shi, D., Zhang, X., &amp; Zhang, X. (2025). Retail trading and return predictability in China.</w:t>
+      </w:r>
+      <w:r>
+        <w:t xml:space="preserve"> </w:t>
+      </w:r>
+      <w:r>
+        <w:rPr>
+          <w:iCs/>
+          <w:i/>
+        </w:rPr>
+        <w:t xml:space="preserve">Journal of Financial and Quantitative Analysis, 60</w:t>
+      </w:r>
+      <w:r>
+        <w:t xml:space="preserve">(1), 68–104.</w:t>
+      </w:r>
+    </w:p>
+    <w:p>
+      <w:pPr>
+        <w:pStyle w:val="BodyText"/>
+      </w:pPr>
+      <w:r>
+        <w:t xml:space="preserve">Kelly, M. A., &amp; Clark, S. P. (2011). Returns in trading versus non-trading hours: The difference is day and night.</w:t>
+      </w:r>
+      <w:r>
+        <w:t xml:space="preserve"> </w:t>
+      </w:r>
+      <w:r>
+        <w:rPr>
+          <w:iCs/>
+          <w:i/>
+        </w:rPr>
+        <w:t xml:space="preserve">Journal of Asset Management, 12</w:t>
+      </w:r>
+      <w:r>
+        <w:t xml:space="preserve">, 132–145.</w:t>
+      </w:r>
+      <w:r>
+        <w:t xml:space="preserve"> </w:t>
+      </w:r>
+      <w:hyperlink r:id="rId54">
+        <w:r>
+          <w:rPr>
+            <w:rStyle w:val="Hyperlink"/>
+          </w:rPr>
+          <w:t xml:space="preserve">https://doi.org/10.1057/jam.2011.2</w:t>
+        </w:r>
+      </w:hyperlink>
+    </w:p>
+    <w:p>
+      <w:pPr>
+        <w:pStyle w:val="BodyText"/>
+      </w:pPr>
+      <w:r>
+        <w:t xml:space="preserve">Kim, K. A., &amp; Limpaphayom, P. (2000). Characteristics of stocks that frequently hit price limits: Empirical evidence from Taiwan and Thailand.</w:t>
+      </w:r>
+      <w:r>
+        <w:t xml:space="preserve"> </w:t>
+      </w:r>
+      <w:r>
+        <w:rPr>
+          <w:iCs/>
+          <w:i/>
+        </w:rPr>
+        <w:t xml:space="preserve">Journal of Financial Markets, 3</w:t>
+      </w:r>
+      <w:r>
+        <w:t xml:space="preserve">(3), 315–332.</w:t>
+      </w:r>
+    </w:p>
+    <w:p>
+      <w:pPr>
+        <w:pStyle w:val="BodyText"/>
+      </w:pPr>
+      <w:r>
         <w:t xml:space="preserve">Kim, K. A., &amp; Rhee, S. G. (1997). Price limit performance: Evidence from the Tokyo Stock Exchange.</w:t>
       </w:r>
       <w:r>
@@ -8606,7 +10475,7 @@
       <w:r>
         <w:t xml:space="preserve"> </w:t>
       </w:r>
-      <w:hyperlink r:id="rId47">
+      <w:hyperlink r:id="rId55">
         <w:r>
           <w:rPr>
             <w:rStyle w:val="Hyperlink"/>
@@ -8620,20 +10489,20 @@
         <w:pStyle w:val="BodyText"/>
       </w:pPr>
       <w:r>
-        <w:t xml:space="preserve">Le, D. N. (2012). Evaluating impacts of reduction in fluctuation limit on stock price risks in Vietnam.</w:t>
-      </w:r>
-      <w:r>
-        <w:t xml:space="preserve"> </w:t>
-      </w:r>
-      <w:r>
-        <w:rPr>
-          <w:iCs/>
-          <w:i/>
-        </w:rPr>
-        <w:t xml:space="preserve">Journal of Economic Development, 214</w:t>
-      </w:r>
-      <w:r>
-        <w:t xml:space="preserve">, 116–128.</w:t>
+        <w:t xml:space="preserve">Kim, W., &amp; Jun, S. (2019). Effects of a price limit change on market stability at the intraday horizon in the Korean stock market.</w:t>
+      </w:r>
+      <w:r>
+        <w:t xml:space="preserve"> </w:t>
+      </w:r>
+      <w:r>
+        <w:rPr>
+          <w:iCs/>
+          <w:i/>
+        </w:rPr>
+        <w:t xml:space="preserve">Applied Economics Letters, 26</w:t>
+      </w:r>
+      <w:r>
+        <w:t xml:space="preserve">(7), 582–586.</w:t>
       </w:r>
     </w:p>
     <w:p>
@@ -8641,6 +10510,101 @@
         <w:pStyle w:val="BodyText"/>
       </w:pPr>
       <w:r>
+        <w:t xml:space="preserve">Kodres, L. E., &amp; O’Brien, D. P. (1994). The existence of Pareto-superior price limits.</w:t>
+      </w:r>
+      <w:r>
+        <w:t xml:space="preserve"> </w:t>
+      </w:r>
+      <w:r>
+        <w:rPr>
+          <w:iCs/>
+          <w:i/>
+        </w:rPr>
+        <w:t xml:space="preserve">American Economic Review, 84</w:t>
+      </w:r>
+      <w:r>
+        <w:t xml:space="preserve">(4), 919–932.</w:t>
+      </w:r>
+    </w:p>
+    <w:p>
+      <w:pPr>
+        <w:pStyle w:val="BodyText"/>
+      </w:pPr>
+      <w:r>
+        <w:t xml:space="preserve">Liang, H., &amp; Hu, Y. (2025). Stock price limit and its predictability in the Chinese stock market.</w:t>
+      </w:r>
+      <w:r>
+        <w:t xml:space="preserve"> </w:t>
+      </w:r>
+      <w:r>
+        <w:rPr>
+          <w:iCs/>
+          <w:i/>
+        </w:rPr>
+        <w:t xml:space="preserve">Journal of Forecasting, 44</w:t>
+      </w:r>
+      <w:r>
+        <w:t xml:space="preserve">, 297–319.</w:t>
+      </w:r>
+      <w:r>
+        <w:t xml:space="preserve"> </w:t>
+      </w:r>
+      <w:hyperlink r:id="rId56">
+        <w:r>
+          <w:rPr>
+            <w:rStyle w:val="Hyperlink"/>
+          </w:rPr>
+          <w:t xml:space="preserve">https://doi.org/10.1002/for.3197</w:t>
+        </w:r>
+      </w:hyperlink>
+    </w:p>
+    <w:p>
+      <w:pPr>
+        <w:pStyle w:val="BodyText"/>
+      </w:pPr>
+      <w:r>
+        <w:t xml:space="preserve">Lien, D., Hung, P.-H., Zhu, J.-D., &amp; Chen, Y.-H. (2019). Price limit changes and market quality in the Taiwan Stock Exchange.</w:t>
+      </w:r>
+      <w:r>
+        <w:t xml:space="preserve"> </w:t>
+      </w:r>
+      <w:r>
+        <w:rPr>
+          <w:iCs/>
+          <w:i/>
+        </w:rPr>
+        <w:t xml:space="preserve">Pacific-Basin Finance Journal, 55</w:t>
+      </w:r>
+      <w:r>
+        <w:t xml:space="preserve">, 239–258.</w:t>
+      </w:r>
+    </w:p>
+    <w:p>
+      <w:pPr>
+        <w:pStyle w:val="BodyText"/>
+      </w:pPr>
+      <w:r>
+        <w:t xml:space="preserve">Lin, F., Qiu, Z., &amp; Zheng, W. (2023). Cranes among chickens: The general-attention-grabbing effect of daily price limits in China’s stock market.</w:t>
+      </w:r>
+      <w:r>
+        <w:t xml:space="preserve"> </w:t>
+      </w:r>
+      <w:r>
+        <w:rPr>
+          <w:iCs/>
+          <w:i/>
+        </w:rPr>
+        <w:t xml:space="preserve">Journal of Banking &amp; Finance, 150</w:t>
+      </w:r>
+      <w:r>
+        <w:t xml:space="preserve">.</w:t>
+      </w:r>
+    </w:p>
+    <w:p>
+      <w:pPr>
+        <w:pStyle w:val="BodyText"/>
+      </w:pPr>
+      <w:r>
         <w:t xml:space="preserve">Lou, D., Polk, C., &amp; Skouras, S. (2019). A tug of war: Overnight versus intraday expected returns.</w:t>
       </w:r>
       <w:r>
@@ -8659,7 +10623,7 @@
       <w:r>
         <w:t xml:space="preserve"> </w:t>
       </w:r>
-      <w:hyperlink r:id="rId48">
+      <w:hyperlink r:id="rId57">
         <w:r>
           <w:rPr>
             <w:rStyle w:val="Hyperlink"/>
@@ -8673,6 +10637,27 @@
         <w:pStyle w:val="BodyText"/>
       </w:pPr>
       <w:r>
+        <w:t xml:space="preserve">Lu, Z., Malliaris, S. G., &amp; Qin, Z. (2023). Heterogeneous liquidity providers and night-minus-day return predictability.</w:t>
+      </w:r>
+      <w:r>
+        <w:t xml:space="preserve"> </w:t>
+      </w:r>
+      <w:r>
+        <w:rPr>
+          <w:iCs/>
+          <w:i/>
+        </w:rPr>
+        <w:t xml:space="preserve">Journal of Financial Economics, 148</w:t>
+      </w:r>
+      <w:r>
+        <w:t xml:space="preserve">(3), 175–200.</w:t>
+      </w:r>
+    </w:p>
+    <w:p>
+      <w:pPr>
+        <w:pStyle w:val="BodyText"/>
+      </w:pPr>
+      <w:r>
         <w:t xml:space="preserve">Newey, W. K., &amp; West, K. D. (1987). A simple, positive semi-definite, heteroskedasticity and autocorrelation consistent covariance matrix.</w:t>
       </w:r>
       <w:r>
@@ -8691,7 +10676,7 @@
       <w:r>
         <w:t xml:space="preserve"> </w:t>
       </w:r>
-      <w:hyperlink r:id="rId49">
+      <w:hyperlink r:id="rId58">
         <w:r>
           <w:rPr>
             <w:rStyle w:val="Hyperlink"/>
@@ -8723,7 +10708,7 @@
       <w:r>
         <w:t xml:space="preserve"> </w:t>
       </w:r>
-      <w:hyperlink r:id="rId50">
+      <w:hyperlink r:id="rId59">
         <w:r>
           <w:rPr>
             <w:rStyle w:val="Hyperlink"/>
@@ -8737,6 +10722,27 @@
         <w:pStyle w:val="BodyText"/>
       </w:pPr>
       <w:r>
+        <w:t xml:space="preserve">Petersen, M. A. (2009). Estimating standard errors in finance panel data sets: Comparing approaches.</w:t>
+      </w:r>
+      <w:r>
+        <w:t xml:space="preserve"> </w:t>
+      </w:r>
+      <w:r>
+        <w:rPr>
+          <w:iCs/>
+          <w:i/>
+        </w:rPr>
+        <w:t xml:space="preserve">The Review of Financial Studies, 22</w:t>
+      </w:r>
+      <w:r>
+        <w:t xml:space="preserve">(1), 435–480.</w:t>
+      </w:r>
+    </w:p>
+    <w:p>
+      <w:pPr>
+        <w:pStyle w:val="BodyText"/>
+      </w:pPr>
+      <w:r>
         <w:t xml:space="preserve">Qi, B. (2023). Effectiveness of price limits: Evidence from China’s ChiNext market.</w:t>
       </w:r>
       <w:r>
@@ -8755,7 +10761,7 @@
       <w:r>
         <w:t xml:space="preserve"> </w:t>
       </w:r>
-      <w:hyperlink r:id="rId51">
+      <w:hyperlink r:id="rId60">
         <w:r>
           <w:rPr>
             <w:rStyle w:val="Hyperlink"/>
@@ -8769,6 +10775,66 @@
         <w:pStyle w:val="BodyText"/>
       </w:pPr>
       <w:r>
+        <w:t xml:space="preserve">Qiao, K., &amp; Dam, L. (2020). The overnight return puzzle and the</w:t>
+      </w:r>
+      <w:r>
+        <w:t xml:space="preserve"> </w:t>
+      </w:r>
+      <w:r>
+        <w:t xml:space="preserve">“</w:t>
+      </w:r>
+      <w:r>
+        <w:t xml:space="preserve">T+1</w:t>
+      </w:r>
+      <w:r>
+        <w:t xml:space="preserve">”</w:t>
+      </w:r>
+      <w:r>
+        <w:t xml:space="preserve"> </w:t>
+      </w:r>
+      <w:r>
+        <w:t xml:space="preserve">trading rule in Chinese stock markets.</w:t>
+      </w:r>
+      <w:r>
+        <w:t xml:space="preserve"> </w:t>
+      </w:r>
+      <w:r>
+        <w:rPr>
+          <w:iCs/>
+          <w:i/>
+        </w:rPr>
+        <w:t xml:space="preserve">Journal of Financial Markets, 50</w:t>
+      </w:r>
+      <w:r>
+        <w:t xml:space="preserve">, 100534.</w:t>
+      </w:r>
+    </w:p>
+    <w:p>
+      <w:pPr>
+        <w:pStyle w:val="BodyText"/>
+      </w:pPr>
+      <w:r>
+        <w:t xml:space="preserve">Qiu, J., Huang, W., &amp; Jiang, Y. (2025). Day-night anomaly returns in China: The role of institutions.</w:t>
+      </w:r>
+      <w:r>
+        <w:t xml:space="preserve"> </w:t>
+      </w:r>
+      <w:r>
+        <w:rPr>
+          <w:iCs/>
+          <w:i/>
+        </w:rPr>
+        <w:t xml:space="preserve">Research in International Business and Finance, 75</w:t>
+      </w:r>
+      <w:r>
+        <w:t xml:space="preserve">, 102776.</w:t>
+      </w:r>
+    </w:p>
+    <w:p>
+      <w:pPr>
+        <w:pStyle w:val="BodyText"/>
+      </w:pPr>
+      <w:r>
         <w:t xml:space="preserve">Subrahmanyam, A. (1994). Circuit breakers and market volatility: A theoretical perspective.</w:t>
       </w:r>
       <w:r>
@@ -8787,7 +10853,7 @@
       <w:r>
         <w:t xml:space="preserve"> </w:t>
       </w:r>
-      <w:hyperlink r:id="rId52">
+      <w:hyperlink r:id="rId61">
         <w:r>
           <w:rPr>
             <w:rStyle w:val="Hyperlink"/>
@@ -8801,41 +10867,6 @@
         <w:pStyle w:val="BodyText"/>
       </w:pPr>
       <w:r>
-        <w:t xml:space="preserve">Veeraraghavan, M., Nguyen, M. T. T., &amp; Truong, C. (2007).</w:t>
-      </w:r>
-      <w:r>
-        <w:t xml:space="preserve"> </w:t>
-      </w:r>
-      <w:r>
-        <w:rPr>
-          <w:iCs/>
-          <w:i/>
-        </w:rPr>
-        <w:t xml:space="preserve">Delayed price discovery and momentum strategies: Evidence from Vietnam</w:t>
-      </w:r>
-      <w:r>
-        <w:t xml:space="preserve"> </w:t>
-      </w:r>
-      <w:r>
-        <w:t xml:space="preserve">(SSRN Working Paper No. 1009042).</w:t>
-      </w:r>
-      <w:r>
-        <w:t xml:space="preserve"> </w:t>
-      </w:r>
-      <w:hyperlink r:id="rId53">
-        <w:r>
-          <w:rPr>
-            <w:rStyle w:val="Hyperlink"/>
-          </w:rPr>
-          <w:t xml:space="preserve">https://doi.org/10.2139/ssrn.1009042</w:t>
-        </w:r>
-      </w:hyperlink>
-    </w:p>
-    <w:p>
-      <w:pPr>
-        <w:pStyle w:val="BodyText"/>
-      </w:pPr>
-      <w:r>
         <w:t xml:space="preserve">Viet Nam News. (2025).</w:t>
       </w:r>
       <w:r>
@@ -8857,7 +10888,7 @@
       <w:r>
         <w:t xml:space="preserve"> </w:t>
       </w:r>
-      <w:hyperlink r:id="rId54">
+      <w:hyperlink r:id="rId62">
         <w:r>
           <w:rPr>
             <w:rStyle w:val="Hyperlink"/>
@@ -8866,7 +10897,60 @@
         </w:r>
       </w:hyperlink>
     </w:p>
-    <w:bookmarkEnd w:id="55"/>
+    <w:p>
+      <w:pPr>
+        <w:pStyle w:val="BodyText"/>
+      </w:pPr>
+      <w:r>
+        <w:t xml:space="preserve">Zeng, Z., Wang, G., &amp; Tang, G. (2024). Price limits hitting effect and cross-sectional stock returns: Evidence from China.</w:t>
+      </w:r>
+      <w:r>
+        <w:t xml:space="preserve"> </w:t>
+      </w:r>
+      <w:r>
+        <w:rPr>
+          <w:iCs/>
+          <w:i/>
+        </w:rPr>
+        <w:t xml:space="preserve">Finance Research Letters, 60</w:t>
+      </w:r>
+      <w:r>
+        <w:t xml:space="preserve">, 104803.</w:t>
+      </w:r>
+      <w:r>
+        <w:t xml:space="preserve"> </w:t>
+      </w:r>
+      <w:hyperlink r:id="rId63">
+        <w:r>
+          <w:rPr>
+            <w:rStyle w:val="Hyperlink"/>
+          </w:rPr>
+          <w:t xml:space="preserve">https://doi.org/10.1016/j.frl.2023.104803</w:t>
+        </w:r>
+      </w:hyperlink>
+    </w:p>
+    <w:p>
+      <w:pPr>
+        <w:pStyle w:val="BodyText"/>
+      </w:pPr>
+      <w:r>
+        <w:t xml:space="preserve">Zhang, X., Wang, Z., Hao, J., &amp; He, F. (2022). Price limit and stock market quality: Evidence from a quasi-natural experiment in the Chinese stock market.</w:t>
+      </w:r>
+      <w:r>
+        <w:t xml:space="preserve"> </w:t>
+      </w:r>
+      <w:r>
+        <w:rPr>
+          <w:iCs/>
+          <w:i/>
+        </w:rPr>
+        <w:t xml:space="preserve">Pacific-Basin Finance Journal, 74</w:t>
+      </w:r>
+      <w:r>
+        <w:t xml:space="preserve">, 101778.</w:t>
+      </w:r>
+    </w:p>
+    <w:bookmarkEnd w:id="64"/>
     <w:sectPr>
       <w:pgSz w:h="16838" w:w="11906"/>
       <w:pgMar w:bottom="1417" w:left="1417" w:right="1417" w:top="1417"/>

</xml_diff>

<commit_message>
Stage 4.5 PASS (narrow re-verification); Stage 5 formatting: equation numbers, upright multi-letter symbols, Lin et al. DOI
Co-Authored-By: Claude Opus 5.5 <noreply@anthropic.com>
Claude-Session: https://claude.ai/code/session_011zPDaCYE4jmmpoRvPu4SUX
</commit_message>
<xml_diff>
--- a/paper2/final/Paper_C_Closing_at_the_limit.docx
+++ b/paper2/final/Paper_C_Closing_at_the_limit.docx
@@ -304,7 +304,7 @@
         <w:t xml:space="preserve"> </w:t>
       </w:r>
       <w:r>
-        <w:t xml:space="preserve">The widening of the ChiNext band from 10% to 20% in August 2020 gave several studies a quasi-natural experiment. Qi (2023) confirms delayed price discovery, volatility spillover, and trading interference, with stronger effects at the lower limit and no magnet effect. Zhang et al. (2022) find higher liquidity and lower information asymmetry after the widening, and Jia et al. (2024) find lower crash risk. Lien et al. (2019) find higher spreads and intraday volatility but better execution quality after Taiwan widened its band in 2015, and Kim and Jun (2019) find higher intraday realized variance after Korea widened its band from 15% to 30%. Chen et al. (2019) use account-level Shenzhen data and show that large investors buy on the day a stock hits the 10% upper limit and sell on the next day, and that their net buying on the limit day predicts stronger long-run reversal. Two recent studies look at the cross-section: Lin et al. (2023) find that stocks with large exposure to daily price limits attract attention and earn lower future returns, with the largest effect where retail investors hold many shares, and Zeng et al. (2024) relate the frequency of upper-limit hits to lower future returns. Liang and Hu (2025) forecast limit hits; the record we could access reports no returns after the hit. The band-change studies compare periods with different bands, and the cross-sectional studies sort stocks by limit exposure; ours conditions on individual limit closes within one band regime.</w:t>
+        <w:t xml:space="preserve">The widening of the ChiNext band from 10% to 20% in August 2020 gave several studies a quasi-natural experiment. Qi (2023) confirms delayed price discovery, volatility spillover, and trading interference, with stronger effects at the lower limit and no magnet effect. Zhang et al. (2022) find higher liquidity, higher volatility, and a higher probability of informed trading after the widening, and Jia et al. (2024) find lower crash risk. Lien et al. (2019) find higher spreads and intraday volatility but better execution quality after Taiwan widened its band in 2015, and Kim and Jun (2019) find higher intraday realized variance after Korea widened its band from 15% to 30%. Chen et al. (2019) use account-level Shenzhen data and show that large investors buy on the day a stock hits the 10% upper limit and sell on the next day, and that their net buying on the limit day predicts stronger long-run reversal. Two recent studies look at the cross-section: Lin et al. (2023) find that stocks with large exposure to daily price limits attract attention and earn lower future returns, with the largest effect where retail investors hold many shares, and Zeng et al. (2024) relate the frequency of upper-limit hits to lower future returns. Liang and Hu (2025) forecast limit hits; the record we could access reports no returns after the hit. The band-change studies compare periods with different bands, and the cross-sectional studies sort stocks by limit exposure; ours conditions on individual limit closes within one band regime.</w:t>
       </w:r>
     </w:p>
     <w:p>
@@ -803,19 +803,13 @@
           <m:r>
             <m:t>  </m:t>
           </m:r>
-          <m:d>
-            <m:dPr>
-              <m:begChr m:val="("/>
-              <m:endChr m:val=")"/>
-              <m:sepChr m:val=""/>
-              <m:grow/>
-            </m:dPr>
-            <m:e>
-              <m:r>
-                <m:t>1</m:t>
-              </m:r>
-            </m:e>
-          </m:d>
+          <m:r>
+            <m:rPr>
+              <m:nor/>
+              <m:sty m:val="p"/>
+            </m:rPr>
+            <m:t>(1)</m:t>
+          </m:r>
         </m:oMath>
       </m:oMathPara>
     </w:p>
@@ -1318,19 +1312,13 @@
           <m:r>
             <m:t>  </m:t>
           </m:r>
-          <m:d>
-            <m:dPr>
-              <m:begChr m:val="("/>
-              <m:endChr m:val=")"/>
-              <m:sepChr m:val=""/>
-              <m:grow/>
-            </m:dPr>
-            <m:e>
-              <m:r>
-                <m:t>2</m:t>
-              </m:r>
-            </m:e>
-          </m:d>
+          <m:r>
+            <m:rPr>
+              <m:nor/>
+              <m:sty m:val="p"/>
+            </m:rPr>
+            <m:t>(2)</m:t>
+          </m:r>
         </m:oMath>
       </m:oMathPara>
     </w:p>
@@ -1748,19 +1736,13 @@
           <m:r>
             <m:t>  </m:t>
           </m:r>
-          <m:d>
-            <m:dPr>
-              <m:begChr m:val="("/>
-              <m:endChr m:val=")"/>
-              <m:sepChr m:val=""/>
-              <m:grow/>
-            </m:dPr>
-            <m:e>
-              <m:r>
-                <m:t>3</m:t>
-              </m:r>
-            </m:e>
-          </m:d>
+          <m:r>
+            <m:rPr>
+              <m:nor/>
+              <m:sty m:val="p"/>
+            </m:rPr>
+            <m:t>(3)</m:t>
+          </m:r>
         </m:oMath>
       </m:oMathPara>
     </w:p>
@@ -2097,13 +2079,13 @@
             <m:e>
               <m:r>
                 <m:rPr>
-                  <m:sty m:val="i"/>
+                  <m:sty m:val="p"/>
                 </m:rPr>
                 <m:t>A</m:t>
               </m:r>
               <m:r>
                 <m:rPr>
-                  <m:sty m:val="i"/>
+                  <m:sty m:val="p"/>
                 </m:rPr>
                 <m:t>R</m:t>
               </m:r>
@@ -2208,19 +2190,19 @@
             <m:e>
               <m:r>
                 <m:rPr>
-                  <m:sty m:val="i"/>
+                  <m:sty m:val="p"/>
                 </m:rPr>
                 <m:t>C</m:t>
               </m:r>
               <m:r>
                 <m:rPr>
-                  <m:sty m:val="i"/>
+                  <m:sty m:val="p"/>
                 </m:rPr>
                 <m:t>A</m:t>
               </m:r>
               <m:r>
                 <m:rPr>
-                  <m:sty m:val="i"/>
+                  <m:sty m:val="p"/>
                 </m:rPr>
                 <m:t>R</m:t>
               </m:r>
@@ -2417,19 +2399,13 @@
           <m:r>
             <m:t>  </m:t>
           </m:r>
-          <m:d>
-            <m:dPr>
-              <m:begChr m:val="("/>
-              <m:endChr m:val=")"/>
-              <m:sepChr m:val=""/>
-              <m:grow/>
-            </m:dPr>
-            <m:e>
-              <m:r>
-                <m:t>4</m:t>
-              </m:r>
-            </m:e>
-          </m:d>
+          <m:r>
+            <m:rPr>
+              <m:nor/>
+              <m:sty m:val="p"/>
+            </m:rPr>
+            <m:t>(4)</m:t>
+          </m:r>
         </m:oMath>
       </m:oMathPara>
     </w:p>
@@ -2576,19 +2552,19 @@
           <m:e>
             <m:r>
               <m:rPr>
-                <m:sty m:val="i"/>
+                <m:sty m:val="p"/>
               </m:rPr>
               <m:t>G</m:t>
             </m:r>
             <m:r>
               <m:rPr>
-                <m:sty m:val="i"/>
+                <m:sty m:val="p"/>
               </m:rPr>
               <m:t>A</m:t>
             </m:r>
             <m:r>
               <m:rPr>
-                <m:sty m:val="i"/>
+                <m:sty m:val="p"/>
               </m:rPr>
               <m:t>P</m:t>
             </m:r>
@@ -2623,31 +2599,31 @@
           <m:e>
             <m:r>
               <m:rPr>
-                <m:sty m:val="i"/>
+                <m:sty m:val="p"/>
               </m:rPr>
               <m:t>I</m:t>
             </m:r>
             <m:r>
               <m:rPr>
-                <m:sty m:val="i"/>
+                <m:sty m:val="p"/>
               </m:rPr>
               <m:t>N</m:t>
             </m:r>
             <m:r>
               <m:rPr>
-                <m:sty m:val="i"/>
+                <m:sty m:val="p"/>
               </m:rPr>
               <m:t>T</m:t>
             </m:r>
             <m:r>
               <m:rPr>
-                <m:sty m:val="i"/>
+                <m:sty m:val="p"/>
               </m:rPr>
               <m:t>R</m:t>
             </m:r>
             <m:r>
               <m:rPr>
-                <m:sty m:val="i"/>
+                <m:sty m:val="p"/>
               </m:rPr>
               <m:t>A</m:t>
             </m:r>
@@ -2685,19 +2661,19 @@
             <m:e>
               <m:r>
                 <m:rPr>
-                  <m:sty m:val="i"/>
+                  <m:sty m:val="p"/>
                 </m:rPr>
                 <m:t>G</m:t>
               </m:r>
               <m:r>
                 <m:rPr>
-                  <m:sty m:val="i"/>
+                  <m:sty m:val="p"/>
                 </m:rPr>
                 <m:t>A</m:t>
               </m:r>
               <m:r>
                 <m:rPr>
-                  <m:sty m:val="i"/>
+                  <m:sty m:val="p"/>
                 </m:rPr>
                 <m:t>P</m:t>
               </m:r>
@@ -2805,31 +2781,31 @@
             <m:e>
               <m:r>
                 <m:rPr>
-                  <m:sty m:val="i"/>
+                  <m:sty m:val="p"/>
                 </m:rPr>
                 <m:t>I</m:t>
               </m:r>
               <m:r>
                 <m:rPr>
-                  <m:sty m:val="i"/>
+                  <m:sty m:val="p"/>
                 </m:rPr>
                 <m:t>N</m:t>
               </m:r>
               <m:r>
                 <m:rPr>
-                  <m:sty m:val="i"/>
+                  <m:sty m:val="p"/>
                 </m:rPr>
                 <m:t>T</m:t>
               </m:r>
               <m:r>
                 <m:rPr>
-                  <m:sty m:val="i"/>
+                  <m:sty m:val="p"/>
                 </m:rPr>
                 <m:t>R</m:t>
               </m:r>
               <m:r>
                 <m:rPr>
-                  <m:sty m:val="i"/>
+                  <m:sty m:val="p"/>
                 </m:rPr>
                 <m:t>A</m:t>
               </m:r>
@@ -3008,19 +2984,19 @@
                 <m:e>
                   <m:r>
                     <m:rPr>
-                      <m:sty m:val="i"/>
+                      <m:sty m:val="p"/>
                     </m:rPr>
                     <m:t>G</m:t>
                   </m:r>
                   <m:r>
                     <m:rPr>
-                      <m:sty m:val="i"/>
+                      <m:sty m:val="p"/>
                     </m:rPr>
                     <m:t>A</m:t>
                   </m:r>
                   <m:r>
                     <m:rPr>
-                      <m:sty m:val="i"/>
+                      <m:sty m:val="p"/>
                     </m:rPr>
                     <m:t>P</m:t>
                   </m:r>
@@ -3063,31 +3039,31 @@
                 <m:e>
                   <m:r>
                     <m:rPr>
-                      <m:sty m:val="i"/>
+                      <m:sty m:val="p"/>
                     </m:rPr>
                     <m:t>I</m:t>
                   </m:r>
                   <m:r>
                     <m:rPr>
-                      <m:sty m:val="i"/>
+                      <m:sty m:val="p"/>
                     </m:rPr>
                     <m:t>N</m:t>
                   </m:r>
                   <m:r>
                     <m:rPr>
-                      <m:sty m:val="i"/>
+                      <m:sty m:val="p"/>
                     </m:rPr>
                     <m:t>T</m:t>
                   </m:r>
                   <m:r>
                     <m:rPr>
-                      <m:sty m:val="i"/>
+                      <m:sty m:val="p"/>
                     </m:rPr>
                     <m:t>R</m:t>
                   </m:r>
                   <m:r>
                     <m:rPr>
-                      <m:sty m:val="i"/>
+                      <m:sty m:val="p"/>
                     </m:rPr>
                     <m:t>A</m:t>
                   </m:r>
@@ -3118,19 +3094,13 @@
           <m:r>
             <m:t>  </m:t>
           </m:r>
-          <m:d>
-            <m:dPr>
-              <m:begChr m:val="("/>
-              <m:endChr m:val=")"/>
-              <m:sepChr m:val=""/>
-              <m:grow/>
-            </m:dPr>
-            <m:e>
-              <m:r>
-                <m:t>5</m:t>
-              </m:r>
-            </m:e>
-          </m:d>
+          <m:r>
+            <m:rPr>
+              <m:nor/>
+              <m:sty m:val="p"/>
+            </m:rPr>
+            <m:t>(5)</m:t>
+          </m:r>
         </m:oMath>
       </m:oMathPara>
     </w:p>
@@ -3901,19 +3871,13 @@
           <m:r>
             <m:t>  </m:t>
           </m:r>
-          <m:d>
-            <m:dPr>
-              <m:begChr m:val="("/>
-              <m:endChr m:val=")"/>
-              <m:sepChr m:val=""/>
-              <m:grow/>
-            </m:dPr>
-            <m:e>
-              <m:r>
-                <m:t>6</m:t>
-              </m:r>
-            </m:e>
-          </m:d>
+          <m:r>
+            <m:rPr>
+              <m:nor/>
+              <m:sty m:val="p"/>
+            </m:rPr>
+            <m:t>(6)</m:t>
+          </m:r>
         </m:oMath>
       </m:oMathPara>
     </w:p>
@@ -5200,19 +5164,13 @@
           <m:r>
             <m:t>  </m:t>
           </m:r>
-          <m:d>
-            <m:dPr>
-              <m:begChr m:val="("/>
-              <m:endChr m:val=")"/>
-              <m:sepChr m:val=""/>
-              <m:grow/>
-            </m:dPr>
-            <m:e>
-              <m:r>
-                <m:t>7</m:t>
-              </m:r>
-            </m:e>
-          </m:d>
+          <m:r>
+            <m:rPr>
+              <m:nor/>
+              <m:sty m:val="p"/>
+            </m:rPr>
+            <m:t>(7)</m:t>
+          </m:r>
         </m:oMath>
       </m:oMathPara>
     </w:p>
@@ -5879,19 +5837,13 @@
           <m:r>
             <m:t>  </m:t>
           </m:r>
-          <m:d>
-            <m:dPr>
-              <m:begChr m:val="("/>
-              <m:endChr m:val=")"/>
-              <m:sepChr m:val=""/>
-              <m:grow/>
-            </m:dPr>
-            <m:e>
-              <m:r>
-                <m:t>8</m:t>
-              </m:r>
-            </m:e>
-          </m:d>
+          <m:r>
+            <m:rPr>
+              <m:nor/>
+              <m:sty m:val="p"/>
+            </m:rPr>
+            <m:t>(8)</m:t>
+          </m:r>
         </m:oMath>
       </m:oMathPara>
     </w:p>
@@ -15194,7 +15146,7 @@
         <w:t xml:space="preserve">d</w:t>
       </w:r>
       <w:r>
-        <w:t xml:space="preserve">. The floor gap grows and the intraday return after floor closes turns positive after at-the-open orders lose priority (Table 4), which suggests that auction design shapes how the opening absorbs overnight pressure, although the market period changed at the same time (Section 5). A band change on HOSE, like the ChiNext widening that Qi (2023) studies, would give a natural experiment to test the readings.</w:t>
+        <w:t xml:space="preserve">. The floor gap grows and the intraday return after floor closes turns positive after at-the-open orders lose priority (Table 4). This is consistent with auction design shaping how the opening absorbs overnight pressure, but the market period changed at the same time, so the split cannot isolate the auction rules (Section 5). A band change on HOSE, like the ChiNext widening that Qi (2023) studies, would give a natural experiment to test the readings.</w:t>
       </w:r>
     </w:p>
     <w:p>
@@ -15241,7 +15193,7 @@
         <w:pStyle w:val="Compact"/>
       </w:pPr>
       <w:r>
-        <w:t xml:space="preserve">The sample covers 519 trading days on one exchange, with one trading-platform change and a period of market stress. (ii) We have no order-book, investor-type, announcement, or news data, so we infer the unfilled-demand mechanism and cannot separate it from selection on news. (iii) The 7% band, the reference price, and the platform change come from brokerage and press descriptions, which we check against the return distribution but not against exchange circulars. Tick sizes, reference-price treatment on corporate-action days, and wider bands for first-day listings and resumed trading are assumptions. (iv) The vendor appears to adjust earlier prices for later corporate actions: for stocks priced at 10 thousand dong or more, only 25% of 2024 closes, 31% of 2025 closes, and 58% of 2026 closes are multiples of the tick size, against 100% for stocks below 10 thousand dong, and near hits make up 62% of ceiling events for the higher-priced stocks against 23% for the others. Proportional adjustment leaves returns (except on ex-dates), the close-at-high event rule, and locked days unchanged, but it makes the exact-hit classification of Equation (3) unreliable, so we treat exact and near hits as a data check rather than as a measure of distance to the limit. The listing snapshot also excludes earlier delistings. (v) Clustered standard errors allow dependence across dates, weeks, blocks, and stocks, but events in the same market episode may depend on each other more, and we did not compute calendar-time portfolio estimates or standard errors robust to both cross-sectional and serial dependence. (vi) Several characteristics (5-day return, MAX, MIN, move frequency, overnight return) share inputs with the event definition, and the Corwin–Schultz spread and range volatility use high and low prices that limits censor. (vii) The floor effect depends on the benchmark, and we built no beta- and size-matched control for the five-day outcome. (viii) The characteristic tests have limited power, and the effect sizes may carry winner’s-curse bias because we chose this question from several screened on the same data.</w:t>
+        <w:t xml:space="preserve">The sample covers 519 trading days on one exchange, with one trading-platform change and a period of market stress. (ii) We have no order-book, investor-type, announcement, or news data, so we infer the unfilled-demand mechanism and cannot separate it from selection on news. (iii) The 7% band, the reference price, and the platform change come from brokerage and press descriptions, which we check against the return distribution but not against exchange circulars. Tick sizes, reference-price treatment on corporate-action days, and wider bands for first-day listings and resumed trading are assumptions. (iv) The vendor appears to adjust earlier prices for later corporate actions: for stocks priced at 10 thousand dong or more, only 25% of 2024 closes, 31% of 2025 closes, and 58% of 2026 closes are multiples of the tick size, against 100% for stocks below 10 thousand dong, where the 0.01 tick equals the two-decimal resolution of the files and the check is uninformative, and near hits make up 62% of ceiling events for the higher-priced stocks against 23% for the others. Proportional adjustment leaves returns (except on ex-dates), the close-at-high event rule, and locked days unchanged, but it makes the exact-hit classification of Equation (3) unreliable, so we treat exact and near hits as a data check rather than as a measure of distance to the limit. The listing snapshot also excludes earlier delistings. (v) Clustered standard errors allow dependence across dates, weeks, blocks, and stocks, but events in the same market episode may depend on each other more, and we did not compute calendar-time portfolio estimates or standard errors robust to both cross-sectional and serial dependence. (vi) Several characteristics (5-day return, MAX, MIN, move frequency, overnight return) share inputs with the event definition, and the Corwin–Schultz spread and range volatility use high and low prices that limits censor. (vii) The floor effect depends on the benchmark, and we built no beta- and size-matched control for the five-day outcome. (viii) The characteristic tests have limited power, and the effect sizes may carry winner’s-curse bias because we chose this question from several screened on the same data.</w:t>
       </w:r>
     </w:p>
     <w:bookmarkEnd w:id="32"/>
@@ -15350,7 +15302,7 @@
       </w:r>
     </w:p>
     <w:bookmarkEnd w:id="34"/>
-    <w:bookmarkStart w:id="66" w:name="references"/>
+    <w:bookmarkStart w:id="67" w:name="references"/>
     <w:p>
       <w:pPr>
         <w:pStyle w:val="Heading1"/>
@@ -15950,7 +15902,7 @@
         <w:pStyle w:val="BodyText"/>
       </w:pPr>
       <w:r>
-        <w:t xml:space="preserve">Gutierrez, R. C., Jr., &amp; Kelley, E. K. (2008). The long-lasting momentum in weekly returns.</w:t>
+        <w:t xml:space="preserve">Gu, M., Hu, Y., &amp; Xiong, Z. (2025). Dissecting the lottery-like anomaly: Evidence from China.</w:t>
       </w:r>
       <w:r>
         <w:t xml:space="preserve"> </w:t>
@@ -15960,10 +15912,10 @@
           <w:iCs/>
           <w:i/>
         </w:rPr>
-        <w:t xml:space="preserve">The Journal of Finance, 63</w:t>
-      </w:r>
-      <w:r>
-        <w:t xml:space="preserve">(1), 415–447.</w:t>
+        <w:t xml:space="preserve">Accounting &amp; Finance, 65</w:t>
+      </w:r>
+      <w:r>
+        <w:t xml:space="preserve">(1), 883–911.</w:t>
       </w:r>
       <w:r>
         <w:t xml:space="preserve"> </w:t>
@@ -15973,7 +15925,7 @@
           <w:rPr>
             <w:rStyle w:val="Hyperlink"/>
           </w:rPr>
-          <w:t xml:space="preserve">https://doi.org/10.1111/j.1540-6261.2008.01320.x</w:t>
+          <w:t xml:space="preserve">https://doi.org/10.1111/acfi.13354</w:t>
         </w:r>
       </w:hyperlink>
     </w:p>
@@ -15982,7 +15934,7 @@
         <w:pStyle w:val="BodyText"/>
       </w:pPr>
       <w:r>
-        <w:t xml:space="preserve">Gu, M., Hu, Y., &amp; Xiong, Z. (2025). Dissecting the lottery-like anomaly: Evidence from China.</w:t>
+        <w:t xml:space="preserve">Gutierrez, R. C., Jr., &amp; Kelley, E. K. (2008). The long-lasting momentum in weekly returns.</w:t>
       </w:r>
       <w:r>
         <w:t xml:space="preserve"> </w:t>
@@ -15992,10 +15944,10 @@
           <w:iCs/>
           <w:i/>
         </w:rPr>
-        <w:t xml:space="preserve">Accounting &amp; Finance, 65</w:t>
-      </w:r>
-      <w:r>
-        <w:t xml:space="preserve">(1), 883–911.</w:t>
+        <w:t xml:space="preserve">The Journal of Finance, 63</w:t>
+      </w:r>
+      <w:r>
+        <w:t xml:space="preserve">(1), 415–447.</w:t>
       </w:r>
       <w:r>
         <w:t xml:space="preserve"> </w:t>
@@ -16005,7 +15957,7 @@
           <w:rPr>
             <w:rStyle w:val="Hyperlink"/>
           </w:rPr>
-          <w:t xml:space="preserve">https://doi.org/10.1111/acfi.13354</w:t>
+          <w:t xml:space="preserve">https://doi.org/10.1111/j.1540-6261.2008.01320.x</w:t>
         </w:r>
       </w:hyperlink>
     </w:p>
@@ -16168,7 +16120,7 @@
         <w:t xml:space="preserve">Pacific-Basin Finance Journal, 82</w:t>
       </w:r>
       <w:r>
-        <w:t xml:space="preserve">.</w:t>
+        <w:t xml:space="preserve">, 102176.</w:t>
       </w:r>
     </w:p>
     <w:p>
@@ -16443,8 +16395,19 @@
         <w:t xml:space="preserve">Journal of Banking &amp; Finance, 150</w:t>
       </w:r>
       <w:r>
-        <w:t xml:space="preserve">.</w:t>
-      </w:r>
+        <w:t xml:space="preserve">, 106818.</w:t>
+      </w:r>
+      <w:r>
+        <w:t xml:space="preserve"> </w:t>
+      </w:r>
+      <w:hyperlink r:id="rId59">
+        <w:r>
+          <w:rPr>
+            <w:rStyle w:val="Hyperlink"/>
+          </w:rPr>
+          <w:t xml:space="preserve">https://doi.org/10.1016/j.jbankfin.2023.106818</w:t>
+        </w:r>
+      </w:hyperlink>
     </w:p>
     <w:p>
       <w:pPr>
@@ -16469,7 +16432,7 @@
       <w:r>
         <w:t xml:space="preserve"> </w:t>
       </w:r>
-      <w:hyperlink r:id="rId59">
+      <w:hyperlink r:id="rId60">
         <w:r>
           <w:rPr>
             <w:rStyle w:val="Hyperlink"/>
@@ -16522,7 +16485,7 @@
       <w:r>
         <w:t xml:space="preserve"> </w:t>
       </w:r>
-      <w:hyperlink r:id="rId60">
+      <w:hyperlink r:id="rId61">
         <w:r>
           <w:rPr>
             <w:rStyle w:val="Hyperlink"/>
@@ -16554,7 +16517,7 @@
       <w:r>
         <w:t xml:space="preserve"> </w:t>
       </w:r>
-      <w:hyperlink r:id="rId61">
+      <w:hyperlink r:id="rId62">
         <w:r>
           <w:rPr>
             <w:rStyle w:val="Hyperlink"/>
@@ -16607,7 +16570,7 @@
       <w:r>
         <w:t xml:space="preserve"> </w:t>
       </w:r>
-      <w:hyperlink r:id="rId62">
+      <w:hyperlink r:id="rId63">
         <w:r>
           <w:rPr>
             <w:rStyle w:val="Hyperlink"/>
@@ -16699,7 +16662,7 @@
       <w:r>
         <w:t xml:space="preserve"> </w:t>
       </w:r>
-      <w:hyperlink r:id="rId63">
+      <w:hyperlink r:id="rId64">
         <w:r>
           <w:rPr>
             <w:rStyle w:val="Hyperlink"/>
@@ -16734,7 +16697,7 @@
       <w:r>
         <w:t xml:space="preserve"> </w:t>
       </w:r>
-      <w:hyperlink r:id="rId64">
+      <w:hyperlink r:id="rId65">
         <w:r>
           <w:rPr>
             <w:rStyle w:val="Hyperlink"/>
@@ -16766,7 +16729,7 @@
       <w:r>
         <w:t xml:space="preserve"> </w:t>
       </w:r>
-      <w:hyperlink r:id="rId65">
+      <w:hyperlink r:id="rId66">
         <w:r>
           <w:rPr>
             <w:rStyle w:val="Hyperlink"/>
@@ -16796,8 +16759,8 @@
         <w:t xml:space="preserve">, 101778.</w:t>
       </w:r>
     </w:p>
-    <w:bookmarkEnd w:id="66"/>
-    <w:bookmarkStart w:id="67" w:name="appendix-a.-characteristic-definitions"/>
+    <w:bookmarkEnd w:id="67"/>
+    <w:bookmarkStart w:id="68" w:name="appendix-a.-characteristic-definitions"/>
     <w:p>
       <w:pPr>
         <w:pStyle w:val="Heading1"/>
@@ -16896,13 +16859,13 @@
               <m:e>
                 <m:r>
                   <m:rPr>
-                    <m:sty m:val="i"/>
+                    <m:sty m:val="p"/>
                   </m:rPr>
                   <m:t>T</m:t>
                 </m:r>
                 <m:r>
                   <m:rPr>
-                    <m:sty m:val="i"/>
+                    <m:sty m:val="p"/>
                   </m:rPr>
                   <m:t>O</m:t>
                 </m:r>
@@ -16923,13 +16886,13 @@
               <m:e>
                 <m:r>
                   <m:rPr>
-                    <m:sty m:val="i"/>
+                    <m:sty m:val="p"/>
                   </m:rPr>
                   <m:t>T</m:t>
                 </m:r>
                 <m:r>
                   <m:rPr>
-                    <m:sty m:val="i"/>
+                    <m:sty m:val="p"/>
                   </m:rPr>
                   <m:t>O</m:t>
                 </m:r>
@@ -16954,13 +16917,13 @@
           <m:e>
             <m:r>
               <m:rPr>
-                <m:sty m:val="i"/>
+                <m:sty m:val="p"/>
               </m:rPr>
               <m:t>T</m:t>
             </m:r>
             <m:r>
               <m:rPr>
-                <m:sty m:val="i"/>
+                <m:sty m:val="p"/>
               </m:rPr>
               <m:t>O</m:t>
             </m:r>
@@ -16986,13 +16949,13 @@
           <m:e>
             <m:r>
               <m:rPr>
-                <m:sty m:val="i"/>
+                <m:sty m:val="p"/>
               </m:rPr>
               <m:t>T</m:t>
             </m:r>
             <m:r>
               <m:rPr>
-                <m:sty m:val="i"/>
+                <m:sty m:val="p"/>
               </m:rPr>
               <m:t>O</m:t>
             </m:r>
@@ -17011,7 +16974,7 @@
         <w:t xml:space="preserve">are the shares of the long and short legs replaced since the previous week.</w:t>
       </w:r>
     </w:p>
-    <w:bookmarkEnd w:id="67"/>
+    <w:bookmarkEnd w:id="68"/>
     <w:sectPr>
       <w:pgSz w:h="16838" w:w="11906"/>
       <w:pgMar w:bottom="1417" w:left="1417" w:right="1417" w:top="1417"/>

</xml_diff>

<commit_message>
Post-cut integrity fixes R1-R8 and M1-M4 applied; final files updated
Co-Authored-By: Claude Opus 5.5 <noreply@anthropic.com>
Claude-Session: https://claude.ai/code/session_011zPDaCYE4jmmpoRvPu4SUX
</commit_message>
<xml_diff>
--- a/paper2/final/Paper_C_Closing_at_the_limit.docx
+++ b/paper2/final/Paper_C_Closing_at_the_limit.docx
@@ -268,7 +268,7 @@
         <w:t xml:space="preserve"> </w:t>
       </w:r>
       <w:r>
-        <w:t xml:space="preserve">Models predict protection or distortion, depending on the source of the shock. Brennan (1986) rationalizes limits in futures markets, Kodres and O’Brien (1994) show that limits can be Pareto superior when fundamental news drives prices because they insure traders against implementation risk, and Greenwald and Stein (1991) link crashes to imperfect transactional mechanisms. Subrahmanyam (1994) shows that halts can advance trades in time and raise price variability, and in the model of Chen et al. (2024) volatility rises as the price nears a circuit breaker, a magnet effect. A limit that only delays adjustment leaves a predictable next-day continuation, which the return after a limit close can reveal.</w:t>
+        <w:t xml:space="preserve">Models predict protection or distortion, depending on the source of the shock. Brennan (1986) rationalizes limits in futures markets, Kodres and O’Brien (1994) show that well-chosen limits can be Pareto superior when fundamental news drives prices because they partly insure traders against implementation risk, and Greenwald and Stein (1991) link crashes to imperfect transactional mechanisms. Subrahmanyam (1994) shows that halts can advance trades in time and raise price variability, and in the model of Chen et al. (2024) volatility rises as the price nears a circuit breaker, a magnet effect. A limit that only delays adjustment leaves a predictable next-day continuation, which the return after a limit close can reveal.</w:t>
       </w:r>
     </w:p>
     <w:p>
@@ -304,7 +304,7 @@
         <w:t xml:space="preserve"> </w:t>
       </w:r>
       <w:r>
-        <w:t xml:space="preserve">After ChiNext widened its band from 10% to 20% in August 2020, Qi (2023) confirms delayed price discovery, volatility spillover, and trading interference, stronger at the lower limit and with no magnet effect; Zhang et al. (2022) find higher liquidity, volatility, and probability of informed trading; and Jia et al. (2024) find lower crash risk. Wider bands raised spreads and intraday volatility but improved execution quality in Taiwan (Lien et al., 2019) and raised intraday realized variance in Korea (Kim &amp; Jun, 2019). In Shenzhen account data, large investors buy on the day a stock hits the 10% upper limit and sell the next day, and their limit-day net buying predicts stronger long-run reversal (Chen et al., 2019). Stocks with large limit exposure attract attention and earn lower future returns, most where retail investors hold many shares (Lin et al., 2023), as do stocks with frequent upper-limit hits (Zeng et al., 2024). Liang and Hu (2025) forecast limit hits; the record we could access reports no returns after the hit.</w:t>
+        <w:t xml:space="preserve">After ChiNext widened its band from 10% to 20% in August 2020, Qi (2023) confirms delayed price discovery, volatility spillover, and trading interference, stronger at the lower limit and with no magnet effect; Zhang et al. (2022) find higher liquidity, volatility, and probability of informed trading; and Jia et al. (2024) find lower crash risk. Wider bands raised spreads and intraday volatility but improved execution quality in Taiwan (Lien et al., 2019) and raised intraday realized variance in Korea (Kim &amp; Jun, 2019). In Shenzhen account data, large investors buy on the day a stock hits the 10% upper limit and sell the next day, and their limit-day net buying predicts stronger long-run reversal (Chen et al., 2019). Stocks with large limit exposure attract attention and earn lower future returns, most where retail investors hold many shares (Lin et al., 2023), and stocks with frequent upper-limit hits also earn lower future returns (Zeng et al., 2024). Liang and Hu (2025) forecast limit hits; the record we could access reports no returns after the hit.</w:t>
       </w:r>
     </w:p>
     <w:p>
@@ -777,7 +777,7 @@
         <w:pStyle w:val="FirstParagraph"/>
       </w:pPr>
       <w:r>
-        <w:t xml:space="preserve">A ceiling event has</w:t>
+        <w:t xml:space="preserve">A ceiling event has a return (Equation (1)) of</w:t>
       </w:r>
       <w:r>
         <w:t xml:space="preserve"> </w:t>
@@ -3721,7 +3721,44 @@
         <w:t xml:space="preserve"> </w:t>
       </w:r>
       <w:r>
-        <w:t xml:space="preserve">for limit closes, with date-clustered HC1 standard errors (R package</w:t>
+        <w:t xml:space="preserve">for limit closes and 0 for the comparison moves,</w:t>
+      </w:r>
+      <w:r>
+        <w:t xml:space="preserve"> </w:t>
+      </w:r>
+      <m:oMath>
+        <m:r>
+          <m:t>α</m:t>
+        </m:r>
+      </m:oMath>
+      <w:r>
+        <w:t xml:space="preserve"> </w:t>
+      </w:r>
+      <w:r>
+        <w:t xml:space="preserve">is the intercept, and</w:t>
+      </w:r>
+      <w:r>
+        <w:t xml:space="preserve"> </w:t>
+      </w:r>
+      <m:oMath>
+        <m:sSub>
+          <m:e>
+            <m:r>
+              <m:t>u</m:t>
+            </m:r>
+          </m:e>
+          <m:sub>
+            <m:r>
+              <m:t>e</m:t>
+            </m:r>
+          </m:sub>
+        </m:sSub>
+      </m:oMath>
+      <w:r>
+        <w:t xml:space="preserve"> </w:t>
+      </w:r>
+      <w:r>
+        <w:t xml:space="preserve">is the error, with date-clustered HC1 standard errors (R package</w:t>
       </w:r>
       <w:r>
         <w:t xml:space="preserve"> </w:t>
@@ -3786,7 +3823,10 @@
         </m:r>
       </m:oMath>
       <w:r>
-        <w:t xml:space="preserve">, each followed by a non-overlapping five-day holding period. Each week we rank-normalize each characteristic</w:t>
+        <w:t xml:space="preserve"> </w:t>
+      </w:r>
+      <w:r>
+        <w:t xml:space="preserve">(five-trading-day periods, not the calendar weeks used for clustering), each followed by a non-overlapping five-day holding period. Each week we rank-normalize each characteristic</w:t>
       </w:r>
       <w:r>
         <w:t xml:space="preserve"> </w:t>
@@ -3841,7 +3881,7 @@
         <w:t xml:space="preserve"> </w:t>
       </w:r>
       <w:r>
-        <w:t xml:space="preserve">stocks with complete data (all 115 days of the longest lookback, trades on 50 of the last 60 days, and next-five-day returns) as</w:t>
+        <w:t xml:space="preserve">stocks with complete data (all 115 days of the longest lookback, trades on at least 50 of the last 60 days, and next-five-day returns) as</w:t>
       </w:r>
       <w:r>
         <w:t xml:space="preserve"> </w:t>
@@ -4312,6 +4352,55 @@
         </m:sSub>
       </m:oMath>
       <w:r>
+        <w:t xml:space="preserve">, slope</w:t>
+      </w:r>
+      <w:r>
+        <w:t xml:space="preserve"> </w:t>
+      </w:r>
+      <m:oMath>
+        <m:sSub>
+          <m:e>
+            <m:r>
+              <m:t>γ</m:t>
+            </m:r>
+          </m:e>
+          <m:sub>
+            <m:r>
+              <m:t>τ</m:t>
+            </m:r>
+          </m:sub>
+        </m:sSub>
+      </m:oMath>
+      <w:r>
+        <w:t xml:space="preserve">, and residual</w:t>
+      </w:r>
+      <w:r>
+        <w:t xml:space="preserve"> </w:t>
+      </w:r>
+      <m:oMath>
+        <m:sSub>
+          <m:e>
+            <m:r>
+              <m:t>ε</m:t>
+            </m:r>
+          </m:e>
+          <m:sub>
+            <m:r>
+              <m:t>i</m:t>
+            </m:r>
+            <m:r>
+              <m:rPr>
+                <m:sty m:val="p"/>
+              </m:rPr>
+              <m:t>,</m:t>
+            </m:r>
+            <m:r>
+              <m:t>τ</m:t>
+            </m:r>
+          </m:sub>
+        </m:sSub>
+      </m:oMath>
+      <w:r>
         <w:t xml:space="preserve">. The</w:t>
       </w:r>
       <w:r>
@@ -7214,7 +7303,7 @@
         <w:t xml:space="preserve"> </w:t>
       </w:r>
       <w:r>
-        <w:t xml:space="preserve">predicts. Unfilled buy orders carried into the night and any overnight news set the opening price, and the intraday reversal suggests that part of that price reflects transient demand.</w:t>
+        <w:t xml:space="preserve">predicts. A stock that closes at its ceiling may carry unfilled buy orders into the night; those orders and any overnight news would set the opening price, and the intraday reversal suggests that part of that price reflects transient demand.</w:t>
       </w:r>
     </w:p>
     <w:p>
@@ -7248,7 +7337,7 @@
         <w:t xml:space="preserve"> </w:t>
       </w:r>
       <w:r>
-        <w:t xml:space="preserve">return is 6.89% against 6.90% for exact hits, and 83% of their closes are not multiples of the tick size. This points to later price adjustment by the vendor, concentrated in higher-priced stocks with coarser ticks, rather than to closes below the limit, so we do not read the difference as a gradient toward the limit. The gap appears in both halves of the sample, on days locked at one price from open to close, and, for ceilings, in each tercile of 60-day average dollar volume (1.52% in the most liquid). Against same-date controls the ceiling gap is 2.70% and the floor close-to-close return −1.65%, so the floor effect depends on the benchmark. Floor events cluster on market-wide down days (740 of 2,111 remain without days on which the market fell more than 2%), and the floor gap is not significant in the least liquid tercile (</w:t>
+        <w:t xml:space="preserve">return is 6.89% against 6.90% for exact hits, and 83% of their closes are not multiples of the tick size. This points to later price adjustment by the vendor rather than to closes below the limit. The split is therefore weighted toward higher-priced stocks, where the tick is coarser, and we do not read the difference as a gradient toward the limit. The gap appears in both halves of the sample, on days locked at one price from open to close, and, for ceilings, in each tercile of 60-day average dollar volume (1.52% in the most liquid). Against same-date controls the ceiling gap is 2.70% and the floor close-to-close return −1.65%, so the floor effect depends on the benchmark. Floor events cluster on market-wide down days (740 of 2,111 remain without days on which the market fell more than 2%), and the floor gap is not significant in the least liquid tercile (</w:t>
       </w:r>
       <w:r>
         <w:rPr>
@@ -7418,7 +7507,7 @@
         <w:rPr>
           <w:sz w:val="19"/>
         </w:rPr>
-        <w:t xml:space="preserve">+5 close. Crash days have a market return (Equation (2)) below −2%. Close-to-close need not equal the sum of the components because returns compound.</w:t>
+        <w:t xml:space="preserve">+5 close. Crash days have a market return (Equation (2)) below −2%. Close-to-close need not equal the sum of the components because returns compound. Events are the stock-days that meet the event definition and have the stated return.</w:t>
       </w:r>
     </w:p>
     <w:tbl>
@@ -12829,7 +12918,7 @@
         <w:pStyle w:val="BodyText"/>
       </w:pPr>
       <w:r>
-        <w:t xml:space="preserve">No earlier study reports post-limit returns in a form that matches ours, so Table 5 compares signs, timing, and mechanism.</w:t>
+        <w:t xml:space="preserve">None of the studies we reviewed reports the next-day abnormal return, overnight gap, or intraday return after a limit close in a form that matches ours, so Table 5 compares signs, timing, and mechanism.</w:t>
       </w:r>
     </w:p>
     <w:p>
@@ -12854,10 +12943,10 @@
         <w:tblLayout w:type="fixed"/>
       </w:tblPr>
       <w:tblGrid>
-        <w:gridCol w:w="2256"/>
-        <w:gridCol w:w="1475"/>
-        <w:gridCol w:w="2731"/>
-        <w:gridCol w:w="2606"/>
+        <w:gridCol w:w="2234"/>
+        <w:gridCol w:w="1460"/>
+        <w:gridCol w:w="2793"/>
+        <w:gridCol w:w="2581"/>
       </w:tblGrid>
       <w:tr>
         <w:trPr>
@@ -12867,7 +12956,7 @@
         </w:trPr>
         <w:tc>
           <w:tcPr>
-            <w:tcW w:type="dxa" w:w="2256"/>
+            <w:tcW w:type="dxa" w:w="2234"/>
             <w:tcBorders>
               <w:top w:val="single" w:sz="8" w:color="000000" w:space="0"/>
               <w:bottom w:val="single" w:sz="6" w:color="000000" w:space="0"/>
@@ -12892,7 +12981,7 @@
         </w:tc>
         <w:tc>
           <w:tcPr>
-            <w:tcW w:type="dxa" w:w="1475"/>
+            <w:tcW w:type="dxa" w:w="1460"/>
             <w:tcBorders>
               <w:top w:val="single" w:sz="8" w:color="000000" w:space="0"/>
               <w:bottom w:val="single" w:sz="6" w:color="000000" w:space="0"/>
@@ -12917,7 +13006,7 @@
         </w:tc>
         <w:tc>
           <w:tcPr>
-            <w:tcW w:type="dxa" w:w="2731"/>
+            <w:tcW w:type="dxa" w:w="2793"/>
             <w:tcBorders>
               <w:top w:val="single" w:sz="8" w:color="000000" w:space="0"/>
               <w:bottom w:val="single" w:sz="6" w:color="000000" w:space="0"/>
@@ -12942,7 +13031,7 @@
         </w:tc>
         <w:tc>
           <w:tcPr>
-            <w:tcW w:type="dxa" w:w="2606"/>
+            <w:tcW w:type="dxa" w:w="2581"/>
             <w:tcBorders>
               <w:top w:val="single" w:sz="8" w:color="000000" w:space="0"/>
               <w:bottom w:val="single" w:sz="6" w:color="000000" w:space="0"/>
@@ -12972,7 +13061,7 @@
         </w:trPr>
         <w:tc>
           <w:tcPr>
-            <w:tcW w:type="dxa" w:w="2256"/>
+            <w:tcW w:type="dxa" w:w="2234"/>
           </w:tcPr>
           <w:p>
             <w:pPr>
@@ -12992,7 +13081,7 @@
         </w:tc>
         <w:tc>
           <w:tcPr>
-            <w:tcW w:type="dxa" w:w="1475"/>
+            <w:tcW w:type="dxa" w:w="1460"/>
           </w:tcPr>
           <w:p>
             <w:pPr>
@@ -13012,7 +13101,7 @@
         </w:tc>
         <w:tc>
           <w:tcPr>
-            <w:tcW w:type="dxa" w:w="2731"/>
+            <w:tcW w:type="dxa" w:w="2793"/>
           </w:tcPr>
           <w:p>
             <w:pPr>
@@ -13032,7 +13121,7 @@
         </w:tc>
         <w:tc>
           <w:tcPr>
-            <w:tcW w:type="dxa" w:w="2606"/>
+            <w:tcW w:type="dxa" w:w="2581"/>
           </w:tcPr>
           <w:p>
             <w:pPr>
@@ -13057,7 +13146,7 @@
         </w:trPr>
         <w:tc>
           <w:tcPr>
-            <w:tcW w:type="dxa" w:w="2256"/>
+            <w:tcW w:type="dxa" w:w="2234"/>
           </w:tcPr>
           <w:p>
             <w:pPr>
@@ -13077,7 +13166,7 @@
         </w:tc>
         <w:tc>
           <w:tcPr>
-            <w:tcW w:type="dxa" w:w="1475"/>
+            <w:tcW w:type="dxa" w:w="1460"/>
           </w:tcPr>
           <w:p>
             <w:pPr>
@@ -13097,7 +13186,7 @@
         </w:tc>
         <w:tc>
           <w:tcPr>
-            <w:tcW w:type="dxa" w:w="2731"/>
+            <w:tcW w:type="dxa" w:w="2793"/>
           </w:tcPr>
           <w:p>
             <w:pPr>
@@ -13117,7 +13206,7 @@
         </w:tc>
         <w:tc>
           <w:tcPr>
-            <w:tcW w:type="dxa" w:w="2606"/>
+            <w:tcW w:type="dxa" w:w="2581"/>
           </w:tcPr>
           <w:p>
             <w:pPr>
@@ -13142,7 +13231,7 @@
         </w:trPr>
         <w:tc>
           <w:tcPr>
-            <w:tcW w:type="dxa" w:w="2256"/>
+            <w:tcW w:type="dxa" w:w="2234"/>
           </w:tcPr>
           <w:p>
             <w:pPr>
@@ -13162,7 +13251,7 @@
         </w:tc>
         <w:tc>
           <w:tcPr>
-            <w:tcW w:type="dxa" w:w="1475"/>
+            <w:tcW w:type="dxa" w:w="1460"/>
           </w:tcPr>
           <w:p>
             <w:pPr>
@@ -13182,7 +13271,7 @@
         </w:tc>
         <w:tc>
           <w:tcPr>
-            <w:tcW w:type="dxa" w:w="2731"/>
+            <w:tcW w:type="dxa" w:w="2793"/>
           </w:tcPr>
           <w:p>
             <w:pPr>
@@ -13202,7 +13291,7 @@
         </w:tc>
         <w:tc>
           <w:tcPr>
-            <w:tcW w:type="dxa" w:w="2606"/>
+            <w:tcW w:type="dxa" w:w="2581"/>
           </w:tcPr>
           <w:p>
             <w:pPr>
@@ -13227,7 +13316,7 @@
         </w:trPr>
         <w:tc>
           <w:tcPr>
-            <w:tcW w:type="dxa" w:w="2256"/>
+            <w:tcW w:type="dxa" w:w="2234"/>
           </w:tcPr>
           <w:p>
             <w:pPr>
@@ -13247,7 +13336,7 @@
         </w:tc>
         <w:tc>
           <w:tcPr>
-            <w:tcW w:type="dxa" w:w="1475"/>
+            <w:tcW w:type="dxa" w:w="1460"/>
           </w:tcPr>
           <w:p>
             <w:pPr>
@@ -13267,7 +13356,7 @@
         </w:tc>
         <w:tc>
           <w:tcPr>
-            <w:tcW w:type="dxa" w:w="2731"/>
+            <w:tcW w:type="dxa" w:w="2793"/>
           </w:tcPr>
           <w:p>
             <w:pPr>
@@ -13287,7 +13376,7 @@
         </w:tc>
         <w:tc>
           <w:tcPr>
-            <w:tcW w:type="dxa" w:w="2606"/>
+            <w:tcW w:type="dxa" w:w="2581"/>
           </w:tcPr>
           <w:p>
             <w:pPr>
@@ -13312,7 +13401,7 @@
         </w:trPr>
         <w:tc>
           <w:tcPr>
-            <w:tcW w:type="dxa" w:w="2256"/>
+            <w:tcW w:type="dxa" w:w="2234"/>
           </w:tcPr>
           <w:p>
             <w:pPr>
@@ -13332,7 +13421,7 @@
         </w:tc>
         <w:tc>
           <w:tcPr>
-            <w:tcW w:type="dxa" w:w="1475"/>
+            <w:tcW w:type="dxa" w:w="1460"/>
           </w:tcPr>
           <w:p>
             <w:pPr>
@@ -13352,7 +13441,7 @@
         </w:tc>
         <w:tc>
           <w:tcPr>
-            <w:tcW w:type="dxa" w:w="2731"/>
+            <w:tcW w:type="dxa" w:w="2793"/>
           </w:tcPr>
           <w:p>
             <w:pPr>
@@ -13372,7 +13461,7 @@
         </w:tc>
         <w:tc>
           <w:tcPr>
-            <w:tcW w:type="dxa" w:w="2606"/>
+            <w:tcW w:type="dxa" w:w="2581"/>
           </w:tcPr>
           <w:p>
             <w:pPr>
@@ -13397,7 +13486,7 @@
         </w:trPr>
         <w:tc>
           <w:tcPr>
-            <w:tcW w:type="dxa" w:w="2256"/>
+            <w:tcW w:type="dxa" w:w="2234"/>
           </w:tcPr>
           <w:p>
             <w:pPr>
@@ -13417,7 +13506,7 @@
         </w:tc>
         <w:tc>
           <w:tcPr>
-            <w:tcW w:type="dxa" w:w="1475"/>
+            <w:tcW w:type="dxa" w:w="1460"/>
           </w:tcPr>
           <w:p>
             <w:pPr>
@@ -13437,7 +13526,7 @@
         </w:tc>
         <w:tc>
           <w:tcPr>
-            <w:tcW w:type="dxa" w:w="2731"/>
+            <w:tcW w:type="dxa" w:w="2793"/>
           </w:tcPr>
           <w:p>
             <w:pPr>
@@ -13457,7 +13546,7 @@
         </w:tc>
         <w:tc>
           <w:tcPr>
-            <w:tcW w:type="dxa" w:w="2606"/>
+            <w:tcW w:type="dxa" w:w="2581"/>
           </w:tcPr>
           <w:p>
             <w:pPr>
@@ -13482,7 +13571,7 @@
         </w:trPr>
         <w:tc>
           <w:tcPr>
-            <w:tcW w:type="dxa" w:w="2256"/>
+            <w:tcW w:type="dxa" w:w="2234"/>
           </w:tcPr>
           <w:p>
             <w:pPr>
@@ -13502,7 +13591,7 @@
         </w:tc>
         <w:tc>
           <w:tcPr>
-            <w:tcW w:type="dxa" w:w="1475"/>
+            <w:tcW w:type="dxa" w:w="1460"/>
           </w:tcPr>
           <w:p>
             <w:pPr>
@@ -13522,7 +13611,7 @@
         </w:tc>
         <w:tc>
           <w:tcPr>
-            <w:tcW w:type="dxa" w:w="2731"/>
+            <w:tcW w:type="dxa" w:w="2793"/>
           </w:tcPr>
           <w:p>
             <w:pPr>
@@ -13542,7 +13631,7 @@
         </w:tc>
         <w:tc>
           <w:tcPr>
-            <w:tcW w:type="dxa" w:w="2606"/>
+            <w:tcW w:type="dxa" w:w="2581"/>
           </w:tcPr>
           <w:p>
             <w:pPr>
@@ -13567,7 +13656,7 @@
         </w:trPr>
         <w:tc>
           <w:tcPr>
-            <w:tcW w:type="dxa" w:w="2256"/>
+            <w:tcW w:type="dxa" w:w="2234"/>
           </w:tcPr>
           <w:p>
             <w:pPr>
@@ -13587,7 +13676,7 @@
         </w:tc>
         <w:tc>
           <w:tcPr>
-            <w:tcW w:type="dxa" w:w="1475"/>
+            <w:tcW w:type="dxa" w:w="1460"/>
           </w:tcPr>
           <w:p>
             <w:pPr>
@@ -13607,7 +13696,7 @@
         </w:tc>
         <w:tc>
           <w:tcPr>
-            <w:tcW w:type="dxa" w:w="2731"/>
+            <w:tcW w:type="dxa" w:w="2793"/>
           </w:tcPr>
           <w:p>
             <w:pPr>
@@ -13627,7 +13716,7 @@
         </w:tc>
         <w:tc>
           <w:tcPr>
-            <w:tcW w:type="dxa" w:w="2606"/>
+            <w:tcW w:type="dxa" w:w="2581"/>
           </w:tcPr>
           <w:p>
             <w:pPr>
@@ -13652,7 +13741,7 @@
         </w:trPr>
         <w:tc>
           <w:tcPr>
-            <w:tcW w:type="dxa" w:w="2256"/>
+            <w:tcW w:type="dxa" w:w="2234"/>
           </w:tcPr>
           <w:p>
             <w:pPr>
@@ -13672,7 +13761,7 @@
         </w:tc>
         <w:tc>
           <w:tcPr>
-            <w:tcW w:type="dxa" w:w="1475"/>
+            <w:tcW w:type="dxa" w:w="1460"/>
           </w:tcPr>
           <w:p>
             <w:pPr>
@@ -13692,7 +13781,7 @@
         </w:tc>
         <w:tc>
           <w:tcPr>
-            <w:tcW w:type="dxa" w:w="2731"/>
+            <w:tcW w:type="dxa" w:w="2793"/>
           </w:tcPr>
           <w:p>
             <w:pPr>
@@ -13712,7 +13801,7 @@
         </w:tc>
         <w:tc>
           <w:tcPr>
-            <w:tcW w:type="dxa" w:w="2606"/>
+            <w:tcW w:type="dxa" w:w="2581"/>
           </w:tcPr>
           <w:p>
             <w:pPr>
@@ -13737,7 +13826,7 @@
         </w:trPr>
         <w:tc>
           <w:tcPr>
-            <w:tcW w:type="dxa" w:w="2256"/>
+            <w:tcW w:type="dxa" w:w="2234"/>
           </w:tcPr>
           <w:p>
             <w:pPr>
@@ -13757,7 +13846,7 @@
         </w:tc>
         <w:tc>
           <w:tcPr>
-            <w:tcW w:type="dxa" w:w="1475"/>
+            <w:tcW w:type="dxa" w:w="1460"/>
           </w:tcPr>
           <w:p>
             <w:pPr>
@@ -13777,7 +13866,7 @@
         </w:tc>
         <w:tc>
           <w:tcPr>
-            <w:tcW w:type="dxa" w:w="2731"/>
+            <w:tcW w:type="dxa" w:w="2793"/>
           </w:tcPr>
           <w:p>
             <w:pPr>
@@ -13797,7 +13886,7 @@
         </w:tc>
         <w:tc>
           <w:tcPr>
-            <w:tcW w:type="dxa" w:w="2606"/>
+            <w:tcW w:type="dxa" w:w="2581"/>
           </w:tcPr>
           <w:p>
             <w:pPr>
@@ -13822,7 +13911,7 @@
         </w:trPr>
         <w:tc>
           <w:tcPr>
-            <w:tcW w:type="dxa" w:w="2256"/>
+            <w:tcW w:type="dxa" w:w="2234"/>
             <w:tcBorders>
               <w:bottom w:val="single" w:sz="8" w:color="000000" w:space="0"/>
             </w:tcBorders>
@@ -13844,7 +13933,7 @@
         </w:tc>
         <w:tc>
           <w:tcPr>
-            <w:tcW w:type="dxa" w:w="1475"/>
+            <w:tcW w:type="dxa" w:w="1460"/>
             <w:tcBorders>
               <w:bottom w:val="single" w:sz="8" w:color="000000" w:space="0"/>
             </w:tcBorders>
@@ -13866,7 +13955,7 @@
         </w:tc>
         <w:tc>
           <w:tcPr>
-            <w:tcW w:type="dxa" w:w="2731"/>
+            <w:tcW w:type="dxa" w:w="2793"/>
             <w:tcBorders>
               <w:bottom w:val="single" w:sz="8" w:color="000000" w:space="0"/>
             </w:tcBorders>
@@ -13882,7 +13971,7 @@
                 <w:rFonts w:ascii="Times New Roman" w:hAnsi="Times New Roman"/>
                 <w:sz w:val="17"/>
               </w:rPr>
-              <w:t xml:space="preserve">65% of 452 anomalies fail the 1.96 hurdle; a new factor needs</w:t>
+              <w:t xml:space="preserve">With microcaps mitigated, 65% of 452 anomalies fail the 1.96 hurdle; a new factor needs</w:t>
             </w:r>
             <w:r>
               <w:rPr>
@@ -13918,7 +14007,7 @@
         </w:tc>
         <w:tc>
           <w:tcPr>
-            <w:tcW w:type="dxa" w:w="2606"/>
+            <w:tcW w:type="dxa" w:w="2581"/>
             <w:tcBorders>
               <w:bottom w:val="single" w:sz="8" w:color="000000" w:space="0"/>
             </w:tcBorders>

</xml_diff>

<commit_message>
Round 4 revision: bounded literature claims and Appendix B search strategy, sample accounting, consistent-with wording, KRX quarterly balance/placebo/DiD (Table 5), family sensitivity, tick-free definitions (C28-C32)
Co-Authored-By: Claude Opus 5.5 <noreply@anthropic.com>
Claude-Session: https://claude.ai/code/session_011zPDaCYE4jmmpoRvPu4SUX
</commit_message>
<xml_diff>
--- a/paper2/final/Paper_C_Closing_at_the_limit.docx
+++ b/paper2/final/Paper_C_Closing_at_the_limit.docx
@@ -153,7 +153,7 @@
         <w:t xml:space="preserve"> </w:t>
       </w:r>
       <w:r>
-        <w:t xml:space="preserve">Daily price limits aim to cool markets but can delay price discovery. Few studies trace prices after limit closes in emerging markets, and none we know of tests the limit against other candidate signals. For 347 stocks on the Ho Chi Minh Stock Exchange from August 2024 to September 2026, we run 26 tests under false-discovery-rate control: four price-limit event tests and 22 price- and volume-based characteristics. All four limit tests survive; none of the 22 lower-powered characteristic tests does. After a ceiling close, the next-day abnormal return of 1.7% is an overnight gap of 2.2% less an intraday reversal of 0.5%, and the gap exceeds that after rises of 5% to 6.5% by 2.7 percentage points. A buyer at the next open loses 0.7% against the market by the fifth close. Delayed price discovery fits the pattern, but so do news and attention; without news or order-book data we cannot separate them.</w:t>
+        <w:t xml:space="preserve">Daily price limits aim to cool markets but can delay price discovery. Few studies trace prices after limit closes in emerging markets, and, among the studies identified by our search (Appendix B), none tests the limit against other candidate signals. For 347 stocks on the Ho Chi Minh Stock Exchange from August 2024 to September 2026, we run 26 tests under false-discovery-rate control: four price-limit event tests and 22 price- and volume-based characteristics. All four limit tests survive; none of the 22 lower-powered characteristic tests does. After a ceiling close, the next-day abnormal return of 1.7% is an overnight gap of 2.2% less an intraday reversal of 0.5%, and the gap exceeds that after rises of 5% to 6.5% by 2.7 percentage points. A buyer at the next open loses 0.7% against the market by the fifth close. The pattern is consistent with delayed price discovery, but also with news, attention, and opening-auction overshooting; without news or order-book data we cannot separate them.</w:t>
       </w:r>
     </w:p>
     <w:p>
@@ -215,7 +215,7 @@
         <w:pStyle w:val="BodyText"/>
       </w:pPr>
       <w:r>
-        <w:t xml:space="preserve">Studies of band changes document effects on volatility, liquidity, and crash risk (Jia et al., 2024; Lien et al., 2019; Qi, 2023), and account-level data show that large investors buy on the limit day and sell on the next (Chen et al., 2019). Of the studies we reviewed, only Huang et al. (2001) describe the overnight-then-intraday pattern after limit hits, and the records we could access give no magnitudes. None measures the overnight gap and the intraday return after a limit close against a benchmark, places the limit result in a family of tests that controls for the other price-based signals a researcher could have examined, or examines the 2025 move of HOSE to a new trading platform.</w:t>
+        <w:t xml:space="preserve">Studies of band changes document effects on volatility, liquidity, and crash risk (Jia et al., 2024; Lien et al., 2019; Qi, 2023), and account-level data show that large investors buy on the limit day and sell on the next (Chen et al., 2019). Among the studies identified by the search described in Appendix B, only Huang et al. (2001) describe the overnight-then-intraday pattern after limit hits, and the records we could access give no magnitudes. None measures the overnight gap and the intraday return after a limit close against a benchmark, places the limit result in a family of tests that controls for the other price-based signals a researcher could have examined, or examines the 2025 move of HOSE to a new trading platform.</w:t>
       </w:r>
     </w:p>
     <w:p>
@@ -353,7 +353,7 @@
         <w:t xml:space="preserve">t</w:t>
       </w:r>
       <w:r>
-        <w:t xml:space="preserve">-statistic above 3.0, Harvey and Liu (2020) tie the hurdle to a chosen FDR, Chordia et al. (2020) put multiple-testing thresholds for cross-sectional regressions near 3.4, and Hou et al. (2020) find that, with microcaps mitigated, 65% of 452 anomalies fail the single-test hurdle of 1.96. Petersen (2009) compares standard-error estimators for panel data, which motivates our alternative clusters, and Gutierrez and Kelley (2008) study weekly returns, the frequency of our regressions. For Vietnam, Huang et al. (2023) find a size effect and an earnings-to-price effect; we found no peer-reviewed study of post-limit returns on HOSE.</w:t>
+        <w:t xml:space="preserve">-statistic above 3.0, Harvey and Liu (2020) tie the hurdle to a chosen FDR, Chordia et al. (2020) put multiple-testing thresholds for cross-sectional regressions near 3.4, and Hou et al. (2020) find that, with microcaps mitigated, 65% of 452 anomalies fail the single-test hurdle of 1.96. Petersen (2009) compares standard-error estimators for panel data, which motivates our alternative clusters, and Gutierrez and Kelley (2008) study weekly returns, the frequency of our regressions. For Vietnam, Huang et al. (2023) find a size effect and an earnings-to-price effect; our search (Appendix B) identified no peer-reviewed study of post-limit returns on HOSE.</w:t>
       </w:r>
     </w:p>
     <w:p>
@@ -371,7 +371,7 @@
         <w:t xml:space="preserve"> </w:t>
       </w:r>
       <w:r>
-        <w:t xml:space="preserve">These studies compare band regimes, sort stocks by limit exposure, or split overnight and intraday returns for all stocks. Only Huang et al. (2001) link limit hits to the overnight-intraday split, and none controls for multiple testing or uses the 2025 platform change. If a limit delays price discovery, a ceiling close predicts a positive next-day abnormal return and a floor close a negative one (H</w:t>
+        <w:t xml:space="preserve">These studies compare band regimes, sort stocks by limit exposure, or split overnight and intraday returns for all stocks. Among the studies our search identified, only Huang et al. (2001) link limit hits to the overnight-intraday split, and none controls for multiple testing or uses the 2025 platform change. If a limit delays price discovery, a ceiling close predicts a positive next-day abnormal return and a floor close a negative one (H</w:t>
       </w:r>
       <w:r>
         <w:rPr>
@@ -3054,6 +3054,57 @@
           <w:bCs/>
           <w:b/>
         </w:rPr>
+        <w:t xml:space="preserve">Samples.</w:t>
+      </w:r>
+      <w:r>
+        <w:t xml:space="preserve"> </w:t>
+      </w:r>
+      <w:r>
+        <w:t xml:space="preserve">The event definition uses only returns and the close-at-high (close-at-low) condition, which proportional price adjustment by the vendor leaves unchanged; the exact-hit split is a diagnostic only (Section 7). Event counts differ across exhibits because each outcome needs different data. Table 1 requires returns on all five days after the event (3,187 ceiling and 2,105 floor events). Tables 2 to 4 require the open and close of day</w:t>
+      </w:r>
+      <w:r>
+        <w:t xml:space="preserve"> </w:t>
+      </w:r>
+      <w:r>
+        <w:rPr>
+          <w:iCs/>
+          <w:i/>
+        </w:rPr>
+        <w:t xml:space="preserve">d</w:t>
+      </w:r>
+      <w:r>
+        <w:t xml:space="preserve">+1 (3,199 and 2,111 events), the open-to-day-</w:t>
+      </w:r>
+      <w:r>
+        <w:rPr>
+          <w:iCs/>
+          <w:i/>
+        </w:rPr>
+        <w:t xml:space="preserve">d</w:t>
+      </w:r>
+      <w:r>
+        <w:t xml:space="preserve">+5 return also requires the day-</w:t>
+      </w:r>
+      <w:r>
+        <w:rPr>
+          <w:iCs/>
+          <w:i/>
+        </w:rPr>
+        <w:t xml:space="preserve">d</w:t>
+      </w:r>
+      <w:r>
+        <w:t xml:space="preserve">+5 close, and the control benchmark requires at least 30 control stocks on the date (3,100 and 2,047 events). Figure 2 uses event days up to the second-to-last trading day (3,220 ceiling events). No event is dropped for any other reason.</w:t>
+      </w:r>
+    </w:p>
+    <w:p>
+      <w:pPr>
+        <w:pStyle w:val="BodyText"/>
+      </w:pPr>
+      <w:r>
+        <w:rPr>
+          <w:bCs/>
+          <w:b/>
+        </w:rPr>
         <w:t xml:space="preserve">Inference.</w:t>
       </w:r>
       <w:r>
@@ -4957,7 +5008,7 @@
         <w:t xml:space="preserve">t</w:t>
       </w:r>
       <w:r>
-        <w:t xml:space="preserve">| exceeds 1.96. Lookbacks overlap the discovery half, so the confirmation half is not a strict hold-out, and the weekly regressions (from day 120) and event window (from day 61) cover different spans.</w:t>
+        <w:t xml:space="preserve">| exceeds 1.96. Lookbacks overlap the discovery half, so the confirmation half is not a strict hold-out, and the weekly regressions (from day 120) and event window (from day 61) cover different spans. We place the four event tests and the 22 characteristics in one family because the analysis plan treated all 26 as candidate predictors of short-horizon returns examined on the same data, so the limit result pays for every signal we examined; Section 5 reports the event tests under alternative family definitions.</w:t>
       </w:r>
     </w:p>
     <w:p>
@@ -12660,6 +12711,1134 @@
     <w:p>
       <w:pPr>
         <w:pStyle w:val="BodyText"/>
+      </w:pPr>
+      <w:r>
+        <w:t xml:space="preserve">Because the events are unbalanced in time, Table 5 reports them by calendar quarter. The ceiling gap is positive and significant in each of the 8 quarters (</w:t>
+      </w:r>
+      <w:r>
+        <w:rPr>
+          <w:iCs/>
+          <w:i/>
+        </w:rPr>
+        <w:t xml:space="preserve">t</w:t>
+      </w:r>
+      <w:r>
+        <w:t xml:space="preserve"> </w:t>
+      </w:r>
+      <w:r>
+        <w:t xml:space="preserve">from 2.5 to 16.8); its weakest quarter, 2025-Q2, contains the platform change. The floor gap is negative in every quarter and significant at the 5% level in 7 of them. Placebo break dates on the first trading day of each month from January 2025 to April 2026 give ceiling-gap differences between −0.45 and 0.72 percentage points (|</w:t>
+      </w:r>
+      <w:r>
+        <w:rPr>
+          <w:iCs/>
+          <w:i/>
+        </w:rPr>
+        <w:t xml:space="preserve">t</w:t>
+      </w:r>
+      <w:r>
+        <w:t xml:space="preserve">| at most 1.4); the split at 5 May 2025 gives the largest difference, 0.85 points, but it is not significant either (</w:t>
+      </w:r>
+      <w:r>
+        <w:rPr>
+          <w:iCs/>
+          <w:i/>
+        </w:rPr>
+        <w:t xml:space="preserve">t</w:t>
+      </w:r>
+      <w:r>
+        <w:t xml:space="preserve"> </w:t>
+      </w:r>
+      <w:r>
+        <w:t xml:space="preserve">= 1.6). The floor-gap difference is negative at 11 of 15 placebo dates, which points to a gradual change in the floor gap over the sample rather than a break at the platform change. A difference-in-differences regression that compares limit closes with 5–6.5% movers that also closed at the extreme gives the same answer (repository table C31): the excess ceiling gap was 2.91 percentage points before the change (</w:t>
+      </w:r>
+      <w:r>
+        <w:rPr>
+          <w:iCs/>
+          <w:i/>
+        </w:rPr>
+        <w:t xml:space="preserve">t</w:t>
+      </w:r>
+      <w:r>
+        <w:t xml:space="preserve"> </w:t>
+      </w:r>
+      <w:r>
+        <w:t xml:space="preserve">= 6.2) and changed by 0.38 points after it (</w:t>
+      </w:r>
+      <w:r>
+        <w:rPr>
+          <w:iCs/>
+          <w:i/>
+        </w:rPr>
+        <w:t xml:space="preserve">t</w:t>
+      </w:r>
+      <w:r>
+        <w:t xml:space="preserve"> </w:t>
+      </w:r>
+      <w:r>
+        <w:t xml:space="preserve">= 0.8), and the excess floor gap was −1.62 points before (</w:t>
+      </w:r>
+      <w:r>
+        <w:rPr>
+          <w:iCs/>
+          <w:i/>
+        </w:rPr>
+        <w:t xml:space="preserve">t</w:t>
+      </w:r>
+      <w:r>
+        <w:t xml:space="preserve"> </w:t>
+      </w:r>
+      <w:r>
+        <w:t xml:space="preserve">= −6.6) and changed by −0.49 points (</w:t>
+      </w:r>
+      <w:r>
+        <w:rPr>
+          <w:iCs/>
+          <w:i/>
+        </w:rPr>
+        <w:t xml:space="preserve">t</w:t>
+      </w:r>
+      <w:r>
+        <w:t xml:space="preserve"> </w:t>
+      </w:r>
+      <w:r>
+        <w:t xml:space="preserve">= −1.5). The break at the limit is therefore present before the change and does not depend on the post-change period, although the significance of the raw close-to-close return does.</w:t>
+      </w:r>
+    </w:p>
+    <w:p>
+      <w:pPr>
+        <w:pStyle w:val="BodyText"/>
+        <w:keepNext/>
+        <w:spacing w:after="60"/>
+      </w:pPr>
+      <w:r>
+        <w:rPr>
+          <w:sz w:val="19"/>
+        </w:rPr>
+        <w:t xml:space="preserve">Table 5. Events and overnight gaps (percent, market-adjusted) by calendar quarter of the opening that defines the gap, with two-way-clustered</w:t>
+      </w:r>
+      <w:r>
+        <w:rPr>
+          <w:sz w:val="19"/>
+        </w:rPr>
+        <w:t xml:space="preserve"> </w:t>
+      </w:r>
+      <w:r>
+        <w:rPr>
+          <w:iCs/>
+          <w:i/>
+          <w:sz w:val="19"/>
+        </w:rPr>
+        <w:t xml:space="preserve">t</w:t>
+      </w:r>
+      <w:r>
+        <w:rPr>
+          <w:sz w:val="19"/>
+        </w:rPr>
+        <w:t xml:space="preserve">-statistics in parentheses. The KRX platform change falls in 2025-Q2.</w:t>
+      </w:r>
+    </w:p>
+    <w:tbl>
+      <w:tblPr>
+        <w:tblStyle w:val="Table"/>
+        <w:tblW w:type="dxa" w:w="9070"/>
+        <w:tblLook w:firstRow="1" w:lastRow="0" w:firstColumn="0" w:lastColumn="0" w:noHBand="0" w:noVBand="0" w:val="0020"/>
+        <w:jc w:val="start"/>
+        <w:tblLayout w:type="fixed"/>
+      </w:tblPr>
+      <w:tblGrid>
+        <w:gridCol w:w="2093"/>
+        <w:gridCol w:w="1453"/>
+        <w:gridCol w:w="2034"/>
+        <w:gridCol w:w="1308"/>
+        <w:gridCol w:w="2180"/>
+      </w:tblGrid>
+      <w:tr>
+        <w:trPr>
+          <w:tblHeader w:val="true"/>
+          <w:tblHeader/>
+          <w:cantSplit/>
+        </w:trPr>
+        <w:tc>
+          <w:tcPr>
+            <w:tcW w:type="dxa" w:w="2093"/>
+            <w:tcBorders>
+              <w:top w:val="single" w:sz="8" w:color="000000" w:space="0"/>
+              <w:bottom w:val="single" w:sz="6" w:color="000000" w:space="0"/>
+            </w:tcBorders>
+          </w:tcPr>
+          <w:p>
+            <w:pPr>
+              <w:pStyle w:val="Compact"/>
+              <w:keepNext/>
+              <w:spacing w:after="20" w:before="20" w:line="240" w:lineRule="auto"/>
+              <w:jc w:val="left"/>
+            </w:pPr>
+            <w:r>
+              <w:rPr>
+                <w:rFonts w:ascii="Times New Roman" w:hAnsi="Times New Roman"/>
+                <w:b/>
+                <w:sz w:val="17"/>
+              </w:rPr>
+              <w:t xml:space="preserve">Quarter</w:t>
+            </w:r>
+          </w:p>
+        </w:tc>
+        <w:tc>
+          <w:tcPr>
+            <w:tcW w:type="dxa" w:w="1453"/>
+            <w:tcBorders>
+              <w:top w:val="single" w:sz="8" w:color="000000" w:space="0"/>
+              <w:bottom w:val="single" w:sz="6" w:color="000000" w:space="0"/>
+            </w:tcBorders>
+          </w:tcPr>
+          <w:p>
+            <w:pPr>
+              <w:pStyle w:val="Compact"/>
+              <w:keepNext/>
+              <w:spacing w:after="20" w:before="20" w:line="240" w:lineRule="auto"/>
+              <w:jc w:val="center"/>
+            </w:pPr>
+            <w:r>
+              <w:rPr>
+                <w:rFonts w:ascii="Times New Roman" w:hAnsi="Times New Roman"/>
+                <w:b/>
+                <w:sz w:val="17"/>
+              </w:rPr>
+              <w:t xml:space="preserve">Ceiling events</w:t>
+            </w:r>
+          </w:p>
+        </w:tc>
+        <w:tc>
+          <w:tcPr>
+            <w:tcW w:type="dxa" w:w="2034"/>
+            <w:tcBorders>
+              <w:top w:val="single" w:sz="8" w:color="000000" w:space="0"/>
+              <w:bottom w:val="single" w:sz="6" w:color="000000" w:space="0"/>
+            </w:tcBorders>
+          </w:tcPr>
+          <w:p>
+            <w:pPr>
+              <w:pStyle w:val="Compact"/>
+              <w:keepNext/>
+              <w:spacing w:after="20" w:before="20" w:line="240" w:lineRule="auto"/>
+              <w:jc w:val="center"/>
+            </w:pPr>
+            <w:r>
+              <w:rPr>
+                <w:rFonts w:ascii="Times New Roman" w:hAnsi="Times New Roman"/>
+                <w:b/>
+                <w:sz w:val="17"/>
+              </w:rPr>
+              <w:t xml:space="preserve">Ceiling gap</w:t>
+            </w:r>
+          </w:p>
+        </w:tc>
+        <w:tc>
+          <w:tcPr>
+            <w:tcW w:type="dxa" w:w="1308"/>
+            <w:tcBorders>
+              <w:top w:val="single" w:sz="8" w:color="000000" w:space="0"/>
+              <w:bottom w:val="single" w:sz="6" w:color="000000" w:space="0"/>
+            </w:tcBorders>
+          </w:tcPr>
+          <w:p>
+            <w:pPr>
+              <w:pStyle w:val="Compact"/>
+              <w:keepNext/>
+              <w:spacing w:after="20" w:before="20" w:line="240" w:lineRule="auto"/>
+              <w:jc w:val="center"/>
+            </w:pPr>
+            <w:r>
+              <w:rPr>
+                <w:rFonts w:ascii="Times New Roman" w:hAnsi="Times New Roman"/>
+                <w:b/>
+                <w:sz w:val="17"/>
+              </w:rPr>
+              <w:t xml:space="preserve">Floor events</w:t>
+            </w:r>
+          </w:p>
+        </w:tc>
+        <w:tc>
+          <w:tcPr>
+            <w:tcW w:type="dxa" w:w="2180"/>
+            <w:tcBorders>
+              <w:top w:val="single" w:sz="8" w:color="000000" w:space="0"/>
+              <w:bottom w:val="single" w:sz="6" w:color="000000" w:space="0"/>
+            </w:tcBorders>
+          </w:tcPr>
+          <w:p>
+            <w:pPr>
+              <w:pStyle w:val="Compact"/>
+              <w:keepNext/>
+              <w:spacing w:after="20" w:before="20" w:line="240" w:lineRule="auto"/>
+              <w:jc w:val="center"/>
+            </w:pPr>
+            <w:r>
+              <w:rPr>
+                <w:rFonts w:ascii="Times New Roman" w:hAnsi="Times New Roman"/>
+                <w:b/>
+                <w:sz w:val="17"/>
+              </w:rPr>
+              <w:t xml:space="preserve">Floor gap</w:t>
+            </w:r>
+          </w:p>
+        </w:tc>
+      </w:tr>
+      <w:tr>
+        <w:trPr>
+          <w:cantSplit/>
+        </w:trPr>
+        <w:tc>
+          <w:tcPr>
+            <w:tcW w:type="dxa" w:w="2093"/>
+          </w:tcPr>
+          <w:p>
+            <w:pPr>
+              <w:pStyle w:val="Compact"/>
+              <w:keepNext/>
+              <w:spacing w:after="20" w:before="20" w:line="240" w:lineRule="auto"/>
+              <w:jc w:val="left"/>
+            </w:pPr>
+            <w:r>
+              <w:rPr>
+                <w:rFonts w:ascii="Times New Roman" w:hAnsi="Times New Roman"/>
+                <w:sz w:val="17"/>
+              </w:rPr>
+              <w:t xml:space="preserve">2024-Q4</w:t>
+            </w:r>
+          </w:p>
+        </w:tc>
+        <w:tc>
+          <w:tcPr>
+            <w:tcW w:type="dxa" w:w="1453"/>
+          </w:tcPr>
+          <w:p>
+            <w:pPr>
+              <w:pStyle w:val="Compact"/>
+              <w:keepNext/>
+              <w:spacing w:after="20" w:before="20" w:line="240" w:lineRule="auto"/>
+              <w:jc w:val="center"/>
+            </w:pPr>
+            <w:r>
+              <w:rPr>
+                <w:rFonts w:ascii="Times New Roman" w:hAnsi="Times New Roman"/>
+                <w:sz w:val="17"/>
+              </w:rPr>
+              <w:t xml:space="preserve">177</w:t>
+            </w:r>
+          </w:p>
+        </w:tc>
+        <w:tc>
+          <w:tcPr>
+            <w:tcW w:type="dxa" w:w="2034"/>
+          </w:tcPr>
+          <w:p>
+            <w:pPr>
+              <w:pStyle w:val="Compact"/>
+              <w:keepNext/>
+              <w:spacing w:after="20" w:before="20" w:line="240" w:lineRule="auto"/>
+              <w:jc w:val="center"/>
+            </w:pPr>
+            <w:r>
+              <w:rPr>
+                <w:rFonts w:ascii="Times New Roman" w:hAnsi="Times New Roman"/>
+                <w:sz w:val="17"/>
+              </w:rPr>
+              <w:t xml:space="preserve">2.16 (5.6)</w:t>
+            </w:r>
+          </w:p>
+        </w:tc>
+        <w:tc>
+          <w:tcPr>
+            <w:tcW w:type="dxa" w:w="1308"/>
+          </w:tcPr>
+          <w:p>
+            <w:pPr>
+              <w:pStyle w:val="Compact"/>
+              <w:keepNext/>
+              <w:spacing w:after="20" w:before="20" w:line="240" w:lineRule="auto"/>
+              <w:jc w:val="center"/>
+            </w:pPr>
+            <w:r>
+              <w:rPr>
+                <w:rFonts w:ascii="Times New Roman" w:hAnsi="Times New Roman"/>
+                <w:sz w:val="17"/>
+              </w:rPr>
+              <w:t xml:space="preserve">48</w:t>
+            </w:r>
+          </w:p>
+        </w:tc>
+        <w:tc>
+          <w:tcPr>
+            <w:tcW w:type="dxa" w:w="2180"/>
+          </w:tcPr>
+          <w:p>
+            <w:pPr>
+              <w:pStyle w:val="Compact"/>
+              <w:keepNext/>
+              <w:spacing w:after="20" w:before="20" w:line="240" w:lineRule="auto"/>
+              <w:jc w:val="center"/>
+            </w:pPr>
+            <w:r>
+              <w:rPr>
+                <w:rFonts w:ascii="Times New Roman" w:hAnsi="Times New Roman"/>
+                <w:sz w:val="17"/>
+              </w:rPr>
+              <w:t xml:space="preserve">−1.50 (−2.5)</w:t>
+            </w:r>
+          </w:p>
+        </w:tc>
+      </w:tr>
+      <w:tr>
+        <w:trPr>
+          <w:cantSplit/>
+        </w:trPr>
+        <w:tc>
+          <w:tcPr>
+            <w:tcW w:type="dxa" w:w="2093"/>
+          </w:tcPr>
+          <w:p>
+            <w:pPr>
+              <w:pStyle w:val="Compact"/>
+              <w:keepNext/>
+              <w:spacing w:after="20" w:before="20" w:line="240" w:lineRule="auto"/>
+              <w:jc w:val="left"/>
+            </w:pPr>
+            <w:r>
+              <w:rPr>
+                <w:rFonts w:ascii="Times New Roman" w:hAnsi="Times New Roman"/>
+                <w:sz w:val="17"/>
+              </w:rPr>
+              <w:t xml:space="preserve">2025-Q1</w:t>
+            </w:r>
+          </w:p>
+        </w:tc>
+        <w:tc>
+          <w:tcPr>
+            <w:tcW w:type="dxa" w:w="1453"/>
+          </w:tcPr>
+          <w:p>
+            <w:pPr>
+              <w:pStyle w:val="Compact"/>
+              <w:keepNext/>
+              <w:spacing w:after="20" w:before="20" w:line="240" w:lineRule="auto"/>
+              <w:jc w:val="center"/>
+            </w:pPr>
+            <w:r>
+              <w:rPr>
+                <w:rFonts w:ascii="Times New Roman" w:hAnsi="Times New Roman"/>
+                <w:sz w:val="17"/>
+              </w:rPr>
+              <w:t xml:space="preserve">295</w:t>
+            </w:r>
+          </w:p>
+        </w:tc>
+        <w:tc>
+          <w:tcPr>
+            <w:tcW w:type="dxa" w:w="2034"/>
+          </w:tcPr>
+          <w:p>
+            <w:pPr>
+              <w:pStyle w:val="Compact"/>
+              <w:keepNext/>
+              <w:spacing w:after="20" w:before="20" w:line="240" w:lineRule="auto"/>
+              <w:jc w:val="center"/>
+            </w:pPr>
+            <w:r>
+              <w:rPr>
+                <w:rFonts w:ascii="Times New Roman" w:hAnsi="Times New Roman"/>
+                <w:sz w:val="17"/>
+              </w:rPr>
+              <w:t xml:space="preserve">2.78 (9.1)</w:t>
+            </w:r>
+          </w:p>
+        </w:tc>
+        <w:tc>
+          <w:tcPr>
+            <w:tcW w:type="dxa" w:w="1308"/>
+          </w:tcPr>
+          <w:p>
+            <w:pPr>
+              <w:pStyle w:val="Compact"/>
+              <w:keepNext/>
+              <w:spacing w:after="20" w:before="20" w:line="240" w:lineRule="auto"/>
+              <w:jc w:val="center"/>
+            </w:pPr>
+            <w:r>
+              <w:rPr>
+                <w:rFonts w:ascii="Times New Roman" w:hAnsi="Times New Roman"/>
+                <w:sz w:val="17"/>
+              </w:rPr>
+              <w:t xml:space="preserve">79</w:t>
+            </w:r>
+          </w:p>
+        </w:tc>
+        <w:tc>
+          <w:tcPr>
+            <w:tcW w:type="dxa" w:w="2180"/>
+          </w:tcPr>
+          <w:p>
+            <w:pPr>
+              <w:pStyle w:val="Compact"/>
+              <w:keepNext/>
+              <w:spacing w:after="20" w:before="20" w:line="240" w:lineRule="auto"/>
+              <w:jc w:val="center"/>
+            </w:pPr>
+            <w:r>
+              <w:rPr>
+                <w:rFonts w:ascii="Times New Roman" w:hAnsi="Times New Roman"/>
+                <w:sz w:val="17"/>
+              </w:rPr>
+              <w:t xml:space="preserve">−1.70 (−3.9)</w:t>
+            </w:r>
+          </w:p>
+        </w:tc>
+      </w:tr>
+      <w:tr>
+        <w:trPr>
+          <w:cantSplit/>
+        </w:trPr>
+        <w:tc>
+          <w:tcPr>
+            <w:tcW w:type="dxa" w:w="2093"/>
+          </w:tcPr>
+          <w:p>
+            <w:pPr>
+              <w:pStyle w:val="Compact"/>
+              <w:keepNext/>
+              <w:spacing w:after="20" w:before="20" w:line="240" w:lineRule="auto"/>
+              <w:jc w:val="left"/>
+            </w:pPr>
+            <w:r>
+              <w:rPr>
+                <w:rFonts w:ascii="Times New Roman" w:hAnsi="Times New Roman"/>
+                <w:sz w:val="17"/>
+              </w:rPr>
+              <w:t xml:space="preserve">2025-Q2</w:t>
+            </w:r>
+          </w:p>
+        </w:tc>
+        <w:tc>
+          <w:tcPr>
+            <w:tcW w:type="dxa" w:w="1453"/>
+          </w:tcPr>
+          <w:p>
+            <w:pPr>
+              <w:pStyle w:val="Compact"/>
+              <w:keepNext/>
+              <w:spacing w:after="20" w:before="20" w:line="240" w:lineRule="auto"/>
+              <w:jc w:val="center"/>
+            </w:pPr>
+            <w:r>
+              <w:rPr>
+                <w:rFonts w:ascii="Times New Roman" w:hAnsi="Times New Roman"/>
+                <w:sz w:val="17"/>
+              </w:rPr>
+              <w:t xml:space="preserve">686</w:t>
+            </w:r>
+          </w:p>
+        </w:tc>
+        <w:tc>
+          <w:tcPr>
+            <w:tcW w:type="dxa" w:w="2034"/>
+          </w:tcPr>
+          <w:p>
+            <w:pPr>
+              <w:pStyle w:val="Compact"/>
+              <w:keepNext/>
+              <w:spacing w:after="20" w:before="20" w:line="240" w:lineRule="auto"/>
+              <w:jc w:val="center"/>
+            </w:pPr>
+            <w:r>
+              <w:rPr>
+                <w:rFonts w:ascii="Times New Roman" w:hAnsi="Times New Roman"/>
+                <w:sz w:val="17"/>
+              </w:rPr>
+              <w:t xml:space="preserve">1.33 (2.5)</w:t>
+            </w:r>
+          </w:p>
+        </w:tc>
+        <w:tc>
+          <w:tcPr>
+            <w:tcW w:type="dxa" w:w="1308"/>
+          </w:tcPr>
+          <w:p>
+            <w:pPr>
+              <w:pStyle w:val="Compact"/>
+              <w:keepNext/>
+              <w:spacing w:after="20" w:before="20" w:line="240" w:lineRule="auto"/>
+              <w:jc w:val="center"/>
+            </w:pPr>
+            <w:r>
+              <w:rPr>
+                <w:rFonts w:ascii="Times New Roman" w:hAnsi="Times New Roman"/>
+                <w:sz w:val="17"/>
+              </w:rPr>
+              <w:t xml:space="preserve">802</w:t>
+            </w:r>
+          </w:p>
+        </w:tc>
+        <w:tc>
+          <w:tcPr>
+            <w:tcW w:type="dxa" w:w="2180"/>
+          </w:tcPr>
+          <w:p>
+            <w:pPr>
+              <w:pStyle w:val="Compact"/>
+              <w:keepNext/>
+              <w:spacing w:after="20" w:before="20" w:line="240" w:lineRule="auto"/>
+              <w:jc w:val="center"/>
+            </w:pPr>
+            <w:r>
+              <w:rPr>
+                <w:rFonts w:ascii="Times New Roman" w:hAnsi="Times New Roman"/>
+                <w:sz w:val="17"/>
+              </w:rPr>
+              <w:t xml:space="preserve">−0.34 (−1.5)</w:t>
+            </w:r>
+          </w:p>
+        </w:tc>
+      </w:tr>
+      <w:tr>
+        <w:trPr>
+          <w:cantSplit/>
+        </w:trPr>
+        <w:tc>
+          <w:tcPr>
+            <w:tcW w:type="dxa" w:w="2093"/>
+          </w:tcPr>
+          <w:p>
+            <w:pPr>
+              <w:pStyle w:val="Compact"/>
+              <w:keepNext/>
+              <w:spacing w:after="20" w:before="20" w:line="240" w:lineRule="auto"/>
+              <w:jc w:val="left"/>
+            </w:pPr>
+            <w:r>
+              <w:rPr>
+                <w:rFonts w:ascii="Times New Roman" w:hAnsi="Times New Roman"/>
+                <w:sz w:val="17"/>
+              </w:rPr>
+              <w:t xml:space="preserve">2025-Q3</w:t>
+            </w:r>
+          </w:p>
+        </w:tc>
+        <w:tc>
+          <w:tcPr>
+            <w:tcW w:type="dxa" w:w="1453"/>
+          </w:tcPr>
+          <w:p>
+            <w:pPr>
+              <w:pStyle w:val="Compact"/>
+              <w:keepNext/>
+              <w:spacing w:after="20" w:before="20" w:line="240" w:lineRule="auto"/>
+              <w:jc w:val="center"/>
+            </w:pPr>
+            <w:r>
+              <w:rPr>
+                <w:rFonts w:ascii="Times New Roman" w:hAnsi="Times New Roman"/>
+                <w:sz w:val="17"/>
+              </w:rPr>
+              <w:t xml:space="preserve">624</w:t>
+            </w:r>
+          </w:p>
+        </w:tc>
+        <w:tc>
+          <w:tcPr>
+            <w:tcW w:type="dxa" w:w="2034"/>
+          </w:tcPr>
+          <w:p>
+            <w:pPr>
+              <w:pStyle w:val="Compact"/>
+              <w:keepNext/>
+              <w:spacing w:after="20" w:before="20" w:line="240" w:lineRule="auto"/>
+              <w:jc w:val="center"/>
+            </w:pPr>
+            <w:r>
+              <w:rPr>
+                <w:rFonts w:ascii="Times New Roman" w:hAnsi="Times New Roman"/>
+                <w:sz w:val="17"/>
+              </w:rPr>
+              <w:t xml:space="preserve">2.99 (16.8)</w:t>
+            </w:r>
+          </w:p>
+        </w:tc>
+        <w:tc>
+          <w:tcPr>
+            <w:tcW w:type="dxa" w:w="1308"/>
+          </w:tcPr>
+          <w:p>
+            <w:pPr>
+              <w:pStyle w:val="Compact"/>
+              <w:keepNext/>
+              <w:spacing w:after="20" w:before="20" w:line="240" w:lineRule="auto"/>
+              <w:jc w:val="center"/>
+            </w:pPr>
+            <w:r>
+              <w:rPr>
+                <w:rFonts w:ascii="Times New Roman" w:hAnsi="Times New Roman"/>
+                <w:sz w:val="17"/>
+              </w:rPr>
+              <w:t xml:space="preserve">195</w:t>
+            </w:r>
+          </w:p>
+        </w:tc>
+        <w:tc>
+          <w:tcPr>
+            <w:tcW w:type="dxa" w:w="2180"/>
+          </w:tcPr>
+          <w:p>
+            <w:pPr>
+              <w:pStyle w:val="Compact"/>
+              <w:keepNext/>
+              <w:spacing w:after="20" w:before="20" w:line="240" w:lineRule="auto"/>
+              <w:jc w:val="center"/>
+            </w:pPr>
+            <w:r>
+              <w:rPr>
+                <w:rFonts w:ascii="Times New Roman" w:hAnsi="Times New Roman"/>
+                <w:sz w:val="17"/>
+              </w:rPr>
+              <w:t xml:space="preserve">−0.86 (−4.1)</w:t>
+            </w:r>
+          </w:p>
+        </w:tc>
+      </w:tr>
+      <w:tr>
+        <w:trPr>
+          <w:cantSplit/>
+        </w:trPr>
+        <w:tc>
+          <w:tcPr>
+            <w:tcW w:type="dxa" w:w="2093"/>
+          </w:tcPr>
+          <w:p>
+            <w:pPr>
+              <w:pStyle w:val="Compact"/>
+              <w:keepNext/>
+              <w:spacing w:after="20" w:before="20" w:line="240" w:lineRule="auto"/>
+              <w:jc w:val="left"/>
+            </w:pPr>
+            <w:r>
+              <w:rPr>
+                <w:rFonts w:ascii="Times New Roman" w:hAnsi="Times New Roman"/>
+                <w:sz w:val="17"/>
+              </w:rPr>
+              <w:t xml:space="preserve">2025-Q4</w:t>
+            </w:r>
+          </w:p>
+        </w:tc>
+        <w:tc>
+          <w:tcPr>
+            <w:tcW w:type="dxa" w:w="1453"/>
+          </w:tcPr>
+          <w:p>
+            <w:pPr>
+              <w:pStyle w:val="Compact"/>
+              <w:keepNext/>
+              <w:spacing w:after="20" w:before="20" w:line="240" w:lineRule="auto"/>
+              <w:jc w:val="center"/>
+            </w:pPr>
+            <w:r>
+              <w:rPr>
+                <w:rFonts w:ascii="Times New Roman" w:hAnsi="Times New Roman"/>
+                <w:sz w:val="17"/>
+              </w:rPr>
+              <w:t xml:space="preserve">426</w:t>
+            </w:r>
+          </w:p>
+        </w:tc>
+        <w:tc>
+          <w:tcPr>
+            <w:tcW w:type="dxa" w:w="2034"/>
+          </w:tcPr>
+          <w:p>
+            <w:pPr>
+              <w:pStyle w:val="Compact"/>
+              <w:keepNext/>
+              <w:spacing w:after="20" w:before="20" w:line="240" w:lineRule="auto"/>
+              <w:jc w:val="center"/>
+            </w:pPr>
+            <w:r>
+              <w:rPr>
+                <w:rFonts w:ascii="Times New Roman" w:hAnsi="Times New Roman"/>
+                <w:sz w:val="17"/>
+              </w:rPr>
+              <w:t xml:space="preserve">2.64 (7.4)</w:t>
+            </w:r>
+          </w:p>
+        </w:tc>
+        <w:tc>
+          <w:tcPr>
+            <w:tcW w:type="dxa" w:w="1308"/>
+          </w:tcPr>
+          <w:p>
+            <w:pPr>
+              <w:pStyle w:val="Compact"/>
+              <w:keepNext/>
+              <w:spacing w:after="20" w:before="20" w:line="240" w:lineRule="auto"/>
+              <w:jc w:val="center"/>
+            </w:pPr>
+            <w:r>
+              <w:rPr>
+                <w:rFonts w:ascii="Times New Roman" w:hAnsi="Times New Roman"/>
+                <w:sz w:val="17"/>
+              </w:rPr>
+              <w:t xml:space="preserve">280</w:t>
+            </w:r>
+          </w:p>
+        </w:tc>
+        <w:tc>
+          <w:tcPr>
+            <w:tcW w:type="dxa" w:w="2180"/>
+          </w:tcPr>
+          <w:p>
+            <w:pPr>
+              <w:pStyle w:val="Compact"/>
+              <w:keepNext/>
+              <w:spacing w:after="20" w:before="20" w:line="240" w:lineRule="auto"/>
+              <w:jc w:val="center"/>
+            </w:pPr>
+            <w:r>
+              <w:rPr>
+                <w:rFonts w:ascii="Times New Roman" w:hAnsi="Times New Roman"/>
+                <w:sz w:val="17"/>
+              </w:rPr>
+              <w:t xml:space="preserve">−1.39 (−2.4)</w:t>
+            </w:r>
+          </w:p>
+        </w:tc>
+      </w:tr>
+      <w:tr>
+        <w:trPr>
+          <w:cantSplit/>
+        </w:trPr>
+        <w:tc>
+          <w:tcPr>
+            <w:tcW w:type="dxa" w:w="2093"/>
+          </w:tcPr>
+          <w:p>
+            <w:pPr>
+              <w:pStyle w:val="Compact"/>
+              <w:keepNext/>
+              <w:spacing w:after="20" w:before="20" w:line="240" w:lineRule="auto"/>
+              <w:jc w:val="left"/>
+            </w:pPr>
+            <w:r>
+              <w:rPr>
+                <w:rFonts w:ascii="Times New Roman" w:hAnsi="Times New Roman"/>
+                <w:sz w:val="17"/>
+              </w:rPr>
+              <w:t xml:space="preserve">2026-Q1</w:t>
+            </w:r>
+          </w:p>
+        </w:tc>
+        <w:tc>
+          <w:tcPr>
+            <w:tcW w:type="dxa" w:w="1453"/>
+          </w:tcPr>
+          <w:p>
+            <w:pPr>
+              <w:pStyle w:val="Compact"/>
+              <w:keepNext/>
+              <w:spacing w:after="20" w:before="20" w:line="240" w:lineRule="auto"/>
+              <w:jc w:val="center"/>
+            </w:pPr>
+            <w:r>
+              <w:rPr>
+                <w:rFonts w:ascii="Times New Roman" w:hAnsi="Times New Roman"/>
+                <w:sz w:val="17"/>
+              </w:rPr>
+              <w:t xml:space="preserve">455</w:t>
+            </w:r>
+          </w:p>
+        </w:tc>
+        <w:tc>
+          <w:tcPr>
+            <w:tcW w:type="dxa" w:w="2034"/>
+          </w:tcPr>
+          <w:p>
+            <w:pPr>
+              <w:pStyle w:val="Compact"/>
+              <w:keepNext/>
+              <w:spacing w:after="20" w:before="20" w:line="240" w:lineRule="auto"/>
+              <w:jc w:val="center"/>
+            </w:pPr>
+            <w:r>
+              <w:rPr>
+                <w:rFonts w:ascii="Times New Roman" w:hAnsi="Times New Roman"/>
+                <w:sz w:val="17"/>
+              </w:rPr>
+              <w:t xml:space="preserve">2.35 (10.4)</w:t>
+            </w:r>
+          </w:p>
+        </w:tc>
+        <w:tc>
+          <w:tcPr>
+            <w:tcW w:type="dxa" w:w="1308"/>
+          </w:tcPr>
+          <w:p>
+            <w:pPr>
+              <w:pStyle w:val="Compact"/>
+              <w:keepNext/>
+              <w:spacing w:after="20" w:before="20" w:line="240" w:lineRule="auto"/>
+              <w:jc w:val="center"/>
+            </w:pPr>
+            <w:r>
+              <w:rPr>
+                <w:rFonts w:ascii="Times New Roman" w:hAnsi="Times New Roman"/>
+                <w:sz w:val="17"/>
+              </w:rPr>
+              <w:t xml:space="preserve">433</w:t>
+            </w:r>
+          </w:p>
+        </w:tc>
+        <w:tc>
+          <w:tcPr>
+            <w:tcW w:type="dxa" w:w="2180"/>
+          </w:tcPr>
+          <w:p>
+            <w:pPr>
+              <w:pStyle w:val="Compact"/>
+              <w:keepNext/>
+              <w:spacing w:after="20" w:before="20" w:line="240" w:lineRule="auto"/>
+              <w:jc w:val="center"/>
+            </w:pPr>
+            <w:r>
+              <w:rPr>
+                <w:rFonts w:ascii="Times New Roman" w:hAnsi="Times New Roman"/>
+                <w:sz w:val="17"/>
+              </w:rPr>
+              <w:t xml:space="preserve">−1.39 (−7.8)</w:t>
+            </w:r>
+          </w:p>
+        </w:tc>
+      </w:tr>
+      <w:tr>
+        <w:trPr>
+          <w:cantSplit/>
+        </w:trPr>
+        <w:tc>
+          <w:tcPr>
+            <w:tcW w:type="dxa" w:w="2093"/>
+          </w:tcPr>
+          <w:p>
+            <w:pPr>
+              <w:pStyle w:val="Compact"/>
+              <w:keepNext/>
+              <w:spacing w:after="20" w:before="20" w:line="240" w:lineRule="auto"/>
+              <w:jc w:val="left"/>
+            </w:pPr>
+            <w:r>
+              <w:rPr>
+                <w:rFonts w:ascii="Times New Roman" w:hAnsi="Times New Roman"/>
+                <w:sz w:val="17"/>
+              </w:rPr>
+              <w:t xml:space="preserve">2026-Q2</w:t>
+            </w:r>
+          </w:p>
+        </w:tc>
+        <w:tc>
+          <w:tcPr>
+            <w:tcW w:type="dxa" w:w="1453"/>
+          </w:tcPr>
+          <w:p>
+            <w:pPr>
+              <w:pStyle w:val="Compact"/>
+              <w:keepNext/>
+              <w:spacing w:after="20" w:before="20" w:line="240" w:lineRule="auto"/>
+              <w:jc w:val="center"/>
+            </w:pPr>
+            <w:r>
+              <w:rPr>
+                <w:rFonts w:ascii="Times New Roman" w:hAnsi="Times New Roman"/>
+                <w:sz w:val="17"/>
+              </w:rPr>
+              <w:t xml:space="preserve">298</w:t>
+            </w:r>
+          </w:p>
+        </w:tc>
+        <w:tc>
+          <w:tcPr>
+            <w:tcW w:type="dxa" w:w="2034"/>
+          </w:tcPr>
+          <w:p>
+            <w:pPr>
+              <w:pStyle w:val="Compact"/>
+              <w:keepNext/>
+              <w:spacing w:after="20" w:before="20" w:line="240" w:lineRule="auto"/>
+              <w:jc w:val="center"/>
+            </w:pPr>
+            <w:r>
+              <w:rPr>
+                <w:rFonts w:ascii="Times New Roman" w:hAnsi="Times New Roman"/>
+                <w:sz w:val="17"/>
+              </w:rPr>
+              <w:t xml:space="preserve">2.08 (7.0)</w:t>
+            </w:r>
+          </w:p>
+        </w:tc>
+        <w:tc>
+          <w:tcPr>
+            <w:tcW w:type="dxa" w:w="1308"/>
+          </w:tcPr>
+          <w:p>
+            <w:pPr>
+              <w:pStyle w:val="Compact"/>
+              <w:keepNext/>
+              <w:spacing w:after="20" w:before="20" w:line="240" w:lineRule="auto"/>
+              <w:jc w:val="center"/>
+            </w:pPr>
+            <w:r>
+              <w:rPr>
+                <w:rFonts w:ascii="Times New Roman" w:hAnsi="Times New Roman"/>
+                <w:sz w:val="17"/>
+              </w:rPr>
+              <w:t xml:space="preserve">100</w:t>
+            </w:r>
+          </w:p>
+        </w:tc>
+        <w:tc>
+          <w:tcPr>
+            <w:tcW w:type="dxa" w:w="2180"/>
+          </w:tcPr>
+          <w:p>
+            <w:pPr>
+              <w:pStyle w:val="Compact"/>
+              <w:keepNext/>
+              <w:spacing w:after="20" w:before="20" w:line="240" w:lineRule="auto"/>
+              <w:jc w:val="center"/>
+            </w:pPr>
+            <w:r>
+              <w:rPr>
+                <w:rFonts w:ascii="Times New Roman" w:hAnsi="Times New Roman"/>
+                <w:sz w:val="17"/>
+              </w:rPr>
+              <w:t xml:space="preserve">−1.46 (−3.3)</w:t>
+            </w:r>
+          </w:p>
+        </w:tc>
+      </w:tr>
+      <w:tr>
+        <w:trPr>
+          <w:cantSplit/>
+        </w:trPr>
+        <w:tc>
+          <w:tcPr>
+            <w:tcW w:type="dxa" w:w="2093"/>
+            <w:tcBorders>
+              <w:bottom w:val="single" w:sz="8" w:color="000000" w:space="0"/>
+            </w:tcBorders>
+          </w:tcPr>
+          <w:p>
+            <w:pPr>
+              <w:pStyle w:val="Compact"/>
+              <w:spacing w:after="20" w:before="20" w:line="240" w:lineRule="auto"/>
+              <w:jc w:val="left"/>
+            </w:pPr>
+            <w:r>
+              <w:rPr>
+                <w:rFonts w:ascii="Times New Roman" w:hAnsi="Times New Roman"/>
+                <w:sz w:val="17"/>
+              </w:rPr>
+              <w:t xml:space="preserve">2026-Q3</w:t>
+            </w:r>
+          </w:p>
+        </w:tc>
+        <w:tc>
+          <w:tcPr>
+            <w:tcW w:type="dxa" w:w="1453"/>
+            <w:tcBorders>
+              <w:bottom w:val="single" w:sz="8" w:color="000000" w:space="0"/>
+            </w:tcBorders>
+          </w:tcPr>
+          <w:p>
+            <w:pPr>
+              <w:pStyle w:val="Compact"/>
+              <w:spacing w:after="20" w:before="20" w:line="240" w:lineRule="auto"/>
+              <w:jc w:val="center"/>
+            </w:pPr>
+            <w:r>
+              <w:rPr>
+                <w:rFonts w:ascii="Times New Roman" w:hAnsi="Times New Roman"/>
+                <w:sz w:val="17"/>
+              </w:rPr>
+              <w:t xml:space="preserve">246</w:t>
+            </w:r>
+          </w:p>
+        </w:tc>
+        <w:tc>
+          <w:tcPr>
+            <w:tcW w:type="dxa" w:w="2034"/>
+            <w:tcBorders>
+              <w:bottom w:val="single" w:sz="8" w:color="000000" w:space="0"/>
+            </w:tcBorders>
+          </w:tcPr>
+          <w:p>
+            <w:pPr>
+              <w:pStyle w:val="Compact"/>
+              <w:spacing w:after="20" w:before="20" w:line="240" w:lineRule="auto"/>
+              <w:jc w:val="center"/>
+            </w:pPr>
+            <w:r>
+              <w:rPr>
+                <w:rFonts w:ascii="Times New Roman" w:hAnsi="Times New Roman"/>
+                <w:sz w:val="17"/>
+              </w:rPr>
+              <w:t xml:space="preserve">1.61 (5.4)</w:t>
+            </w:r>
+          </w:p>
+        </w:tc>
+        <w:tc>
+          <w:tcPr>
+            <w:tcW w:type="dxa" w:w="1308"/>
+            <w:tcBorders>
+              <w:bottom w:val="single" w:sz="8" w:color="000000" w:space="0"/>
+            </w:tcBorders>
+          </w:tcPr>
+          <w:p>
+            <w:pPr>
+              <w:pStyle w:val="Compact"/>
+              <w:spacing w:after="20" w:before="20" w:line="240" w:lineRule="auto"/>
+              <w:jc w:val="center"/>
+            </w:pPr>
+            <w:r>
+              <w:rPr>
+                <w:rFonts w:ascii="Times New Roman" w:hAnsi="Times New Roman"/>
+                <w:sz w:val="17"/>
+              </w:rPr>
+              <w:t xml:space="preserve">178</w:t>
+            </w:r>
+          </w:p>
+        </w:tc>
+        <w:tc>
+          <w:tcPr>
+            <w:tcW w:type="dxa" w:w="2180"/>
+            <w:tcBorders>
+              <w:bottom w:val="single" w:sz="8" w:color="000000" w:space="0"/>
+            </w:tcBorders>
+          </w:tcPr>
+          <w:p>
+            <w:pPr>
+              <w:pStyle w:val="Compact"/>
+              <w:spacing w:after="20" w:before="20" w:line="240" w:lineRule="auto"/>
+              <w:jc w:val="center"/>
+            </w:pPr>
+            <w:r>
+              <w:rPr>
+                <w:rFonts w:ascii="Times New Roman" w:hAnsi="Times New Roman"/>
+                <w:sz w:val="17"/>
+              </w:rPr>
+              <w:t xml:space="preserve">−1.55 (−2.8)</w:t>
+            </w:r>
+          </w:p>
+        </w:tc>
+      </w:tr>
+    </w:tbl>
+    <w:p>
+      <w:pPr>
+        <w:pStyle w:val="BodyText"/>
+        <w:spacing w:before="160"/>
       </w:pPr>
       <w:r>
         <w:t xml:space="preserve">Returns beyond ±8%, which a 7% band does not allow, occur on 96 stock-days and may reflect unadjusted corporate actions or listing-day bands. Dropping every event within five trading days of such a return moves the ceiling gap from 2.24% to 2.26% and the floor gap from −0.97% to −0.98%; the outlier days stay in the market benchmark.</w:t>
@@ -12862,7 +14041,83 @@
         <w:t xml:space="preserve"> </w:t>
       </w:r>
       <w:r>
-        <w:t xml:space="preserve">of 0.00007 and 0.00040). The bound limits false discoveries but leaves the upward bias in effect sizes untouched.</w:t>
+        <w:t xml:space="preserve">of 0.00007 and 0.00040). The bound limits false discoveries but leaves the upward bias in effect sizes untouched. The four event tests also survive every alternative family definition we consider: the four event tests as their own family, separate ceiling and floor families, the 26 tests under Holm or Bonferroni adjustment, a 28-test family that adds the days</w:t>
+      </w:r>
+      <w:r>
+        <w:t xml:space="preserve"> </w:t>
+      </w:r>
+      <w:r>
+        <w:rPr>
+          <w:iCs/>
+          <w:i/>
+        </w:rPr>
+        <w:t xml:space="preserve">d</w:t>
+      </w:r>
+      <w:r>
+        <w:t xml:space="preserve">+2 to</w:t>
+      </w:r>
+      <w:r>
+        <w:t xml:space="preserve"> </w:t>
+      </w:r>
+      <w:r>
+        <w:rPr>
+          <w:iCs/>
+          <w:i/>
+        </w:rPr>
+        <w:t xml:space="preserve">d</w:t>
+      </w:r>
+      <w:r>
+        <w:t xml:space="preserve">+5 outcomes, and week-clustered event</w:t>
+      </w:r>
+      <w:r>
+        <w:t xml:space="preserve"> </w:t>
+      </w:r>
+      <w:r>
+        <w:rPr>
+          <w:iCs/>
+          <w:i/>
+        </w:rPr>
+        <w:t xml:space="preserve">p</w:t>
+      </w:r>
+      <w:r>
+        <w:t xml:space="preserve">-values; the largest adjusted</w:t>
+      </w:r>
+      <w:r>
+        <w:t xml:space="preserve"> </w:t>
+      </w:r>
+      <w:r>
+        <w:rPr>
+          <w:iCs/>
+          <w:i/>
+        </w:rPr>
+        <w:t xml:space="preserve">p</w:t>
+      </w:r>
+      <w:r>
+        <w:t xml:space="preserve">-value across these definitions is 0.0026 (repository table C32).</w:t>
+      </w:r>
+    </w:p>
+    <w:p>
+      <w:pPr>
+        <w:pStyle w:val="BodyText"/>
+      </w:pPr>
+      <w:r>
+        <w:t xml:space="preserve">Event definitions that do not depend on the tick grid give the same picture (repository table C28). The ceiling gap is 2.07% for returns of at least 6.0% that close at the high, 2.33% at 6.8%, 2.35% for returns between 6.7% and 7.3%, 2.10% without the close-at-high condition, and 2.91% on days locked at one price (all</w:t>
+      </w:r>
+      <w:r>
+        <w:t xml:space="preserve"> </w:t>
+      </w:r>
+      <w:r>
+        <w:rPr>
+          <w:iCs/>
+          <w:i/>
+        </w:rPr>
+        <w:t xml:space="preserve">t</w:t>
+      </w:r>
+      <w:r>
+        <w:t xml:space="preserve"> </w:t>
+      </w:r>
+      <w:r>
+        <w:t xml:space="preserve">≥ 3.0); the floor gap ranges from −0.79% to −2.50%.</w:t>
       </w:r>
     </w:p>
     <w:p>
@@ -12918,7 +14173,7 @@
         <w:pStyle w:val="BodyText"/>
       </w:pPr>
       <w:r>
-        <w:t xml:space="preserve">None of the studies we reviewed reports the next-day abnormal return, overnight gap, or intraday return after a limit close in a form that matches ours, so Table 5 compares signs, timing, and mechanism.</w:t>
+        <w:t xml:space="preserve">None of the studies identified by our search (Appendix B) reports the next-day abnormal return, overnight gap, or intraday return after a limit close in a form that matches ours, so Table 6 compares signs, timing, and mechanism.</w:t>
       </w:r>
     </w:p>
     <w:p>
@@ -12931,7 +14186,7 @@
         <w:rPr>
           <w:sz w:val="19"/>
         </w:rPr>
-        <w:t xml:space="preserve">Table 5. Comparison with earlier studies. Findings are as reported in each source’s abstract or in the records we could access.</w:t>
+        <w:t xml:space="preserve">Table 6. Comparison with earlier studies. Findings are as reported in each source’s abstract or in the records we could access.</w:t>
       </w:r>
     </w:p>
     <w:tbl>
@@ -14114,7 +15369,7 @@
         <w:pStyle w:val="FirstParagraph"/>
       </w:pPr>
       <w:r>
-        <w:t xml:space="preserve">Of 26 tests on 347 HOSE stocks, the four price-limit tests survive FDR control and the confirmation-half check, and the 22 lower-powered characteristic tests do not. After a ceiling close, the next-day abnormal return of 1.7% is an overnight gap of 2.2% less an intraday reversal of 0.5%. The gap is 2.7 percentage points larger than for stocks that rose 5% to 6.5% and 3.1 points larger than for those among them that also closed at their high. After a floor close, the overnight gap is −1.0%. An outside buyer at the next open loses 0.7% against the market by the fifth close. Delayed price discovery at the limit fits the pattern, but news and attention remain possible explanations; longer samples, announcement time stamps, and order-book queues would let future work separate them.</w:t>
+        <w:t xml:space="preserve">Of 26 tests on 347 HOSE stocks, the four price-limit tests survive FDR control and the confirmation-half check, and the 22 lower-powered characteristic tests do not. After a ceiling close, the next-day abnormal return of 1.7% is an overnight gap of 2.2% less an intraday reversal of 0.5%. The gap is 2.7 percentage points larger than for stocks that rose 5% to 6.5% and 3.1 points larger than for those among them that also closed at their high. After a floor close, the overnight gap is −1.0%. An outside buyer at the next open loses 0.7% against the market by the fifth close. The pattern is consistent with delayed price discovery at the limit, but news, attention, and opening-auction overshooting remain possible explanations; longer samples, announcement time stamps, and order-book queues would let future work separate them.</w:t>
       </w:r>
     </w:p>
     <w:bookmarkEnd w:id="33"/>
@@ -15874,6 +17129,97 @@
       </w:r>
     </w:p>
     <w:bookmarkEnd w:id="68"/>
+    <w:bookmarkStart w:id="69" w:name="appendix-b.-literature-search"/>
+    <w:p>
+      <w:pPr>
+        <w:pStyle w:val="Heading1"/>
+        <w:keepNext/>
+      </w:pPr>
+      <w:r>
+        <w:t xml:space="preserve">Appendix B. Literature search</w:t>
+      </w:r>
+    </w:p>
+    <w:p>
+      <w:pPr>
+        <w:pStyle w:val="FirstParagraph"/>
+      </w:pPr>
+      <w:r>
+        <w:t xml:space="preserve">We searched on 4 and 5 October 2026 with a general-purpose web search engine; no subscription database (Scopus or Web of Science) was available. The queries combined</w:t>
+      </w:r>
+      <w:r>
+        <w:t xml:space="preserve"> </w:t>
+      </w:r>
+      <w:r>
+        <w:t xml:space="preserve">“</w:t>
+      </w:r>
+      <w:r>
+        <w:t xml:space="preserve">price limit</w:t>
+      </w:r>
+      <w:r>
+        <w:t xml:space="preserve">”</w:t>
+      </w:r>
+      <w:r>
+        <w:t xml:space="preserve"> </w:t>
+      </w:r>
+      <w:r>
+        <w:t xml:space="preserve">or</w:t>
+      </w:r>
+      <w:r>
+        <w:t xml:space="preserve"> </w:t>
+      </w:r>
+      <w:r>
+        <w:t xml:space="preserve">“</w:t>
+      </w:r>
+      <w:r>
+        <w:t xml:space="preserve">daily price limit</w:t>
+      </w:r>
+      <w:r>
+        <w:t xml:space="preserve">”</w:t>
+      </w:r>
+      <w:r>
+        <w:t xml:space="preserve"> </w:t>
+      </w:r>
+      <w:r>
+        <w:t xml:space="preserve">with each of delayed price discovery, volatility spillover, trading interference, magnet effect, limit hit, and band change, with and without the market names Tokyo, Taiwan, Korea, Istanbul, China, ChiNext, Shanghai, Shenzhen, Vietnam, HOSE, and HNX; and</w:t>
+      </w:r>
+      <w:r>
+        <w:t xml:space="preserve"> </w:t>
+      </w:r>
+      <w:r>
+        <w:t xml:space="preserve">“</w:t>
+      </w:r>
+      <w:r>
+        <w:t xml:space="preserve">overnight returns</w:t>
+      </w:r>
+      <w:r>
+        <w:t xml:space="preserve">”</w:t>
+      </w:r>
+      <w:r>
+        <w:t xml:space="preserve"> </w:t>
+      </w:r>
+      <w:r>
+        <w:t xml:space="preserve">or</w:t>
+      </w:r>
+      <w:r>
+        <w:t xml:space="preserve"> </w:t>
+      </w:r>
+      <w:r>
+        <w:t xml:space="preserve">“</w:t>
+      </w:r>
+      <w:r>
+        <w:t xml:space="preserve">intraday returns</w:t>
+      </w:r>
+      <w:r>
+        <w:t xml:space="preserve">”</w:t>
+      </w:r>
+      <w:r>
+        <w:t xml:space="preserve"> </w:t>
+      </w:r>
+      <w:r>
+        <w:t xml:space="preserve">with attention, retail trading, sentiment, market makers, and China. Further queries covered circuit breakers, multiple testing and false discoveries in asset pricing, Fama–MacBeth standard errors, weekly return predictability, and anomalies in the Vietnamese stock market. We screened about 100 records by title and abstract and kept peer-reviewed journal articles in English whose bibliographic record we could confirm; working papers, theses, code repositories, and press items were not used as evidence, except for press and brokerage descriptions of HOSE rules (Section 3). We read records and abstracts, not full texts. Statements in this paper that no study reports a given result refer to the studies this search identified.</w:t>
+      </w:r>
+    </w:p>
+    <w:bookmarkEnd w:id="69"/>
     <w:sectPr>
       <w:pgSz w:h="16838" w:w="11906"/>
       <w:pgMar w:bottom="1417" w:left="1417" w:right="1417" w:top="1417"/>

</xml_diff>

<commit_message>
Paper C: apply round-4 integrity fixes (Table 5 counts, floor placebo wording, t bound, Appendix B search disclosure)
Co-Authored-By: Claude Opus 5.5 <noreply@anthropic.com>
Claude-Session: https://claude.ai/code/session_011zPDaCYE4jmmpoRvPu4SUX
</commit_message>
<xml_diff>
--- a/paper2/final/Paper_C_Closing_at_the_limit.docx
+++ b/paper2/final/Paper_C_Closing_at_the_limit.docx
@@ -3060,7 +3060,7 @@
         <w:t xml:space="preserve"> </w:t>
       </w:r>
       <w:r>
-        <w:t xml:space="preserve">The event definition uses only returns and the close-at-high (close-at-low) condition, which proportional price adjustment by the vendor leaves unchanged; the exact-hit split is a diagnostic only (Section 7). Event counts differ across exhibits because each outcome needs different data. Table 1 requires returns on all five days after the event (3,187 ceiling and 2,105 floor events). Tables 2 to 4 require the open and close of day</w:t>
+        <w:t xml:space="preserve">The event definition uses only returns and the close-at-high (close-at-low) condition, which proportional price adjustment by the vendor leaves unchanged except on ex-dates; the exact-hit split is a diagnostic only (Section 7). Event counts differ across exhibits because each outcome needs different data. Table 1 requires returns on all five days after the event (3,187 ceiling and 2,105 floor events). Tables 2 to 4 require the open and close of day</w:t>
       </w:r>
       <w:r>
         <w:t xml:space="preserve"> </w:t>
@@ -5008,7 +5008,7 @@
         <w:t xml:space="preserve">t</w:t>
       </w:r>
       <w:r>
-        <w:t xml:space="preserve">| exceeds 1.96. Lookbacks overlap the discovery half, so the confirmation half is not a strict hold-out, and the weekly regressions (from day 120) and event window (from day 61) cover different spans. We place the four event tests and the 22 characteristics in one family because the analysis plan treated all 26 as candidate predictors of short-horizon returns examined on the same data, so the limit result pays for every signal we examined; Section 5 reports the event tests under alternative family definitions.</w:t>
+        <w:t xml:space="preserve">| exceeds 1.96. Lookbacks overlap the discovery half, so the confirmation half is not a strict hold-out, and the weekly regressions (from day 120) and event window (from day 61) cover different spans. We place the four event tests and the 22 characteristics in one family because the analysis plan treated all 26 as candidate predictors of short-horizon returns examined on the same data, so the limit result pays for every candidate signal in the plan; Section 5 reports the event tests under alternative family definitions.</w:t>
       </w:r>
     </w:p>
     <w:p>
@@ -12749,7 +12749,7 @@
         <w:t xml:space="preserve"> </w:t>
       </w:r>
       <w:r>
-        <w:t xml:space="preserve">= 1.6). The floor-gap difference is negative at 11 of 15 placebo dates, which points to a gradual change in the floor gap over the sample rather than a break at the platform change. A difference-in-differences regression that compares limit closes with 5–6.5% movers that also closed at the extreme gives the same answer (repository table C31): the excess ceiling gap was 2.91 percentage points before the change (</w:t>
+        <w:t xml:space="preserve">= 1.6). The floor-gap difference is positive at the 4 placebo dates before the platform change and negative at all 11 later ones, and the split at 5 May 2025 gives −0.95 points (</w:t>
       </w:r>
       <w:r>
         <w:rPr>
@@ -12762,7 +12762,7 @@
         <w:t xml:space="preserve"> </w:t>
       </w:r>
       <w:r>
-        <w:t xml:space="preserve">= 6.2) and changed by 0.38 points after it (</w:t>
+        <w:t xml:space="preserve">= −3.2), close to the differences at the placebo dates that follow it. Table 5 shows no trend in the floor gap; the pattern coincides with the weak floor gap in 2025-Q2 (−0.34%), the quarter with the most floor events (802), so the placebo dates cannot separate a break at the platform change from a shift specific to that quarter. A difference-in-differences regression that compares limit closes with 5–6.5% movers that also closed at the extreme points the same way for the ceiling (repository table C31): the excess ceiling gap was 2.91 percentage points before the change (</w:t>
       </w:r>
       <w:r>
         <w:rPr>
@@ -12775,7 +12775,7 @@
         <w:t xml:space="preserve"> </w:t>
       </w:r>
       <w:r>
-        <w:t xml:space="preserve">= 0.8), and the excess floor gap was −1.62 points before (</w:t>
+        <w:t xml:space="preserve">= 6.2) and changed by 0.38 points after it (</w:t>
       </w:r>
       <w:r>
         <w:rPr>
@@ -12788,7 +12788,7 @@
         <w:t xml:space="preserve"> </w:t>
       </w:r>
       <w:r>
-        <w:t xml:space="preserve">= −6.6) and changed by −0.49 points (</w:t>
+        <w:t xml:space="preserve">= 0.8), and the excess floor gap was −1.62 points before (</w:t>
       </w:r>
       <w:r>
         <w:rPr>
@@ -12801,7 +12801,20 @@
         <w:t xml:space="preserve"> </w:t>
       </w:r>
       <w:r>
-        <w:t xml:space="preserve">= −1.5). The break at the limit is therefore present before the change and does not depend on the post-change period, although the significance of the raw close-to-close return does.</w:t>
+        <w:t xml:space="preserve">= −6.6) and changed by −0.49 points (</w:t>
+      </w:r>
+      <w:r>
+        <w:rPr>
+          <w:iCs/>
+          <w:i/>
+        </w:rPr>
+        <w:t xml:space="preserve">t</w:t>
+      </w:r>
+      <w:r>
+        <w:t xml:space="preserve"> </w:t>
+      </w:r>
+      <w:r>
+        <w:t xml:space="preserve">= −1.5). The break at the limit is therefore present before the change and does not depend on the post-change period, although the significance of the raw ceiling close-to-close return and of the raw floor gap does (Table 4). Like the split in Table 4, these comparisons describe timing and do not identify an effect of the auction rules.</w:t>
       </w:r>
     </w:p>
     <w:p>
@@ -12834,7 +12847,21 @@
         <w:rPr>
           <w:sz w:val="19"/>
         </w:rPr>
-        <w:t xml:space="preserve">-statistics in parentheses. The KRX platform change falls in 2025-Q2.</w:t>
+        <w:t xml:space="preserve">-statistics in parentheses. Counts are events with a day-</w:t>
+      </w:r>
+      <w:r>
+        <w:rPr>
+          <w:iCs/>
+          <w:i/>
+          <w:sz w:val="19"/>
+        </w:rPr>
+        <w:t xml:space="preserve">d</w:t>
+      </w:r>
+      <w:r>
+        <w:rPr>
+          <w:sz w:val="19"/>
+        </w:rPr>
+        <w:t xml:space="preserve">+1 open. The first and last quarters are partial. The KRX platform change falls in 2025-Q2.</w:t>
       </w:r>
     </w:p>
     <w:tbl>
@@ -13654,7 +13681,7 @@
                 <w:rFonts w:ascii="Times New Roman" w:hAnsi="Times New Roman"/>
                 <w:sz w:val="17"/>
               </w:rPr>
-              <w:t xml:space="preserve">298</w:t>
+              <w:t xml:space="preserve">297</w:t>
             </w:r>
           </w:p>
         </w:tc>
@@ -13694,7 +13721,7 @@
                 <w:rFonts w:ascii="Times New Roman" w:hAnsi="Times New Roman"/>
                 <w:sz w:val="17"/>
               </w:rPr>
-              <w:t xml:space="preserve">100</w:t>
+              <w:t xml:space="preserve">99</w:t>
             </w:r>
           </w:p>
         </w:tc>
@@ -13763,7 +13790,7 @@
                 <w:rFonts w:ascii="Times New Roman" w:hAnsi="Times New Roman"/>
                 <w:sz w:val="17"/>
               </w:rPr>
-              <w:t xml:space="preserve">246</w:t>
+              <w:t xml:space="preserve">239</w:t>
             </w:r>
           </w:p>
         </w:tc>
@@ -13807,7 +13834,7 @@
                 <w:rFonts w:ascii="Times New Roman" w:hAnsi="Times New Roman"/>
                 <w:sz w:val="17"/>
               </w:rPr>
-              <w:t xml:space="preserve">178</w:t>
+              <w:t xml:space="preserve">175</w:t>
             </w:r>
           </w:p>
         </w:tc>
@@ -14117,7 +14144,7 @@
         <w:t xml:space="preserve"> </w:t>
       </w:r>
       <w:r>
-        <w:t xml:space="preserve">≥ 3.0); the floor gap ranges from −0.79% to −2.50%.</w:t>
+        <w:t xml:space="preserve">above 2.9); the floor gap ranges from −0.79% to −2.50%.</w:t>
       </w:r>
     </w:p>
     <w:p>
@@ -15398,7 +15425,7 @@
         <w:t xml:space="preserve"> </w:t>
       </w:r>
       <w:r>
-        <w:t xml:space="preserve">The authors used Claude (Anthropic) to write analysis code, draft text, and check numbers against output files. The authors are responsible for all content. We checked the references and the institutional facts in Section 3 by web search and did not consult primary documents.</w:t>
+        <w:t xml:space="preserve">The authors used Claude (Anthropic) to run the literature searches (Appendix B), write analysis code, draft text, and check numbers against output files. The authors are responsible for all content. We checked the references and the institutional facts in Section 3 by web search and did not consult primary documents.</w:t>
       </w:r>
     </w:p>
     <w:p>
@@ -17144,79 +17171,7 @@
         <w:pStyle w:val="FirstParagraph"/>
       </w:pPr>
       <w:r>
-        <w:t xml:space="preserve">We searched on 4 and 5 October 2026 with a general-purpose web search engine; no subscription database (Scopus or Web of Science) was available. The queries combined</w:t>
-      </w:r>
-      <w:r>
-        <w:t xml:space="preserve"> </w:t>
-      </w:r>
-      <w:r>
-        <w:t xml:space="preserve">“</w:t>
-      </w:r>
-      <w:r>
-        <w:t xml:space="preserve">price limit</w:t>
-      </w:r>
-      <w:r>
-        <w:t xml:space="preserve">”</w:t>
-      </w:r>
-      <w:r>
-        <w:t xml:space="preserve"> </w:t>
-      </w:r>
-      <w:r>
-        <w:t xml:space="preserve">or</w:t>
-      </w:r>
-      <w:r>
-        <w:t xml:space="preserve"> </w:t>
-      </w:r>
-      <w:r>
-        <w:t xml:space="preserve">“</w:t>
-      </w:r>
-      <w:r>
-        <w:t xml:space="preserve">daily price limit</w:t>
-      </w:r>
-      <w:r>
-        <w:t xml:space="preserve">”</w:t>
-      </w:r>
-      <w:r>
-        <w:t xml:space="preserve"> </w:t>
-      </w:r>
-      <w:r>
-        <w:t xml:space="preserve">with each of delayed price discovery, volatility spillover, trading interference, magnet effect, limit hit, and band change, with and without the market names Tokyo, Taiwan, Korea, Istanbul, China, ChiNext, Shanghai, Shenzhen, Vietnam, HOSE, and HNX; and</w:t>
-      </w:r>
-      <w:r>
-        <w:t xml:space="preserve"> </w:t>
-      </w:r>
-      <w:r>
-        <w:t xml:space="preserve">“</w:t>
-      </w:r>
-      <w:r>
-        <w:t xml:space="preserve">overnight returns</w:t>
-      </w:r>
-      <w:r>
-        <w:t xml:space="preserve">”</w:t>
-      </w:r>
-      <w:r>
-        <w:t xml:space="preserve"> </w:t>
-      </w:r>
-      <w:r>
-        <w:t xml:space="preserve">or</w:t>
-      </w:r>
-      <w:r>
-        <w:t xml:space="preserve"> </w:t>
-      </w:r>
-      <w:r>
-        <w:t xml:space="preserve">“</w:t>
-      </w:r>
-      <w:r>
-        <w:t xml:space="preserve">intraday returns</w:t>
-      </w:r>
-      <w:r>
-        <w:t xml:space="preserve">”</w:t>
-      </w:r>
-      <w:r>
-        <w:t xml:space="preserve"> </w:t>
-      </w:r>
-      <w:r>
-        <w:t xml:space="preserve">with attention, retail trading, sentiment, market makers, and China. Further queries covered circuit breakers, multiple testing and false discoveries in asset pricing, Fama–MacBeth standard errors, weekly return predictability, and anomalies in the Vietnamese stock market. We screened about 100 records by title and abstract and kept peer-reviewed journal articles in English whose bibliographic record we could confirm; working papers, theses, code repositories, and press items were not used as evidence, except for press and brokerage descriptions of HOSE rules (Section 3). We read records and abstracts, not full texts. Statements in this paper that no study reports a given result refer to the studies this search identified.</w:t>
+        <w:t xml:space="preserve">We searched on 4 and 5 October 2026 with the web search tool of the AI assistant named in the Declarations; no subscription database (Scopus or Web of Science) was available, and publisher pages could not be opened. The search topics were price-limit performance (delayed price discovery, volatility spillover, trading interference, and magnet effect), price-limit band changes, price limits in Vietnam and on HOSE and HNX, overnight versus intraday returns, lottery-type (MAX) and low-volatility effects, circuit breakers, multiple testing and false discoveries in asset pricing, Fama–MacBeth and clustered standard errors, regression discontinuity, weekly return predictability, and anomalies in the Vietnamese stock market; exact query strings were not logged. We screened about 100 records by title and abstract and kept peer-reviewed journal articles in English whose bibliographic record we could confirm; working papers, theses, code repositories, and press items were not used as evidence, except for press and brokerage descriptions of HOSE rules (Section 3). Vietnamese-language journals were not searched, and the coverage of Chinese A-share studies is incomplete. We read the bibliographic records and the abstract text returned by the search tool, not full texts. Statements in this paper that no study reports a given result refer to the peer-reviewed studies this search identified.</w:t>
       </w:r>
     </w:p>
     <w:bookmarkEnd w:id="69"/>

</xml_diff>

<commit_message>
Paper C: apply author grammar edits (wording only; numbers and citations unchanged)
Co-Authored-By: Claude Opus 5.5 <noreply@anthropic.com>
Claude-Session: https://claude.ai/code/session_011zPDaCYE4jmmpoRvPu4SUX
</commit_message>
<xml_diff>
--- a/paper2/final/Paper_C_Closing_at_the_limit.docx
+++ b/paper2/final/Paper_C_Closing_at_the_limit.docx
@@ -153,7 +153,7 @@
         <w:t xml:space="preserve"> </w:t>
       </w:r>
       <w:r>
-        <w:t xml:space="preserve">Daily price limits aim to cool markets but can delay price discovery. Few studies trace prices after limit closes in emerging markets, and, among the studies identified by our search (Appendix B), none tests the limit against other candidate signals. For 347 stocks on the Ho Chi Minh Stock Exchange from August 2024 to September 2026, we run 26 tests under false-discovery-rate control: four price-limit event tests and 22 price- and volume-based characteristics. All four limit tests survive; none of the 22 lower-powered characteristic tests does. After a ceiling close, the next-day abnormal return of 1.7% is an overnight gap of 2.2% less an intraday reversal of 0.5%, and the gap exceeds that after rises of 5% to 6.5% by 2.7 percentage points. A buyer at the next open loses 0.7% against the market by the fifth close. The pattern is consistent with delayed price discovery, but also with news, attention, and opening-auction overshooting; without news or order-book data we cannot separate them.</w:t>
+        <w:t xml:space="preserve">Daily price limits aim to cool markets but can delay price discovery. Few studies trace prices after limit closes in emerging markets, and among the studies identified by our search (Appendix B), none tests the limit against other candidate signals. For 347 stocks on the Ho Chi Minh Stock Exchange from August 2024 to September 2026, we run 26 tests under false discovery rate control: four price limit event tests and 22 price- and volume-based characteristics. All four limit tests survived; none of the 22 lower-powered characteristic tests survived. After a ceiling close, the next-day abnormal return of 1.7% is an overnight gap of 2.2% less an intraday reversal of 0.5%, and the gap exceeds that after rises of 5% to 6.5% by 2.7 percentage points. A buyer at the next opening loses 0.7% against the market by the fifth closing. The pattern is consistent with delayed price discovery, but also with news, attention, and opening-auction overshooting; without news or order-book data, we cannot separate them.</w:t>
       </w:r>
     </w:p>
     <w:p>
@@ -207,7 +207,7 @@
         <w:pStyle w:val="FirstParagraph"/>
       </w:pPr>
       <w:r>
-        <w:t xml:space="preserve">A daily price limit stops a stock from moving beyond a fixed band within one trading day. Exchanges in Tokyo, Taipei, Seoul, Shenzhen, and Ho Chi Minh City have used limits to cool markets after large shocks, and economists ask whether a limit protects prices or postpones their adjustment. The question is sharpest where limit closes are common and call auctions set the opening and closing prices. The Ho Chi Minh Stock Exchange (HOSE) has both features: one 7% band applies to all stocks, and about 2.0% of stock-days in our event window close at the upper limit (a ceiling close; Section 4) and about 1.4% at the lower limit (a floor close).</w:t>
+        <w:t xml:space="preserve">A daily price limit prevents a stock from moving beyond a fixed band within one trading day. Exchanges in Tokyo, Taipei, Seoul, Shenzhen, and Ho Chi Minh City have used limits to cool markets after large shocks, and economists ask whether a limit protects prices or postpones their adjustments. The question is sharpest where limit closes are common and call auctions set opening and closing prices. The Ho Chi Minh Stock Exchange (HOSE) has both features: one 7% band applies to all stocks, and about 2.0% of stock-days in our event window close at the upper limit (a ceiling close; Section 4) and about 1.4% at the lower limit (a floor close).</w:t>
       </w:r>
     </w:p>
     <w:p>
@@ -215,7 +215,7 @@
         <w:pStyle w:val="BodyText"/>
       </w:pPr>
       <w:r>
-        <w:t xml:space="preserve">Studies of band changes document effects on volatility, liquidity, and crash risk (Jia et al., 2024; Lien et al., 2019; Qi, 2023), and account-level data show that large investors buy on the limit day and sell on the next (Chen et al., 2019). Among the studies identified by the search described in Appendix B, only Huang et al. (2001) describe the overnight-then-intraday pattern after limit hits, and the records we could access give no magnitudes. None measures the overnight gap and the intraday return after a limit close against a benchmark, places the limit result in a family of tests that controls for the other price-based signals a researcher could have examined, or examines the 2025 move of HOSE to a new trading platform.</w:t>
+        <w:t xml:space="preserve">Studies on band changes document the effects on volatility, liquidity, and crash risk (Jia et al., 2024; Lien et al., 2019; Qi, 2023), and account-level data show that large investors buy on the limit day and sell on the next (Chen et al., 2019). Among the studies identified by the search described in Appendix B, only Huang et al. (2001) described the overnight-then-intraday pattern after limit hits, and the records we could access have no magnitudes. None measures the overnight gap and intraday return after a limit close against a benchmark, places the limit result in a family of tests that controls for the other price-based signals a researcher could have examined, or examines the 2025 move of the HOSE to a new trading platform.</w:t>
       </w:r>
     </w:p>
     <w:p>
@@ -223,7 +223,7 @@
         <w:pStyle w:val="BodyText"/>
       </w:pPr>
       <w:r>
-        <w:t xml:space="preserve">We estimate the abnormal return after ceiling and floor closes on HOSE, split it into the overnight gap and the intraday return, and test whether an outside buyer can capture it. We place the four limit tests in a family of 26 tests with 22 price- and volume-based characteristics and control the false discovery rate (FDR; Benjamini &amp; Hochberg, 1995; Harvey et al., 2016).</w:t>
+        <w:t xml:space="preserve">We estimate the abnormal return after the ceiling and floor close on the HOSE, split it into overnight gap and intraday return, and test whether an outside buyer can capture it. We place the four limit tests in a family of 26 tests with 22 price- and volume-based characteristics and control the false discovery rate (FDR; Benjamini &amp; Hochberg, 1995; Harvey et al., 2016).</w:t>
       </w:r>
     </w:p>
     <w:p>
@@ -231,7 +231,7 @@
         <w:pStyle w:val="BodyText"/>
       </w:pPr>
       <w:r>
-        <w:t xml:space="preserve">We make three contributions. First, we measure the overnight gap and the intraday return after limit closes, a pattern that Huang et al. (2001) describe qualitatively for Taiwan, and show that the ceiling effect is a gap of 2.2% of which the following session reverses 24%. Second, we show that the ceiling gap is 2.7 percentage points larger than after rises of 5% to 6.5% that stop short of the limit, and that the contrast survives when the comparison stocks also close at their daily high. Third, we show that all four limit tests survive a multiplicity-controlled family in which no characteristic survives, and that a buyer at the next open loses 0.7% against the market by the fifth close. We also split the events at the 2025 platform change.</w:t>
+        <w:t xml:space="preserve">We make three contributions. First, we measure the overnight gap and the intraday return after limit closes, a pattern that Huang et al. (2001) describe qualitatively for Taiwan, and show that the ceiling effect is a gap of 2.2%, of which the following session reverses 24%. Second, we show that the ceiling gap is 2.7 percentage points larger than after rises of 5% to 6.5% that stop short of the limit, and that the contrast survives when the comparison stocks also close at their daily high. Third, we show that all four limit tests survive a multiplicity-controlled family in which no characteristic survives and that a buyer at the next open loses 0.7% against the market by the fifth close. We also split the events at the 2025 platform change.</w:t>
       </w:r>
     </w:p>
     <w:p>
@@ -239,7 +239,7 @@
         <w:pStyle w:val="BodyText"/>
       </w:pPr>
       <w:r>
-        <w:t xml:space="preserve">Section 2 reviews the literature, Sections 3 and 4 describe the data and design, Section 5 reports results, Section 6 discusses them, and Sections 7 and 8 give limitations and conclusions.</w:t>
+        <w:t xml:space="preserve">Section 2 reviews the literature, Sections 3 and 4 describe the data and design, Section 5 reports the results, Section 6 discusses them, and Sections 7 and 8 provide limitations and conclusions.</w:t>
       </w:r>
     </w:p>
     <w:bookmarkEnd w:id="20"/>
@@ -268,7 +268,7 @@
         <w:t xml:space="preserve"> </w:t>
       </w:r>
       <w:r>
-        <w:t xml:space="preserve">Models predict protection or distortion, depending on the source of the shock. Brennan (1986) rationalizes limits in futures markets, Kodres and O’Brien (1994) show that well-chosen limits can be Pareto superior when fundamental news drives prices because they partly insure traders against implementation risk, and Greenwald and Stein (1991) link crashes to imperfect transactional mechanisms. Subrahmanyam (1994) shows that halts can advance trades in time and raise price variability, and in the model of Chen et al. (2024) volatility rises as the price nears a circuit breaker, a magnet effect. A limit that only delays adjustment leaves a predictable next-day continuation, which the return after a limit close can reveal.</w:t>
+        <w:t xml:space="preserve">Models predict protection or distortion, depending on the source of the shock. Brennan (1986) rationalizes limits in futures markets, Kodres and O’Brien (1994) show that well-chosen limits can be Pareto superior when fundamental news drives prices because they partly insure traders against implementation risk, and Greenwald and Stein (1991) link crashes to imperfect transactional mechanisms. Subrahmanyam (1994) shows that halts can advance trades in time and raise price variability, and in the model of Chen et al. (2024), volatility rises as the price nears a circuit breaker, a magnet effect. A limit that only delays adjustment leaves a predictable next-day continuation, which the return after a limit close can reveal.</w:t>
       </w:r>
     </w:p>
     <w:p>
@@ -286,7 +286,7 @@
         <w:t xml:space="preserve"> </w:t>
       </w:r>
       <w:r>
-        <w:t xml:space="preserve">Kim and Rhee (1997) find support in Tokyo for three criticisms of limits: they spill volatility into later days, delay price discovery, and interfere with trading. Bildik and Gülay (2006) find the same in Istanbul, with stronger evidence from price locks than from limit moves alone. Chen (1993) finds that serial correlation falls as the Taiwanese limit widens, which implies delayed adjustment under the narrower limit, and Berkman and Lee (2002) examine volatility and trading activity around a revision of the Korean limit system. Huang et al. (2001) report for Taiwan that the overnight overreaction after limit hits reverses during the following day, the timing pattern we test. Cho et al. (2003) find a magnet effect: prices accelerate toward the upper limit in five-minute Taiwanese data. Kim and Limpaphayom (2000) show that small, volatile, high-volume stocks hit limits more often, and Deb et al. (2013) argue that rigid limits in Tokyo can disrupt price discovery and liquidity provision.</w:t>
+        <w:t xml:space="preserve">Kim and Rhee (1997) find support in Tokyo for three criticisms of limits: they spill volatility into later days, delay price discovery, and interfere with trading. Bildik and Gülay (2006) find the same in Istanbul, with stronger evidence from price locks than from limit moves alone. Chen (1993) finds that serial correlation falls as the Taiwanese limit widens, which implies delayed adjustment under the narrower limit. Berkman and Lee (2002) examine volatility and trading activity around a revision of the Korean limit system. Huang et al. (2001) report for Taiwan that the overnight overreaction after limit hits reverses during the following day, the timing pattern we test. Cho et al. (2003) find a magnet effect: prices accelerate toward the upper limit in five-minute Taiwanese datasets. Kim and Limpaphayom (2000) show that small, volatile, high-volume stocks hit limits more often, whereas Deb et al. (2013) argue that rigid limits in Tokyo can disrupt price discovery and liquidity provision.</w:t>
       </w:r>
     </w:p>
     <w:p>

</xml_diff>